<commit_message>
docs: refaz documentacao integrada sobre a base revisada
</commit_message>
<xml_diff>
--- a/Documentação/Documentacao_Sabor_e_Clic_3_Bimestre_V3_Base_Revisada.docx
+++ b/Documentação/Documentacao_Sabor_e_Clic_3_Bimestre_V3_Base_Revisada.docx
@@ -305,10 +305,7 @@
     </w:p>
     <w:p>
       <w:r>
-        <w:t>Ao longo do terceiro bimestre, reunimos contribuições de Artes Visuais e Design, JavaScript, Python, Banco de Dados e Segurança. Nosso protótipo estático demonstra as principais telas e interações. A m</w:t>
-      </w:r>
-      <w:r>
-        <w:t>odelagem de dados descreve as entidades e os relacionamentos necessários para sustentar a aplicação. Também iniciamos a estrutura de back-end e definimos a arquitetura teórica das rotas que completarão a integração.</w:t>
+        <w:t>Ao longo do terceiro bimestre, reunimos contribuições de Artes Visuais e Design, JavaScript, Python, Banco de Dados e Segurança. O front-end evoluiu para uma aplicação multipágina navegável com telas específicas para Cliente, Cozinheiro e Administrador. Também modularizamos a lógica JavaScript e implementamos um back-end Flask simulado, com estrutura inicial da aplicação e endpoints fundamentais. A persistência definitiva e a comunicação real por Fetch/JSON permanecem para o quarto bimestre.</w:t>
       </w:r>
     </w:p>
     <w:p>
@@ -410,10 +407,7 @@
     </w:p>
     <w:p>
       <w:r>
-        <w:t xml:space="preserve">Nesta etapa concluímos o protótipo estático e a documentação conceitual de dados. Iniciamos o back-end, mas a aplicação Flask integrada ao banco ainda faz </w:t>
-      </w:r>
-      <w:r>
-        <w:t>parte da evolução do projeto. Por esse motivo, quando descrevemos uma rota completa ou uma regra transacional, apresentamos a arquitetura que definimos para a implementação, distinguindo-a das interações que já funcionam localmente no protótipo.</w:t>
+        <w:t>Nesta etapa concluímos o protótipo navegável, a documentação conceitual de dados, as lógicas JavaScript exigidas no terceiro bimestre e uma estrutura inicial de back-end Flask com endpoints simulados. A aplicação ainda não persiste os dados do fluxo completo nem realiza integração real entre navegador e servidor; essa evolução será feita no quarto bimestre.</w:t>
       </w:r>
     </w:p>
     <w:p>
@@ -601,15 +595,8 @@
             <w:vAlign w:val="center"/>
           </w:tcPr>
           <w:p>
-            <w:pPr>
-              <w:spacing w:after="0" w:line="240" w:lineRule="auto"/>
-              <w:ind w:firstLine="0"/>
-            </w:pPr>
-            <w:r>
-              <w:rPr>
-                <w:sz w:val="18"/>
-              </w:rPr>
-              <w:t>Estado local, navegação, DOM, carrinho, cálculos e feedback visual.</w:t>
+            <w:r>
+              <w:t>MPA navegável, módulos JS, arrays/objetos, loops modernos, DOM, validações, carrinho e cálculos em memória.</w:t>
             </w:r>
           </w:p>
         </w:tc>
@@ -620,15 +607,8 @@
             <w:vAlign w:val="center"/>
           </w:tcPr>
           <w:p>
-            <w:pPr>
-              <w:spacing w:after="0" w:line="240" w:lineRule="auto"/>
-              <w:ind w:firstLine="0"/>
-            </w:pPr>
-            <w:r>
-              <w:rPr>
-                <w:sz w:val="18"/>
-              </w:rPr>
-              <w:t>Módulos, classes ES6 e integração assíncrona.</w:t>
+            <w:r>
+              <w:t>Classes ES6+, módulos de API, Fetch/JSON, async/await e integração com Flask.</w:t>
             </w:r>
           </w:p>
         </w:tc>
@@ -661,15 +641,8 @@
             <w:vAlign w:val="center"/>
           </w:tcPr>
           <w:p>
-            <w:pPr>
-              <w:spacing w:after="0" w:line="240" w:lineRule="auto"/>
-              <w:ind w:firstLine="0"/>
-            </w:pPr>
-            <w:r>
-              <w:rPr>
-                <w:sz w:val="18"/>
-              </w:rPr>
-              <w:t>Arquivos iniciais e definição da API.</w:t>
+            <w:r>
+              <w:t>Estrutura Flask inicial e endpoints simulados para autenticação, Reservas, Cardápio, Pedidos e KDS.</w:t>
             </w:r>
           </w:p>
         </w:tc>
@@ -679,15 +652,8 @@
             <w:vAlign w:val="center"/>
           </w:tcPr>
           <w:p>
-            <w:pPr>
-              <w:spacing w:after="0" w:line="240" w:lineRule="auto"/>
-              <w:ind w:firstLine="0"/>
-            </w:pPr>
-            <w:r>
-              <w:rPr>
-                <w:sz w:val="18"/>
-              </w:rPr>
-              <w:t>MVC, controllers, services e rotas REST em JSON.</w:t>
+            <w:r>
+              <w:t>MVC completo, services/models reais, banco persistente, autenticação e rotas protegidas.</w:t>
             </w:r>
           </w:p>
         </w:tc>
@@ -2869,10 +2835,7 @@
     <w:p/>
     <w:p>
       <w:r>
-        <w:t>O README registra uma estrutura futura modular, com routes, controllers, models, services e middleware. Os arquivos atuais de back-end são iniciais e ainda não formam essa ap</w:t>
-      </w:r>
-      <w:r>
-        <w:t>licação completa. Documentamos a estrutura como direção arquitetural que adotamos, sem afirmar que todos os módulos já estão implementados.</w:t>
+        <w:t>O projeto adota separação por responsabilidades. No front-end, a lógica foi dividida em arquivos específicos para dados, navegação, componentes, cardápio, carrinho, validação, login, views e acessibilidade. No back-end simulado, run.py inicializa o Flask, config.py concentra configurações e os controllers exemplificam autenticação, reservas, cardápio, pedidos e KDS. A estrutura completa com routes, services, models e middleware permanece como evolução arquitetural.</w:t>
       </w:r>
     </w:p>
     <w:p>
@@ -2888,13 +2851,7 @@
     </w:p>
     <w:p>
       <w:r>
-        <w:t>O objeto state concentra perfil, página atual, carrinho e estado de Reserva. menus associa ca</w:t>
-      </w:r>
-      <w:r>
-        <w:t>da papel às telas permitidas; roleInfo guarda contas demonstrativas; views reúne funções que devolvem templates HTML. A função render substitui o conteúdo do elemento app e renderMenu reconstrói a navegação. Com isso, simulamos uma SPA simples sem bibliote</w:t>
-      </w:r>
-      <w:r>
-        <w:t>ca externa.</w:t>
+        <w:t>O JavaScript atual foi dividido por responsabilidade. data.js concentra arrays, objetos literais e estado compartilhado; site.js reúne navegação e helpers; components.js gera componentes visuais; catalog.js manipula dinamicamente o DOM do cardápio; cart.js mantém o carrinho e calcula totais; validation.js valida a reserva; login.js trata o login demonstrativo; views.js registra as telas; e a11y.js concentra comportamentos de acessibilidade. A navegação ocorre entre páginas HTML separadas, caracterizando uma MPA.</w:t>
       </w:r>
     </w:p>
     <w:p>
@@ -2904,81 +2861,23 @@
         <w:jc w:val="left"/>
       </w:pPr>
       <w:r>
-        <w:rPr>
-          <w:rFonts w:ascii="Courier New" w:hAnsi="Courier New"/>
-          <w:sz w:val="18"/>
-        </w:rPr>
-        <w:t>function go(page){</w:t>
-      </w:r>
-      <w:r>
-        <w:rPr>
-          <w:rFonts w:ascii="Courier New" w:hAnsi="Courier New"/>
-          <w:sz w:val="18"/>
-        </w:rPr>
+        <w:t>function renderCatalog(category = "Todos") {</w:t>
         <w:br/>
-        <w:t xml:space="preserve">  state.page=page;</w:t>
-      </w:r>
-      <w:r>
-        <w:rPr>
-          <w:rFonts w:ascii="Courier New" w:hAnsi="Courier New"/>
-          <w:sz w:val="18"/>
-        </w:rPr>
+        <w:t xml:space="preserve">  const grid = document.querySelector(".grid.cols-4");</w:t>
         <w:br/>
-        <w:t xml:space="preserve">  renderMenu();</w:t>
-      </w:r>
-      <w:r>
-        <w:rPr>
-          <w:rFonts w:ascii="Courier New" w:hAnsi="Courier New"/>
-          <w:sz w:val="18"/>
-        </w:rPr>
+        <w:t xml:space="preserve">  grid.innerHTML = "";</w:t>
         <w:br/>
-        <w:t xml:space="preserve">  render();</w:t>
-      </w:r>
-      <w:r>
-        <w:rPr>
-          <w:rFonts w:ascii="Courier New" w:hAnsi="Courier New"/>
-          <w:sz w:val="18"/>
-        </w:rPr>
+        <w:t xml:space="preserve">  products.forEach(product =&gt; {</w:t>
         <w:br/>
-        <w:t xml:space="preserve">  window.scrollTo(0,0);</w:t>
-      </w:r>
-      <w:r>
-        <w:rPr>
-          <w:rFonts w:ascii="Courier New" w:hAnsi="Courier New"/>
-          <w:sz w:val="18"/>
-        </w:rPr>
+        <w:t xml:space="preserve">    if (category !== "Todos" &amp;&amp; product.cat !== category) return;</w:t>
         <w:br/>
-        <w:t>}</w:t>
-      </w:r>
-      <w:r>
-        <w:rPr>
-          <w:rFonts w:ascii="Courier New" w:hAnsi="Courier New"/>
-          <w:sz w:val="18"/>
-        </w:rPr>
+        <w:t xml:space="preserve">    const wrapper = document.createElement("div");</w:t>
         <w:br/>
-        <w:t>function render(){</w:t>
-      </w:r>
-      <w:r>
-        <w:rPr>
-          <w:rFonts w:ascii="Courier New" w:hAnsi="Courier New"/>
-          <w:sz w:val="18"/>
-        </w:rPr>
+        <w:t xml:space="preserve">    wrapper.innerHTML = productCard(product).trim();</w:t>
         <w:br/>
-        <w:t xml:space="preserve">  pageTitle();</w:t>
-      </w:r>
-      <w:r>
-        <w:rPr>
-          <w:rFonts w:ascii="Courier New" w:hAnsi="Courier New"/>
-          <w:sz w:val="18"/>
-        </w:rPr>
+        <w:t xml:space="preserve">    grid.appendChild(wrapper.firstElementChild);</w:t>
         <w:br/>
-        <w:t xml:space="preserve">  el("app").innerHTML=views[state.page]();</w:t>
-      </w:r>
-      <w:r>
-        <w:rPr>
-          <w:rFonts w:ascii="Courier New" w:hAnsi="Courier New"/>
-          <w:sz w:val="18"/>
-        </w:rPr>
+        <w:t xml:space="preserve">  });</w:t>
         <w:br/>
         <w:t>}</w:t>
       </w:r>
@@ -2989,30 +2888,17 @@
         <w:jc w:val="center"/>
       </w:pPr>
       <w:r>
-        <w:rPr>
-          <w:i/>
-          <w:sz w:val="18"/>
-        </w:rPr>
-        <w:t>Trecho 3 - Navegação e renderização dinâmica do protótipo.</w:t>
+        <w:t>Trecho 3 - Renderização dinâmica do Cardápio utilizando forEach e manipulação do DOM.</w:t>
       </w:r>
     </w:p>
     <w:p>
       <w:r>
-        <w:t>Utilizamos con</w:t>
-      </w:r>
-      <w:r>
-        <w:t>st, arrow functions, template literals, map, filter, reduce, find e for...in. Também criamos funções auxiliares para cartões, indicadores e tickets. showToast fornece feedback temporário ao usuário. O login demonstra a seleção de perfil por e-mail, porém q</w:t>
-      </w:r>
-      <w:r>
-        <w:t>ualquer senha é aceita; portanto, ele representa navegação por papéis e não autenticação de produção.</w:t>
+        <w:t>Utilizamos arrays, objetos literais, const, arrow functions, template literals, find, filter, reduce, forEach, for...of e for...in. O Cardápio é atualizado dinamicamente pelo DOM; o carrinho mantém itens e calcula subtotais e total em memória; os formulários possuem validações simples; e o login demonstrativo seleciona o perfil e armazena a sessão localmente. Esses elementos cobrem os conteúdos de JavaScript previstos para o terceiro bimestre.</w:t>
       </w:r>
     </w:p>
     <w:p>
       <w:r>
-        <w:t>Na próxima etapa, pretendemos separar modelos, API e páginas. Classes como Prato, ItemPedido, Carrinho e Pedido poderão encapsular estado e validações. As</w:t>
-      </w:r>
-      <w:r>
-        <w:t xml:space="preserve"> chamadas fetch serão assíncronas e envolvidas em try...catch, com estados de carregamento, sucesso e erro. Dados externos não deverão ser inseridos por innerHTML sem escape, para reduzir risco de XSS.</w:t>
+        <w:t>No quarto bimestre, a modularização será ampliada com classes ES6+, encapsulamento e módulos voltados à comunicação com a API. As chamadas Fetch serão assíncronas, utilizarão JSON e serão tratadas com async/await e try/catch. O estado que hoje é simulado no navegador passará a refletir as respostas reais do Flask.</w:t>
       </w:r>
     </w:p>
     <w:p>
@@ -3028,13 +2914,7 @@
     </w:p>
     <w:p>
       <w:r>
-        <w:t>As rotas a s</w:t>
-      </w:r>
-      <w:r>
-        <w:t>eguir representam a arquitetura que definimos para completar o produto. Nosso back-end atual possui arquivos iniciais, mas a API ainda deverá ser organizada e integrada. Em MVC, a rota recebe HTTP; o controller coordena o caso de uso; o service aplica regr</w:t>
-      </w:r>
-      <w:r>
-        <w:t>as; o model acessa dados; e a rota devolve JSON com código adequado.</w:t>
+        <w:t>O back-end do terceiro bimestre é propositalmente simulado. Ele já possui run.py, config.py, app/__init__.py e controllers de autenticação, reserva e pedidos. Esses arquivos demonstram os endpoints fundamentais e a separação de responsabilidades, mas os models ainda são stubs e a API não está integrada ao banco ou ao front-end. O objetivo desta etapa é validar o contrato das operações antes da implementação definitiva.</w:t>
       </w:r>
     </w:p>
     <w:tbl>
@@ -3675,74 +3555,17 @@
         <w:jc w:val="left"/>
       </w:pPr>
       <w:r>
-        <w:rPr>
-          <w:rFonts w:ascii="Courier New" w:hAnsi="Courier New"/>
-          <w:sz w:val="18"/>
-        </w:rPr>
-        <w:t>@bp.post("/api/sessoes/&lt;int:id&gt;/pedidos")</w:t>
-      </w:r>
-      <w:r>
-        <w:rPr>
-          <w:rFonts w:ascii="Courier New" w:hAnsi="Courier New"/>
-          <w:sz w:val="18"/>
-        </w:rPr>
+        <w:t># .../api/reservas - método POST</w:t>
         <w:br/>
-        <w:t>@login_required</w:t>
-      </w:r>
-      <w:r>
-        <w:rPr>
-          <w:rFonts w:ascii="Courier New" w:hAnsi="Courier New"/>
-          <w:sz w:val="18"/>
-        </w:rPr>
+        <w:t>def post_reserva(dados):</w:t>
         <w:br/>
-        <w:t>def criar_pedido(id):</w:t>
-      </w:r>
-      <w:r>
-        <w:rPr>
-          <w:rFonts w:ascii="Courier New" w:hAnsi="Courier New"/>
-          <w:sz w:val="18"/>
-        </w:rPr>
+        <w:t xml:space="preserve">    cliente = dados["cliente"]</w:t>
         <w:br/>
-        <w:t xml:space="preserve">    payload = request.get_json() or {}</w:t>
-      </w:r>
-      <w:r>
-        <w:rPr>
-          <w:rFonts w:ascii="Courier New" w:hAnsi="Courier New"/>
-          <w:sz w:val="18"/>
-        </w:rPr>
+        <w:t xml:space="preserve">    bancada = dados["bancada"]</w:t>
         <w:br/>
-        <w:t xml:space="preserve">    pedido = pedido_service.criar(</w:t>
-      </w:r>
-      <w:r>
-        <w:rPr>
-          <w:rFonts w:ascii="Courier New" w:hAnsi="Courier New"/>
-          <w:sz w:val="18"/>
-        </w:rPr>
+        <w:t xml:space="preserve">    Reserva_model.post_reserva(cliente, bancada)</w:t>
         <w:br/>
-        <w:t xml:space="preserve">        sessao_id=id, usuario=g.user, itens=payload.get("itens", [])</w:t>
-      </w:r>
-      <w:r>
-        <w:rPr>
-          <w:rFonts w:ascii="Courier New" w:hAnsi="Courier New"/>
-          <w:sz w:val="18"/>
-        </w:rPr>
-        <w:br/>
-        <w:t xml:space="preserve">    )</w:t>
-      </w:r>
-      <w:r>
-        <w:rPr>
-          <w:rFonts w:ascii="Courier New" w:hAnsi="Courier New"/>
-          <w:sz w:val="18"/>
-        </w:rPr>
-        <w:br/>
-        <w:t xml:space="preserve">    return jsonify(pedido.t</w:t>
-      </w:r>
-      <w:r>
-        <w:rPr>
-          <w:rFonts w:ascii="Courier New" w:hAnsi="Courier New"/>
-          <w:sz w:val="18"/>
-        </w:rPr>
-        <w:t>o_dict()), 201</w:t>
+        <w:t xml:space="preserve">    return True, 200</w:t>
       </w:r>
     </w:p>
     <w:p>
@@ -3751,19 +3574,12 @@
         <w:jc w:val="center"/>
       </w:pPr>
       <w:r>
-        <w:rPr>
-          <w:i/>
-          <w:sz w:val="18"/>
-        </w:rPr>
-        <w:t>Trecho 4 - Exemplo teórico da responsabilidade reduzida de uma rota Flask.</w:t>
+        <w:t>Trecho 4 - Exemplo atual do back-end simulado para criação de Reserva.</w:t>
       </w:r>
     </w:p>
     <w:p>
       <w:r>
-        <w:t>Nesse exemplo, a rota não calcula preços nem consulta estoque diretamente. Ela autentica por decorador, lê JSON, entrega dados ao serviço e serializa o resultado. O s</w:t>
-      </w:r>
-      <w:r>
-        <w:t>ervice confirma a propriedade da Sessão, verifica se está ativa, valida quantidades, busca Pratos, calcula valores e grava a transação. Essa divisão evita controllers extensos e facilita testes.</w:t>
+        <w:t>O exemplo atual demonstra o contrato básico de uma operação: receber dados, encaminhá-los para a camada responsável e devolver resultado e código HTTP. Nesta primeira entrega, os models são simulados. Na implementação definitiva, controllers e services aplicarão autenticação, validação, regras de negócio e transações antes de acessar o banco.</w:t>
       </w:r>
     </w:p>
     <w:p>
@@ -5505,10 +5321,7 @@
     </w:p>
     <w:p>
       <w:r>
-        <w:t xml:space="preserve">Concluímos o protótipo estático navegável, a identidade visual, as telas dos três atores, o Cardápio, o carrinho em </w:t>
-      </w:r>
-      <w:r>
-        <w:t>memória, a visualização de Pedidos, o layout do KDS, o DER, o MER, o arquivo EER e o dicionário de dados. Também definimos o fluxo Reserva → Sessão → Cardápio/Pedidos → KDS e a responsabilidade esperada de cada camada.</w:t>
+        <w:t>Concluímos o protótipo navegável, a identidade visual, as telas dos três atores, o Cardápio, o carrinho em memória, a visualização de Pedidos, o layout do KDS, o DER, o MER, o arquivo EER e o dicionário de dados. Também modularizamos o JavaScript para evidenciar arrays, objetos, for...of, for...in, forEach, DOM, validações e cálculos em memória, e estruturamos um back-end Flask simulado com endpoints fundamentais.</w:t>
       </w:r>
     </w:p>
     <w:p>
@@ -5521,10 +5334,7 @@
     </w:p>
     <w:p>
       <w:r>
-        <w:t>Iniciamos a estr</w:t>
-      </w:r>
-      <w:r>
-        <w:t>utura Python, a criação do banco e um exemplo de comunicação Fetch/JSON. Também iniciamos a definição de segurança e separação de perfis. Essas partes ainda não formam uma API integrada, mas registram a direção que seguiremos.</w:t>
+        <w:t>Implementamos uma primeira estrutura Flask com configuração da aplicação e controllers simulados para cadastro/login, Bancadas/Reservas e Cardápio/Pedidos/KDS. Esses endpoints ainda não formam uma API persistente, mas já estabelecem os contratos que serão ligados ao front-end. A autenticação real, o banco físico e Fetch/JSON continuam como próxima etapa.</w:t>
       </w:r>
     </w:p>
     <w:p>
@@ -5537,13 +5347,7 @@
     </w:p>
     <w:p>
       <w:r>
-        <w:t>Nas próx</w:t>
-      </w:r>
-      <w:r>
-        <w:t>imas etapas, implementaremos a factory Flask, os módulos MVC, autenticação e RBAC, as rotas de Bancada e Reserva, a criação de Sessão, Cardápio e Pedido, o KDS persistente e o banco físico. Depois integraremos fetch ao front-end, trataremos loading/erros e</w:t>
-      </w:r>
-      <w:r>
-        <w:t xml:space="preserve"> criaremos testes para conflitos, permissões, totais e transições de estado.</w:t>
+        <w:t>Nas próximas etapas, completaremos a factory Flask e a separação MVC, substituiremos os models simulados por persistência real, implementaremos autenticação e RBAC, criaremos a Sessão persistente, integraremos Cardápio/Pedido/KDS ao banco e conectaremos o front-end à API por Fetch/JSON. Depois serão acrescentados tratamento de loading/erros e testes para conflitos, permissões, totais e transições de estado.</w:t>
       </w:r>
     </w:p>
     <w:p>
@@ -6302,18 +6106,14 @@
     <w:p>
       <w:pPr>
         <w:pStyle w:val="Ttulo1"/>
-        <w:jc w:val="left"/>
       </w:pPr>
       <w:r>
-        <w:rPr>
-          <w:b/>
-        </w:rPr>
-        <w:t>ATUALIZAÇÃO DA IMPLEMENTAÇÃO — 3º BIMESTRE</w:t>
+        <w:t>22 ESTADO ATUAL DA IMPLEMENTAÇÃO E INTEGRAÇÃO</w:t>
       </w:r>
     </w:p>
     <w:p>
       <w:r>
-        <w:t>Esta seção atualiza a documentação original com o estado mais recente do projeto, integrando o protótipo estático do front-end, os scripts JavaScript exigidos no terceiro bimestre e a estrutura inicial do back-end Flask. O objetivo desta etapa continua sendo demonstrar arquitetura, fluxos e regras fundamentais com dados simulados, sem antecipar a integração completa prevista para o quarto bimestre.</w:t>
+        <w:t>Esta seção consolida o estado do repositório após a evolução do terceiro bimestre. Ela complementa os capítulos anteriores sem substituir a modelagem, as figuras, os protótipos e as decisões já documentadas.</w:t>
       </w:r>
     </w:p>
     <w:p>
@@ -6321,22 +6121,39 @@
         <w:pStyle w:val="Ttulo2"/>
       </w:pPr>
       <w:r>
-        <w:t>1. Visão integrada da implementação atual</w:t>
+        <w:t>22.1 Páginas atuais do front-end</w:t>
       </w:r>
     </w:p>
     <w:p>
-      <w:r>
-        <w:t>A aplicação está organizada em três camadas principais: interface HTML/CSS, lógica de interação em JavaScript e estrutura inicial de back-end em Flask.</w:t>
+      <w:pPr>
+        <w:pStyle w:val="Commarcadores"/>
+      </w:pPr>
+      <w:r>
+        <w:t>Acesso: index.html.</w:t>
       </w:r>
     </w:p>
     <w:p>
-      <w:r>
-        <w:t>No estado atual, o front-end utiliza dados simulados e armazenamento local para demonstrar os fluxos. O back-end define contratos de endpoints e modelos simulados, ainda sem persistência definitiva no banco de dados.</w:t>
+      <w:pPr>
+        <w:pStyle w:val="Commarcadores"/>
+      </w:pPr>
+      <w:r>
+        <w:t>Cliente: cliente_inicio.html, cliente_bancadas.html, cliente_reservas.html, cliente_sessao.html, cliente_cardapio.html, cliente_carrinho.html e cliente_pedidos.html.</w:t>
       </w:r>
     </w:p>
     <w:p>
-      <w:r>
-        <w:t>A arquitetura definitiva manterá o mesmo fluxo conceitual: Reserva → Sessão → Cardápio/Carrinho → Pedido → KDS. A integração real entre JavaScript e Flask será feita por Fetch API e JSON no quarto bimestre.</w:t>
+      <w:pPr>
+        <w:pStyle w:val="Commarcadores"/>
+      </w:pPr>
+      <w:r>
+        <w:t>Cozinha: cozinha_dashboard.html, cozinha_kds.html, cozinha_pedidos.html, cozinha_estoque.html e cozinha_historico.html.</w:t>
+      </w:r>
+    </w:p>
+    <w:p>
+      <w:pPr>
+        <w:pStyle w:val="Commarcadores"/>
+      </w:pPr>
+      <w:r>
+        <w:t>Administrador: admin_dashboard.html, admin_reservas.html, admin_bancadas.html, admin_produtos.html, admin_ingredientes.html, admin_substituicoes.html, admin_usuarios.html e admin_relatorios.html.</w:t>
       </w:r>
     </w:p>
     <w:p>
@@ -6344,62 +6161,7 @@
         <w:pStyle w:val="Ttulo2"/>
       </w:pPr>
       <w:r>
-        <w:t>2. Front-end atual</w:t>
-      </w:r>
-    </w:p>
-    <w:p>
-      <w:r>
-        <w:t>O front-end está estruturado como uma aplicação multipágina (MPA), com páginas separadas por perfil de usuário. As telas usam os mesmos componentes visuais e dados simulados para manter consistência entre cliente, cozinha e administração.</w:t>
-      </w:r>
-    </w:p>
-    <w:p>
-      <w:pPr>
-        <w:pStyle w:val="Commarcadores"/>
-      </w:pPr>
-      <w:r>
-        <w:t>Acesso: index.html (login simulado).</w:t>
-      </w:r>
-    </w:p>
-    <w:p>
-      <w:pPr>
-        <w:pStyle w:val="Commarcadores"/>
-      </w:pPr>
-      <w:r>
-        <w:t>Cliente: início, bancadas, reservas, sessão, cardápio, carrinho e pedidos.</w:t>
-      </w:r>
-    </w:p>
-    <w:p>
-      <w:pPr>
-        <w:pStyle w:val="Commarcadores"/>
-      </w:pPr>
-      <w:r>
-        <w:t>Cozinha: dashboard, KDS, pedidos, disponibilidade do cardápio/estoque e histórico.</w:t>
-      </w:r>
-    </w:p>
-    <w:p>
-      <w:pPr>
-        <w:pStyle w:val="Commarcadores"/>
-      </w:pPr>
-      <w:r>
-        <w:t>Administrador: dashboard, reservas, bancadas, produtos, ingredientes, substituições, usuários e relatórios.</w:t>
-      </w:r>
-    </w:p>
-    <w:p>
-      <w:r>
-        <w:t>Essas páginas funcionam como protótipo navegável da aplicação final e permitem demonstrar os principais fluxos sem depender do banco de dados ou do servidor Flask.</w:t>
-      </w:r>
-    </w:p>
-    <w:p>
-      <w:pPr>
-        <w:pStyle w:val="Ttulo2"/>
-      </w:pPr>
-      <w:r>
-        <w:t>3. JavaScript — lógica do 3º bimestre</w:t>
-      </w:r>
-    </w:p>
-    <w:p>
-      <w:r>
-        <w:t>A lógica JavaScript foi separada por responsabilidade para evitar um arquivo monolítico e tornar explícitos os conteúdos avaliados no terceiro bimestre.</w:t>
+        <w:t>22.2 Módulos JavaScript atuais</w:t>
       </w:r>
     </w:p>
     <w:tbl>
@@ -6441,7 +6203,7 @@
           </w:tcPr>
           <w:p>
             <w:r>
-              <w:t>Conteúdos demonstrados</w:t>
+              <w:t>Requisito demonstrado</w:t>
             </w:r>
           </w:p>
         </w:tc>
@@ -6463,7 +6225,7 @@
           </w:tcPr>
           <w:p>
             <w:r>
-              <w:t>Dados simulados e estado compartilhado</w:t>
+              <w:t>Dados simulados e estado</w:t>
             </w:r>
           </w:p>
         </w:tc>
@@ -6473,7 +6235,7 @@
           </w:tcPr>
           <w:p>
             <w:r>
-              <w:t>arrays, objetos literais, for...in</w:t>
+              <w:t>arrays, objetos, for...in</w:t>
             </w:r>
           </w:p>
         </w:tc>
@@ -6495,7 +6257,7 @@
           </w:tcPr>
           <w:p>
             <w:r>
-              <w:t>Navegação, sessão simulada e helpers gerais</w:t>
+              <w:t>Navegação, helpers e sessão local</w:t>
             </w:r>
           </w:p>
         </w:tc>
@@ -6505,7 +6267,7 @@
           </w:tcPr>
           <w:p>
             <w:r>
-              <w:t>DOM, localStorage, eventos</w:t>
+              <w:t>DOM, eventos e localStorage</w:t>
             </w:r>
           </w:p>
         </w:tc>
@@ -6527,7 +6289,7 @@
           </w:tcPr>
           <w:p>
             <w:r>
-              <w:t>Componentes visuais reutilizáveis</w:t>
+              <w:t>Componentes reutilizáveis</w:t>
             </w:r>
           </w:p>
         </w:tc>
@@ -6537,7 +6299,7 @@
           </w:tcPr>
           <w:p>
             <w:r>
-              <w:t>for...of, templates e composição de interface</w:t>
+              <w:t>for...of e templates</w:t>
             </w:r>
           </w:p>
         </w:tc>
@@ -6559,7 +6321,7 @@
           </w:tcPr>
           <w:p>
             <w:r>
-              <w:t>Renderização dinâmica e filtros do cardápio</w:t>
+              <w:t>Cardápio dinâmico</w:t>
             </w:r>
           </w:p>
         </w:tc>
@@ -6569,7 +6331,7 @@
           </w:tcPr>
           <w:p>
             <w:r>
-              <w:t>forEach, arrays e DOM</w:t>
+              <w:t>forEach e manipulação do DOM</w:t>
             </w:r>
           </w:p>
         </w:tc>
@@ -6591,7 +6353,7 @@
           </w:tcPr>
           <w:p>
             <w:r>
-              <w:t>Carrinho e cálculos em memória</w:t>
+              <w:t>Carrinho e totais</w:t>
             </w:r>
           </w:p>
         </w:tc>
@@ -6601,7 +6363,7 @@
           </w:tcPr>
           <w:p>
             <w:r>
-              <w:t>find, filter, reduce, forEach, subtotal e total</w:t>
+              <w:t>find/filter/reduce/forEach e cálculos</w:t>
             </w:r>
           </w:p>
         </w:tc>
@@ -6623,7 +6385,7 @@
           </w:tcPr>
           <w:p>
             <w:r>
-              <w:t>Validação da reserva</w:t>
+              <w:t>Validação da Reserva</w:t>
             </w:r>
           </w:p>
         </w:tc>
@@ -6633,7 +6395,7 @@
           </w:tcPr>
           <w:p>
             <w:r>
-              <w:t>for...of, validação de entradas e feedback ao usuário</w:t>
+              <w:t>for...of e validação</w:t>
             </w:r>
           </w:p>
         </w:tc>
@@ -6655,7 +6417,7 @@
           </w:tcPr>
           <w:p>
             <w:r>
-              <w:t>Login de demonstração</w:t>
+              <w:t>Login demonstrativo</w:t>
             </w:r>
           </w:p>
         </w:tc>
@@ -6665,7 +6427,7 @@
           </w:tcPr>
           <w:p>
             <w:r>
-              <w:t>validação de formulário e seleção de perfil</w:t>
+              <w:t>validação e perfis</w:t>
             </w:r>
           </w:p>
         </w:tc>
@@ -6687,7 +6449,7 @@
           </w:tcPr>
           <w:p>
             <w:r>
-              <w:t>Registro das telas do protótipo</w:t>
+              <w:t>Templates das páginas</w:t>
             </w:r>
           </w:p>
         </w:tc>
@@ -6697,7 +6459,7 @@
           </w:tcPr>
           <w:p>
             <w:r>
-              <w:t>renderização das páginas e dados simulados</w:t>
+              <w:t>renderização do protótipo</w:t>
             </w:r>
           </w:p>
         </w:tc>
@@ -6719,7 +6481,7 @@
           </w:tcPr>
           <w:p>
             <w:r>
-              <w:t>Acessibilidade de interface</w:t>
+              <w:t>Acessibilidade</w:t>
             </w:r>
           </w:p>
         </w:tc>
@@ -6729,132 +6491,18 @@
           </w:tcPr>
           <w:p>
             <w:r>
-              <w:t>comportamentos auxiliares e navegação acessível</w:t>
+              <w:t>comportamentos auxiliares</w:t>
             </w:r>
           </w:p>
         </w:tc>
       </w:tr>
     </w:tbl>
-    <w:p>
-      <w:r>
-        <w:t>Nesta etapa, Fetch API, async/await, tratamento de erros HTTP e classes ES6+ não são necessários para a entrega. Esses recursos serão utilizados na integração real com o back-end no quarto bimestre.</w:t>
-      </w:r>
-    </w:p>
     <w:p>
       <w:pPr>
         <w:pStyle w:val="Ttulo2"/>
       </w:pPr>
       <w:r>
-        <w:t>4. Fluxos funcionais demonstrados no front-end</w:t>
-      </w:r>
-    </w:p>
-    <w:p>
-      <w:pPr>
-        <w:pStyle w:val="Commarcadores"/>
-      </w:pPr>
-      <w:r>
-        <w:t>Cardápio: produtos armazenados em arrays de objetos são renderizados dinamicamente no DOM e podem ser filtrados por categoria.</w:t>
-      </w:r>
-    </w:p>
-    <w:p>
-      <w:pPr>
-        <w:pStyle w:val="Commarcadores"/>
-      </w:pPr>
-      <w:r>
-        <w:t>Carrinho: itens podem ser adicionados e removidos; quantidades, subtotais e valor total são calculados em memória.</w:t>
-      </w:r>
-    </w:p>
-    <w:p>
-      <w:pPr>
-        <w:pStyle w:val="Commarcadores"/>
-      </w:pPr>
-      <w:r>
-        <w:t>Reserva: o formulário executa validações simples antes de apresentar confirmação simulada.</w:t>
-      </w:r>
-    </w:p>
-    <w:p>
-      <w:pPr>
-        <w:pStyle w:val="Commarcadores"/>
-      </w:pPr>
-      <w:r>
-        <w:t>Perfis: o login utiliza contas de demonstração e localStorage para direcionar cliente, cozinheiro e administrador às respectivas áreas.</w:t>
-      </w:r>
-    </w:p>
-    <w:p>
-      <w:pPr>
-        <w:pStyle w:val="Commarcadores"/>
-      </w:pPr>
-      <w:r>
-        <w:t>KDS: a interface demonstra visualmente a fila de pedidos e seus estados, ainda sem sincronização real com o servidor.</w:t>
-      </w:r>
-    </w:p>
-    <w:p>
-      <w:pPr>
-        <w:pStyle w:val="Ttulo2"/>
-      </w:pPr>
-      <w:r>
-        <w:t>5. Back-end Flask simulado</w:t>
-      </w:r>
-    </w:p>
-    <w:p>
-      <w:r>
-        <w:t>O back-end do terceiro bimestre tem caráter estrutural. Ele demonstra como a aplicação Flask será organizada e quais endpoints fundamentais existirão, mas utiliza modelos simulados e ainda não realiza persistência definitiva.</w:t>
-      </w:r>
-    </w:p>
-    <w:p>
-      <w:pPr>
-        <w:pStyle w:val="Commarcadores"/>
-      </w:pPr>
-      <w:r>
-        <w:t>run.py: ponto de inicialização do servidor Flask.</w:t>
-      </w:r>
-    </w:p>
-    <w:p>
-      <w:pPr>
-        <w:pStyle w:val="Commarcadores"/>
-      </w:pPr>
-      <w:r>
-        <w:t>config.py: concentra configurações principais da aplicação.</w:t>
-      </w:r>
-    </w:p>
-    <w:p>
-      <w:pPr>
-        <w:pStyle w:val="Commarcadores"/>
-      </w:pPr>
-      <w:r>
-        <w:t>app/__init__.py: criação/configuração inicial da aplicação.</w:t>
-      </w:r>
-    </w:p>
-    <w:p>
-      <w:pPr>
-        <w:pStyle w:val="Commarcadores"/>
-      </w:pPr>
-      <w:r>
-        <w:t>controller/auth_controller.py: exemplos de cadastro, consulta de usuário e login.</w:t>
-      </w:r>
-    </w:p>
-    <w:p>
-      <w:pPr>
-        <w:pStyle w:val="Commarcadores"/>
-      </w:pPr>
-      <w:r>
-        <w:t>controller/reserva_controller.py: consulta de bancadas e criação/consulta de reservas.</w:t>
-      </w:r>
-    </w:p>
-    <w:p>
-      <w:pPr>
-        <w:pStyle w:val="Commarcadores"/>
-      </w:pPr>
-      <w:r>
-        <w:t>controller/pedidos_controller.py: cardápio, criação/consulta de pedidos e consulta do KDS.</w:t>
-      </w:r>
-    </w:p>
-    <w:p>
-      <w:pPr>
-        <w:pStyle w:val="Ttulo2"/>
-      </w:pPr>
-      <w:r>
-        <w:t>6. Endpoints fundamentais definidos</w:t>
+        <w:t>22.3 Endpoints do back-end simulado</w:t>
       </w:r>
     </w:p>
     <w:tbl>
@@ -6907,7 +6555,7 @@
           </w:tcPr>
           <w:p>
             <w:r>
-              <w:t>Estado atual</w:t>
+              <w:t>Estado</w:t>
             </w:r>
           </w:p>
         </w:tc>
@@ -6981,7 +6629,7 @@
           </w:tcPr>
           <w:p>
             <w:r>
-              <w:t>Consultar usuário por ID</w:t>
+              <w:t>Consultar usuário</w:t>
             </w:r>
           </w:p>
         </w:tc>
@@ -7065,7 +6713,7 @@
           </w:tcPr>
           <w:p>
             <w:r>
-              <w:t>Listar bancadas</w:t>
+              <w:t>Listar Bancadas</w:t>
             </w:r>
           </w:p>
         </w:tc>
@@ -7107,7 +6755,7 @@
           </w:tcPr>
           <w:p>
             <w:r>
-              <w:t>Criar reserva</w:t>
+              <w:t>Criar Reserva</w:t>
             </w:r>
           </w:p>
         </w:tc>
@@ -7149,7 +6797,7 @@
           </w:tcPr>
           <w:p>
             <w:r>
-              <w:t>Consultar reserva</w:t>
+              <w:t>Consultar Reserva</w:t>
             </w:r>
           </w:p>
         </w:tc>
@@ -7191,7 +6839,7 @@
           </w:tcPr>
           <w:p>
             <w:r>
-              <w:t>Obter cardápio</w:t>
+              <w:t>Listar Cardápio</w:t>
             </w:r>
           </w:p>
         </w:tc>
@@ -7233,7 +6881,7 @@
           </w:tcPr>
           <w:p>
             <w:r>
-              <w:t>Criar pedido vinculado à reserva</w:t>
+              <w:t>Criar Pedido vinculado à Reserva</w:t>
             </w:r>
           </w:p>
         </w:tc>
@@ -7275,7 +6923,7 @@
           </w:tcPr>
           <w:p>
             <w:r>
-              <w:t>Consultar pedido</w:t>
+              <w:t>Consultar Pedido</w:t>
             </w:r>
           </w:p>
         </w:tc>
@@ -7317,7 +6965,7 @@
           </w:tcPr>
           <w:p>
             <w:r>
-              <w:t>Obter representação do pedido para o KDS</w:t>
+              <w:t>Gerar consulta para o KDS</w:t>
             </w:r>
           </w:p>
         </w:tc>
@@ -7338,47 +6986,37 @@
         <w:pStyle w:val="Ttulo2"/>
       </w:pPr>
       <w:r>
-        <w:t>7. Integração entre os sistemas</w:t>
+        <w:t>22.4 Integração conceitual entre os sistemas</w:t>
       </w:r>
     </w:p>
     <w:p>
       <w:r>
-        <w:t>Mesmo com front-end e back-end ainda simulados, os dois lados foram organizados para representar o mesmo domínio. O front-end já apresenta as telas e ações que futuramente chamarão os endpoints Flask, enquanto o back-end define os contratos básicos correspondentes.</w:t>
+        <w:t>1. O Cliente seleciona uma Bancada e envia os dados da Reserva.</w:t>
       </w:r>
     </w:p>
     <w:p>
       <w:r>
-        <w:t>1. O cliente seleciona uma bancada e informa os dados da reserva.</w:t>
+        <w:t>2. A Reserva cria o contexto que dará origem à Sessão.</w:t>
       </w:r>
     </w:p>
     <w:p>
       <w:r>
-        <w:t>2. A reserva representa o vínculo entre cliente, bancada e período de uso.</w:t>
+        <w:t>3. A Sessão ativa permitirá acesso ao Cardápio e criação de Pedidos.</w:t>
       </w:r>
     </w:p>
     <w:p>
       <w:r>
-        <w:t>3. A reserva dá acesso a uma Sessão, que será o contexto de uso durante o período reservado.</w:t>
+        <w:t>4. O JavaScript mantém o carrinho e apresenta os cálculos ao usuário.</w:t>
       </w:r>
     </w:p>
     <w:p>
       <w:r>
-        <w:t>4. Na Sessão, o cliente consulta o cardápio e monta o carrinho.</w:t>
+        <w:t>5. No quarto bimestre, o navegador enviará apenas identificadores e quantidades; o Flask recalculará preços e persistirá Pedido e itens.</w:t>
       </w:r>
     </w:p>
     <w:p>
       <w:r>
-        <w:t>5. Ao finalizar, o pedido é criado associado à reserva/sessão.</w:t>
-      </w:r>
-    </w:p>
-    <w:p>
-      <w:r>
-        <w:t>6. O pedido passa a ser exibido no KDS do cozinheiro.</w:t>
-      </w:r>
-    </w:p>
-    <w:p>
-      <w:r>
-        <w:t>7. No sistema completo, alterações de estado feitas no KDS serão persistidas no back-end e refletidas no front-end.</w:t>
+        <w:t>6. O KDS consumirá os Pedidos persistidos e enviará alterações de estado ao servidor.</w:t>
       </w:r>
     </w:p>
     <w:p>
@@ -7386,44 +7024,12 @@
         <w:pStyle w:val="Ttulo2"/>
       </w:pPr>
       <w:r>
-        <w:t>8. Contratos previstos para a integração no 4º bimestre</w:t>
+        <w:t>22.5 Limite da simulação e evolução para o quarto bimestre</w:t>
       </w:r>
     </w:p>
     <w:p>
       <w:r>
-        <w:t>A implementação atual evita criar uma API descartável. Os dados simulados já seguem uma estrutura próxima da versão final, permitindo substituir gradualmente os mocks por requisições HTTP.</w:t>
-      </w:r>
-    </w:p>
-    <w:p>
-      <w:pPr>
-        <w:pStyle w:val="Commarcadores"/>
-      </w:pPr>
-      <w:r>
-        <w:t>Reserva: cliente, bancada, data, horário e quantidade de pessoas.</w:t>
-      </w:r>
-    </w:p>
-    <w:p>
-      <w:pPr>
-        <w:pStyle w:val="Commarcadores"/>
-      </w:pPr>
-      <w:r>
-        <w:t>Pedido: identificador da reserva/sessão e lista de itens com quantidade.</w:t>
-      </w:r>
-    </w:p>
-    <w:p>
-      <w:pPr>
-        <w:pStyle w:val="Commarcadores"/>
-      </w:pPr>
-      <w:r>
-        <w:t>Cardápio: identificador, nome, categoria, descrição, preço e disponibilidade.</w:t>
-      </w:r>
-    </w:p>
-    <w:p>
-      <w:pPr>
-        <w:pStyle w:val="Commarcadores"/>
-      </w:pPr>
-      <w:r>
-        <w:t>KDS: pedido, itens, bancada/sessão, horário e estado de preparo.</w:t>
+        <w:t>A filosofia adotada nesta entrega é demonstrar os conceitos estudados com exemplos simples e coerentes com a arquitetura final. O front-end usa mocks e localStorage; o Flask usa controllers e models simulados. O objetivo não é antecipar o sistema completo, mas evitar código descartável: os mesmos conceitos de Reserva, Sessão, Cardápio, Pedido e KDS serão mantidos quando a persistência, Fetch/JSON, autenticação e regras completas forem implementados.</w:t>
       </w:r>
     </w:p>
     <w:p>
@@ -7431,20 +7037,7 @@
         <w:pStyle w:val="Ttulo2"/>
       </w:pPr>
       <w:r>
-        <w:t>9. Segurança na etapa atual</w:t>
-      </w:r>
-    </w:p>
-    <w:p>
-      <w:r>
-        <w:t>O login e o controle de perfis atuais têm função exclusivamente demonstrativa e utilizam localStorage. Eles não representam autenticação segura. No quarto bimestre, a autenticação será transferida para Flask, com sessões/cookies, controle de acesso por perfil (RBAC), validação também no servidor e consultas parametrizadas ao banco.</w:t>
-      </w:r>
-    </w:p>
-    <w:p>
-      <w:pPr>
-        <w:pStyle w:val="Ttulo2"/>
-      </w:pPr>
-      <w:r>
-        <w:t>10. Atendimento aos requisitos do 3º bimestre</w:t>
+        <w:t>22.6 Situação dos requisitos principais do terceiro bimestre</w:t>
       </w:r>
     </w:p>
     <w:tbl>
@@ -7486,7 +7079,7 @@
           </w:tcPr>
           <w:p>
             <w:r>
-              <w:t>Evidência</w:t>
+              <w:t>Evidência atual</w:t>
             </w:r>
           </w:p>
         </w:tc>
@@ -7498,7 +7091,7 @@
           </w:tcPr>
           <w:p>
             <w:r>
-              <w:t>DER conceitual</w:t>
+              <w:t>DER e dicionário de dados</w:t>
             </w:r>
           </w:p>
         </w:tc>
@@ -7518,7 +7111,7 @@
           </w:tcPr>
           <w:p>
             <w:r>
-              <w:t>Documentação existente e arquivo do brModelo</w:t>
+              <w:t>Arquivos e figuras já incorporados à documentação.</w:t>
             </w:r>
           </w:p>
         </w:tc>
@@ -7530,7 +7123,7 @@
           </w:tcPr>
           <w:p>
             <w:r>
-              <w:t>Dicionário de dados</w:t>
+              <w:t>Protótipo navegável</w:t>
             </w:r>
           </w:p>
         </w:tc>
@@ -7550,7 +7143,7 @@
           </w:tcPr>
           <w:p>
             <w:r>
-              <w:t>Documento específico na pasta Documentação</w:t>
+              <w:t>Páginas de Cliente, Cozinha e Administrador.</w:t>
             </w:r>
           </w:p>
         </w:tc>
@@ -7562,7 +7155,7 @@
           </w:tcPr>
           <w:p>
             <w:r>
-              <w:t>Protótipo e páginas principais</w:t>
+              <w:t>Cardápio Digital</w:t>
             </w:r>
           </w:p>
         </w:tc>
@@ -7572,7 +7165,7 @@
           </w:tcPr>
           <w:p>
             <w:r>
-              <w:t>Concluído</w:t>
+              <w:t>Concluído como protótipo funcional</w:t>
             </w:r>
           </w:p>
         </w:tc>
@@ -7582,7 +7175,7 @@
           </w:tcPr>
           <w:p>
             <w:r>
-              <w:t>FrontEnd com áreas de cliente, cozinha e administrador</w:t>
+              <w:t>cliente_cardapio.html + catalog.js.</w:t>
             </w:r>
           </w:p>
         </w:tc>
@@ -7594,7 +7187,7 @@
           </w:tcPr>
           <w:p>
             <w:r>
-              <w:t>Cardápio digital</w:t>
+              <w:t>KDS</w:t>
             </w:r>
           </w:p>
         </w:tc>
@@ -7604,7 +7197,7 @@
           </w:tcPr>
           <w:p>
             <w:r>
-              <w:t>Concluído como protótipo funcional</w:t>
+              <w:t>Concluído como protótipo visual</w:t>
             </w:r>
           </w:p>
         </w:tc>
@@ -7614,7 +7207,7 @@
           </w:tcPr>
           <w:p>
             <w:r>
-              <w:t>cliente_cardapio.html + catalog.js</w:t>
+              <w:t>cozinha_kds.html + views.js.</w:t>
             </w:r>
           </w:p>
         </w:tc>
@@ -7626,7 +7219,7 @@
           </w:tcPr>
           <w:p>
             <w:r>
-              <w:t>KDS</w:t>
+              <w:t>Arrays e objetos</w:t>
             </w:r>
           </w:p>
         </w:tc>
@@ -7636,7 +7229,7 @@
           </w:tcPr>
           <w:p>
             <w:r>
-              <w:t>Concluído como protótipo visual</w:t>
+              <w:t>Concluído</w:t>
             </w:r>
           </w:p>
         </w:tc>
@@ -7646,7 +7239,7 @@
           </w:tcPr>
           <w:p>
             <w:r>
-              <w:t>cozinha_kds.html / views.js</w:t>
+              <w:t>data.js.</w:t>
             </w:r>
           </w:p>
         </w:tc>
@@ -7658,7 +7251,7 @@
           </w:tcPr>
           <w:p>
             <w:r>
-              <w:t>Arrays e objetos literais</w:t>
+              <w:t>for...of / for...in / forEach</w:t>
             </w:r>
           </w:p>
         </w:tc>
@@ -7678,7 +7271,7 @@
           </w:tcPr>
           <w:p>
             <w:r>
-              <w:t>data.js</w:t>
+              <w:t>components.js, data.js, catalog.js e cart.js.</w:t>
             </w:r>
           </w:p>
         </w:tc>
@@ -7690,7 +7283,7 @@
           </w:tcPr>
           <w:p>
             <w:r>
-              <w:t>for...of / for...in / forEach</w:t>
+              <w:t>DOM dinâmico</w:t>
             </w:r>
           </w:p>
         </w:tc>
@@ -7710,7 +7303,7 @@
           </w:tcPr>
           <w:p>
             <w:r>
-              <w:t>components.js, data.js, catalog.js/cart.js</w:t>
+              <w:t>catalog.js e scripts de interface.</w:t>
             </w:r>
           </w:p>
         </w:tc>
@@ -7722,7 +7315,7 @@
           </w:tcPr>
           <w:p>
             <w:r>
-              <w:t>Manipulação dinâmica do DOM</w:t>
+              <w:t>Validação de formulários</w:t>
             </w:r>
           </w:p>
         </w:tc>
@@ -7732,7 +7325,7 @@
           </w:tcPr>
           <w:p>
             <w:r>
-              <w:t>Concluído</w:t>
+              <w:t>Concluído em nível inicial</w:t>
             </w:r>
           </w:p>
         </w:tc>
@@ -7742,7 +7335,7 @@
           </w:tcPr>
           <w:p>
             <w:r>
-              <w:t>catalog.js e scripts de interface</w:t>
+              <w:t>validation.js e login.js.</w:t>
             </w:r>
           </w:p>
         </w:tc>
@@ -7754,7 +7347,7 @@
           </w:tcPr>
           <w:p>
             <w:r>
-              <w:t>Validação de formulários</w:t>
+              <w:t>Cálculos em memória</w:t>
             </w:r>
           </w:p>
         </w:tc>
@@ -7764,7 +7357,7 @@
           </w:tcPr>
           <w:p>
             <w:r>
-              <w:t>Concluído em nível inicial</w:t>
+              <w:t>Concluído</w:t>
             </w:r>
           </w:p>
         </w:tc>
@@ -7774,7 +7367,7 @@
           </w:tcPr>
           <w:p>
             <w:r>
-              <w:t>validation.js e login.js</w:t>
+              <w:t>cart.js.</w:t>
             </w:r>
           </w:p>
         </w:tc>
@@ -7786,7 +7379,7 @@
           </w:tcPr>
           <w:p>
             <w:r>
-              <w:t>Cálculos em memória</w:t>
+              <w:t>Estrutura Flask</w:t>
             </w:r>
           </w:p>
         </w:tc>
@@ -7796,7 +7389,7 @@
           </w:tcPr>
           <w:p>
             <w:r>
-              <w:t>Concluído</w:t>
+              <w:t>Concluída em nível inicial</w:t>
             </w:r>
           </w:p>
         </w:tc>
@@ -7806,7 +7399,7 @@
           </w:tcPr>
           <w:p>
             <w:r>
-              <w:t>cart.js</w:t>
+              <w:t>run.py, config.py e app.</w:t>
             </w:r>
           </w:p>
         </w:tc>
@@ -7818,7 +7411,7 @@
           </w:tcPr>
           <w:p>
             <w:r>
-              <w:t>Estrutura Flask</w:t>
+              <w:t>Endpoints fundamentais</w:t>
             </w:r>
           </w:p>
         </w:tc>
@@ -7828,7 +7421,7 @@
           </w:tcPr>
           <w:p>
             <w:r>
-              <w:t>Concluída em nível inicial</w:t>
+              <w:t>Concluídos como simulação</w:t>
             </w:r>
           </w:p>
         </w:tc>
@@ -7838,7 +7431,7 @@
           </w:tcPr>
           <w:p>
             <w:r>
-              <w:t>run.py, config.py e app</w:t>
+              <w:t>controllers Flask.</w:t>
             </w:r>
           </w:p>
         </w:tc>
@@ -7850,7 +7443,7 @@
           </w:tcPr>
           <w:p>
             <w:r>
-              <w:t>Endpoints fundamentais</w:t>
+              <w:t>Fetch/JSON integrado</w:t>
             </w:r>
           </w:p>
         </w:tc>
@@ -7860,7 +7453,7 @@
           </w:tcPr>
           <w:p>
             <w:r>
-              <w:t>Concluídos como exemplos simulados</w:t>
+              <w:t>Próxima etapa</w:t>
             </w:r>
           </w:p>
         </w:tc>
@@ -7870,57 +7463,12 @@
           </w:tcPr>
           <w:p>
             <w:r>
-              <w:t>controllers do back-end</w:t>
-            </w:r>
-          </w:p>
-        </w:tc>
-      </w:tr>
-      <w:tr>
-        <w:tc>
-          <w:tcPr>
-            <w:tcW w:type="dxa" w:w="3024"/>
-          </w:tcPr>
-          <w:p>
-            <w:r>
-              <w:t>Integração JS ↔ Flask</w:t>
-            </w:r>
-          </w:p>
-        </w:tc>
-        <w:tc>
-          <w:tcPr>
-            <w:tcW w:type="dxa" w:w="3024"/>
-          </w:tcPr>
-          <w:p>
-            <w:r>
-              <w:t>Planejada para o 4º bimestre</w:t>
-            </w:r>
-          </w:p>
-        </w:tc>
-        <w:tc>
-          <w:tcPr>
-            <w:tcW w:type="dxa" w:w="3024"/>
-          </w:tcPr>
-          <w:p>
-            <w:r>
-              <w:t>Fetch/JSON ainda não conectados</w:t>
+              <w:t>Previsto para o quarto bimestre.</w:t>
             </w:r>
           </w:p>
         </w:tc>
       </w:tr>
     </w:tbl>
-    <w:p>
-      <w:pPr>
-        <w:pStyle w:val="Ttulo2"/>
-      </w:pPr>
-      <w:r>
-        <w:t>11. Estado da primeira entrega e próximos passos</w:t>
-      </w:r>
-    </w:p>
-    <w:p>
-      <w:r>
-        <w:t>Ao final do terceiro bimestre, o projeto possui modelagem de dados, identidade e protótipos das interfaces, uma aplicação front-end navegável com lógicas JavaScript fundamentais e uma estrutura de back-end Flask que define os principais contratos do sistema. A etapa seguinte substituirá progressivamente os dados simulados por persistência real, integrará o front-end ao Flask por Fetch API e aplicará autenticação, autorização e regras de negócio completas.</w:t>
-      </w:r>
-    </w:p>
     <w:sectPr>
       <w:footerReference w:type="default" r:id="rId11"/>
       <w:pgSz w:w="11906" w:h="16838"/>

</xml_diff>

<commit_message>
docs: corrige paginacao da documentacao V3
</commit_message>
<xml_diff>
--- a/Documentação/Documentacao_Sabor_e_Clic_3_Bimestre_V3_Base_Revisada.docx
+++ b/Documentação/Documentacao_Sabor_e_Clic_3_Bimestre_V3_Base_Revisada.docx
@@ -32,6 +32,41 @@
         <w:rPr>
           <w:noProof/>
         </w:rPr>
+        <w:drawing>
+          <wp:inline distT="0" distB="0" distL="0" distR="0">
+            <wp:extent cx="1080000" cy="1080000"/>
+            <wp:effectExtent l="0" t="0" r="0" b="0"/>
+            <wp:docPr id="1" name="Picture 1" descr="Marca do projeto Sabor e Clic"/>
+            <wp:cNvGraphicFramePr>
+              <a:graphicFrameLocks xmlns:a="http://schemas.openxmlformats.org/drawingml/2006/main" noChangeAspect="1"/>
+            </wp:cNvGraphicFramePr>
+            <a:graphic xmlns:a="http://schemas.openxmlformats.org/drawingml/2006/main">
+              <a:graphicData uri="http://schemas.openxmlformats.org/drawingml/2006/picture">
+                <pic:pic xmlns:pic="http://schemas.openxmlformats.org/drawingml/2006/picture">
+                  <pic:nvPicPr>
+                    <pic:cNvPr id="0" name="logo-mark.png"/>
+                    <pic:cNvPicPr/>
+                  </pic:nvPicPr>
+                  <pic:blipFill>
+                    <a:blip r:embed="rId8"/>
+                    <a:stretch>
+                      <a:fillRect/>
+                    </a:stretch>
+                  </pic:blipFill>
+                  <pic:spPr>
+                    <a:xfrm>
+                      <a:off x="0" y="0"/>
+                      <a:ext cx="1080000" cy="1080000"/>
+                    </a:xfrm>
+                    <a:prstGeom prst="rect">
+                      <a:avLst/>
+                    </a:prstGeom>
+                  </pic:spPr>
+                </pic:pic>
+              </a:graphicData>
+            </a:graphic>
+          </wp:inline>
+        </w:drawing>
       </w:r>
     </w:p>
     <w:p/>
@@ -75,13 +110,16 @@
       </w:r>
     </w:p>
     <w:p>
-      <w:r/>
+      <w:r>
+        <w:br w:type="page"/>
+      </w:r>
     </w:p>
     <w:p>
       <w:pPr>
         <w:pStyle w:val="Ttulo1"/>
       </w:pPr>
       <w:r>
+        <w:lastRenderedPageBreak/>
         <w:t>SUMÁRIO</w:t>
       </w:r>
     </w:p>
@@ -263,6 +301,12 @@
       </w:r>
     </w:p>
     <w:p>
+      <w:pPr/>
+      <w:r>
+        <w:t>22 Estado atual da implementação e integração</w:t>
+      </w:r>
+    </w:p>
+    <w:p>
       <w:pPr>
         <w:ind w:firstLine="0"/>
       </w:pPr>
@@ -271,13 +315,16 @@
       </w:r>
     </w:p>
     <w:p>
-      <w:r/>
+      <w:r>
+        <w:br w:type="page"/>
+      </w:r>
     </w:p>
     <w:p>
       <w:pPr>
         <w:pStyle w:val="Ttulo1"/>
       </w:pPr>
       <w:r>
+        <w:lastRenderedPageBreak/>
         <w:t>1 APRESENTAÇÃO DO PROJETO</w:t>
       </w:r>
     </w:p>
@@ -305,17 +352,23 @@
     </w:p>
     <w:p>
       <w:r>
-        <w:t>Ao longo do terceiro bimestre, reunimos contribuições de Artes Visuais e Design, JavaScript, Python, Banco de Dados e Segurança. O front-end evoluiu para uma aplicação multipágina navegável com telas específicas para Cliente, Cozinheiro e Administrador. Também modularizamos a lógica JavaScript e implementamos um back-end Flask simulado, com estrutura inicial da aplicação e endpoints fundamentais. A persistência definitiva e a comunicação real por Fetch/JSON permanecem para o quarto bimestre.</w:t>
+        <w:t>Ao longo do terceiro bimestre, reunimos contribuições de Artes Visuais e Design, JavaScript, Python, Banco de Dados e Segurança. Nosso protótipo estático demonstra as principais telas e interações. A m</w:t>
+      </w:r>
+      <w:r>
+        <w:t>odelagem de dados descreve as entidades e os relacionamentos necessários para sustentar a aplicação. Também iniciamos a estrutura de back-end e definimos a arquitetura teórica das rotas que completarão a integração.</w:t>
       </w:r>
     </w:p>
     <w:p>
-      <w:r/>
+      <w:r>
+        <w:br w:type="page"/>
+      </w:r>
     </w:p>
     <w:p>
       <w:pPr>
         <w:pStyle w:val="Ttulo1"/>
       </w:pPr>
       <w:r>
+        <w:lastRenderedPageBreak/>
         <w:t>2 OBJETIVOS E ESCOPO</w:t>
       </w:r>
     </w:p>
@@ -407,17 +460,23 @@
     </w:p>
     <w:p>
       <w:r>
-        <w:t>Nesta etapa concluímos o protótipo navegável, a documentação conceitual de dados, as lógicas JavaScript exigidas no terceiro bimestre e uma estrutura inicial de back-end Flask com endpoints simulados. A aplicação ainda não persiste os dados do fluxo completo nem realiza integração real entre navegador e servidor; essa evolução será feita no quarto bimestre.</w:t>
+        <w:t xml:space="preserve">Nesta etapa concluímos o protótipo estático e a documentação conceitual de dados. Iniciamos o back-end, mas a aplicação Flask integrada ao banco ainda faz </w:t>
+      </w:r>
+      <w:r>
+        <w:t>parte da evolução do projeto. Por esse motivo, quando descrevemos uma rota completa ou uma regra transacional, apresentamos a arquitetura que definimos para a implementação, distinguindo-a das interações que já funcionam localmente no protótipo.</w:t>
       </w:r>
     </w:p>
     <w:p>
-      <w:r/>
+      <w:r>
+        <w:br w:type="page"/>
+      </w:r>
     </w:p>
     <w:p>
       <w:pPr>
         <w:pStyle w:val="Ttulo1"/>
       </w:pPr>
       <w:r>
+        <w:lastRenderedPageBreak/>
         <w:t>3 CONCEP</w:t>
       </w:r>
       <w:r>
@@ -596,7 +655,10 @@
           </w:tcPr>
           <w:p>
             <w:r>
-              <w:t>MPA navegável, módulos JS, arrays/objetos, loops modernos, DOM, validações, carrinho e cálculos em memória.</w:t>
+              <w:rPr>
+                <w:sz w:val="18"/>
+              </w:rPr>
+              <w:t>JavaScript modularizado por responsabilidade, DOM, carrinho, validações, cálculos em memória e perfis simulados.</w:t>
             </w:r>
           </w:p>
         </w:tc>
@@ -608,7 +670,10 @@
           </w:tcPr>
           <w:p>
             <w:r>
-              <w:t>Classes ES6+, módulos de API, Fetch/JSON, async/await e integração com Flask.</w:t>
+              <w:rPr>
+                <w:sz w:val="18"/>
+              </w:rPr>
+              <w:t>Classes ES6+, Fetch/JSON, async/await e integração real com Flask no quarto bimestre.</w:t>
             </w:r>
           </w:p>
         </w:tc>
@@ -642,7 +707,10 @@
           </w:tcPr>
           <w:p>
             <w:r>
-              <w:t>Estrutura Flask inicial e endpoints simulados para autenticação, Reservas, Cardápio, Pedidos e KDS.</w:t>
+              <w:rPr>
+                <w:sz w:val="18"/>
+              </w:rPr>
+              <w:t>Estrutura Flask inicial com controllers e endpoints simulados para autenticação, Reservas, Cardápio, Pedidos e KDS.</w:t>
             </w:r>
           </w:p>
         </w:tc>
@@ -653,7 +721,10 @@
           </w:tcPr>
           <w:p>
             <w:r>
-              <w:t>MVC completo, services/models reais, banco persistente, autenticação e rotas protegidas.</w:t>
+              <w:rPr>
+                <w:sz w:val="18"/>
+              </w:rPr>
+              <w:t>MVC completo, services, persistência, autenticação/RBAC e integração com o banco.</w:t>
             </w:r>
           </w:p>
         </w:tc>
@@ -788,13 +859,16 @@
     </w:tbl>
     <w:p/>
     <w:p>
-      <w:r/>
+      <w:r>
+        <w:br w:type="page"/>
+      </w:r>
     </w:p>
     <w:p>
       <w:pPr>
         <w:pStyle w:val="Ttulo1"/>
       </w:pPr>
       <w:r>
+        <w:lastRenderedPageBreak/>
         <w:t>4 ATORES E RESPONSABILIDADES</w:t>
       </w:r>
     </w:p>
@@ -1067,13 +1141,16 @@
       </w:r>
     </w:p>
     <w:p>
-      <w:r/>
+      <w:r>
+        <w:br w:type="page"/>
+      </w:r>
     </w:p>
     <w:p>
       <w:pPr>
         <w:pStyle w:val="Ttulo1"/>
       </w:pPr>
       <w:r>
+        <w:lastRenderedPageBreak/>
         <w:t>5 FLUXO GERAL DO PRODUTO</w:t>
       </w:r>
     </w:p>
@@ -1581,13 +1658,16 @@
       </w:r>
     </w:p>
     <w:p>
-      <w:r/>
+      <w:r>
+        <w:br w:type="page"/>
+      </w:r>
     </w:p>
     <w:p>
       <w:pPr>
         <w:pStyle w:val="Ttulo1"/>
       </w:pPr>
       <w:r>
+        <w:lastRenderedPageBreak/>
         <w:t>6 RESERVA</w:t>
       </w:r>
     </w:p>
@@ -1704,13 +1784,16 @@
       </w:r>
     </w:p>
     <w:p>
-      <w:r/>
+      <w:r>
+        <w:br w:type="page"/>
+      </w:r>
     </w:p>
     <w:p>
       <w:pPr>
         <w:pStyle w:val="Ttulo1"/>
       </w:pPr>
       <w:r>
+        <w:lastRenderedPageBreak/>
         <w:t>7 SESSÃO</w:t>
       </w:r>
     </w:p>
@@ -1742,13 +1825,16 @@
       </w:r>
     </w:p>
     <w:p>
-      <w:r/>
+      <w:r>
+        <w:br w:type="page"/>
+      </w:r>
     </w:p>
     <w:p>
       <w:pPr>
         <w:pStyle w:val="Ttulo1"/>
       </w:pPr>
       <w:r>
+        <w:lastRenderedPageBreak/>
         <w:t>8 CARDÁPIO E CARRINHO</w:t>
       </w:r>
     </w:p>
@@ -1897,13 +1983,16 @@
       </w:r>
     </w:p>
     <w:p>
-      <w:r/>
+      <w:r>
+        <w:br w:type="page"/>
+      </w:r>
     </w:p>
     <w:p>
       <w:pPr>
         <w:pStyle w:val="Ttulo1"/>
       </w:pPr>
       <w:r>
+        <w:lastRenderedPageBreak/>
         <w:t>9 PEDIDOS</w:t>
       </w:r>
     </w:p>
@@ -2307,13 +2396,16 @@
     </w:tbl>
     <w:p/>
     <w:p>
-      <w:r/>
+      <w:r>
+        <w:br w:type="page"/>
+      </w:r>
     </w:p>
     <w:p>
       <w:pPr>
         <w:pStyle w:val="Ttulo1"/>
       </w:pPr>
       <w:r>
+        <w:lastRenderedPageBreak/>
         <w:t>10 KDS</w:t>
       </w:r>
     </w:p>
@@ -2327,13 +2419,7 @@
     </w:p>
     <w:p>
       <w:r>
-        <w:t>No protótipo, os tickets sã</w:t>
-      </w:r>
-      <w:r>
-        <w:t xml:space="preserve">o exemplos fixos e os botões acionam um toast. Na arquitetura definida, o KDS consultará a API e enviará alterações de estado. A interface só moverá o ticket depois da confirmação do servidor. O Flask validará a transição para impedir saltos ou regressões </w:t>
-      </w:r>
-      <w:r>
-        <w:t>incoerentes. Dois Cozinheiros atuando ao mesmo tempo deverão receber uma resposta de conflito quando tentarem atualizar uma versão antiga do Pedido.</w:t>
+        <w:t>No protótipo, os tickets continuam sendo exemplos visuais, mas o back-end simulado já define uma consulta específica para o KDS. Nesta primeira entrega, a interface demonstra a fila e os estados sem sincronização real. No quarto bimestre, o KDS passará a consumir Pedidos persistidos pela API e enviará alterações de estado ao Flask, que validará as transições antes de atualizar o banco.</w:t>
       </w:r>
     </w:p>
     <w:p>
@@ -2345,13 +2431,16 @@
       </w:r>
     </w:p>
     <w:p>
-      <w:r/>
+      <w:r>
+        <w:br w:type="page"/>
+      </w:r>
     </w:p>
     <w:p>
       <w:pPr>
         <w:pStyle w:val="Ttulo1"/>
       </w:pPr>
       <w:r>
+        <w:lastRenderedPageBreak/>
         <w:t>11 ADMINISTRAÇÃO DE BANCADAS E CATÁLOGO</w:t>
       </w:r>
     </w:p>
@@ -2375,13 +2464,16 @@
       </w:r>
     </w:p>
     <w:p>
-      <w:r/>
+      <w:r>
+        <w:br w:type="page"/>
+      </w:r>
     </w:p>
     <w:p>
       <w:pPr>
         <w:pStyle w:val="Ttulo1"/>
       </w:pPr>
       <w:r>
+        <w:lastRenderedPageBreak/>
         <w:t>12 ARQUITETURA DA APLICAÇ</w:t>
       </w:r>
       <w:r>
@@ -2835,23 +2927,26 @@
     <w:p/>
     <w:p>
       <w:r>
-        <w:t>O projeto adota separação por responsabilidades. No front-end, a lógica foi dividida em arquivos específicos para dados, navegação, componentes, cardápio, carrinho, validação, login, views e acessibilidade. No back-end simulado, run.py inicializa o Flask, config.py concentra configurações e os controllers exemplificam autenticação, reservas, cardápio, pedidos e KDS. A estrutura completa com routes, services, models e middleware permanece como evolução arquitetural.</w:t>
+        <w:t>O repositório já separa parte das responsabilidades do front-end em arquivos JavaScript específicos e possui uma estrutura Flask inicial. No navegador, dados simulados sustentam as telas e os fluxos. No servidor, controllers exemplificam contratos HTTP sem persistência definitiva. A direção arquitetural continua sendo uma aplicação em camadas, na qual o front-end comunica-se apenas com Flask e o banco permanece acessível somente pelo back-end.</w:t>
       </w:r>
     </w:p>
     <w:p>
-      <w:r/>
+      <w:r>
+        <w:br w:type="page"/>
+      </w:r>
     </w:p>
     <w:p>
       <w:pPr>
         <w:pStyle w:val="Ttulo1"/>
       </w:pPr>
       <w:r>
+        <w:lastRenderedPageBreak/>
         <w:t>13 LÓGICA JAVASCRIPT</w:t>
       </w:r>
     </w:p>
     <w:p>
       <w:r>
-        <w:t>O JavaScript atual foi dividido por responsabilidade. data.js concentra arrays, objetos literais e estado compartilhado; site.js reúne navegação e helpers; components.js gera componentes visuais; catalog.js manipula dinamicamente o DOM do cardápio; cart.js mantém o carrinho e calcula totais; validation.js valida a reserva; login.js trata o login demonstrativo; views.js registra as telas; e a11y.js concentra comportamentos de acessibilidade. A navegação ocorre entre páginas HTML separadas, caracterizando uma MPA.</w:t>
+        <w:t>O JavaScript atual foi dividido por responsabilidade para evitar um arquivo monolítico e tornar explícitos os conteúdos do terceiro bimestre. data.js concentra arrays, objetos literais e estado compartilhado; site.js reúne navegação, localStorage e helpers; components.js gera componentes visuais; catalog.js manipula dinamicamente o DOM do Cardápio; cart.js mantém o carrinho e calcula valores; validation.js valida Reservas; login.js trata o login demonstrativo; views.js registra as telas; e a11y.js concentra comportamentos de acessibilidade. A navegação ocorre entre páginas HTML separadas, caracterizando uma MPA.</w:t>
       </w:r>
     </w:p>
     <w:p>
@@ -2861,6 +2956,10 @@
         <w:jc w:val="left"/>
       </w:pPr>
       <w:r>
+        <w:rPr>
+          <w:rFonts w:ascii="Courier New" w:hAnsi="Courier New"/>
+          <w:sz w:val="18"/>
+        </w:rPr>
         <w:t>function renderCatalog(category = "Todos") {</w:t>
         <w:br/>
         <w:t xml:space="preserve">  const grid = document.querySelector(".grid.cols-4");</w:t>
@@ -2888,6 +2987,10 @@
         <w:jc w:val="center"/>
       </w:pPr>
       <w:r>
+        <w:rPr>
+          <w:i/>
+          <w:sz w:val="18"/>
+        </w:rPr>
         <w:t>Trecho 3 - Renderização dinâmica do Cardápio utilizando forEach e manipulação do DOM.</w:t>
       </w:r>
     </w:p>
@@ -2902,19 +3005,22 @@
       </w:r>
     </w:p>
     <w:p>
-      <w:r/>
+      <w:r>
+        <w:br w:type="page"/>
+      </w:r>
     </w:p>
     <w:p>
       <w:pPr>
         <w:pStyle w:val="Ttulo1"/>
       </w:pPr>
       <w:r>
+        <w:lastRenderedPageBreak/>
         <w:t>14 ARQUITETURA FLASK E ROTAS ESSENCIAIS</w:t>
       </w:r>
     </w:p>
     <w:p>
       <w:r>
-        <w:t>O back-end do terceiro bimestre é propositalmente simulado. Ele já possui run.py, config.py, app/__init__.py e controllers de autenticação, reserva e pedidos. Esses arquivos demonstram os endpoints fundamentais e a separação de responsabilidades, mas os models ainda são stubs e a API não está integrada ao banco ou ao front-end. O objetivo desta etapa é validar o contrato das operações antes da implementação definitiva.</w:t>
+        <w:t>O back-end do terceiro bimestre é propositalmente simulado. Ele já possui ponto de inicialização, configuração da aplicação e controllers para autenticação, Reservas e Pedidos. Esses arquivos demonstram endpoints fundamentais e separação de responsabilidades, enquanto os models permanecem simples e sem persistência definitiva. A finalidade desta etapa é validar os contratos das operações antes da implementação completa do MVC, do banco e da integração com o front-end.</w:t>
       </w:r>
     </w:p>
     <w:tbl>
@@ -2933,6 +3039,7 @@
         <w:trPr>
           <w:tblHeader/>
           <w:jc w:val="center"/>
+          <w:cantSplit/>
         </w:trPr>
         <w:tc>
           <w:tcPr>
@@ -2986,6 +3093,7 @@
       <w:tr>
         <w:trPr>
           <w:jc w:val="center"/>
+          <w:cantSplit/>
         </w:trPr>
         <w:tc>
           <w:tcPr>
@@ -2993,15 +3101,11 @@
             <w:vAlign w:val="center"/>
           </w:tcPr>
           <w:p>
-            <w:pPr>
-              <w:spacing w:after="0" w:line="240" w:lineRule="auto"/>
-              <w:ind w:firstLine="0"/>
-            </w:pPr>
-            <w:r>
-              <w:rPr>
-                <w:sz w:val="18"/>
-              </w:rPr>
-              <w:t>POST /api/auth/login</w:t>
+            <w:r>
+              <w:rPr>
+                <w:sz w:val="18"/>
+              </w:rPr>
+              <w:t>POST /api/cadastro</w:t>
             </w:r>
           </w:p>
         </w:tc>
@@ -3011,15 +3115,11 @@
             <w:vAlign w:val="center"/>
           </w:tcPr>
           <w:p>
-            <w:pPr>
-              <w:spacing w:after="0" w:line="240" w:lineRule="auto"/>
-              <w:ind w:firstLine="0"/>
-            </w:pPr>
-            <w:r>
-              <w:rPr>
-                <w:sz w:val="18"/>
-              </w:rPr>
-              <w:t>Todos</w:t>
+            <w:r>
+              <w:rPr>
+                <w:sz w:val="18"/>
+              </w:rPr>
+              <w:t>Cliente</w:t>
             </w:r>
           </w:p>
         </w:tc>
@@ -3029,15 +3129,11 @@
             <w:vAlign w:val="center"/>
           </w:tcPr>
           <w:p>
-            <w:pPr>
-              <w:spacing w:after="0" w:line="240" w:lineRule="auto"/>
-              <w:ind w:firstLine="0"/>
-            </w:pPr>
-            <w:r>
-              <w:rPr>
-                <w:sz w:val="18"/>
-              </w:rPr>
-              <w:t>Validar credenciais, usuário ativo, criar Sessão de autenticação e retornar perfil.</w:t>
+            <w:r>
+              <w:rPr>
+                <w:sz w:val="18"/>
+              </w:rPr>
+              <w:t>Cadastro simulado.</w:t>
             </w:r>
           </w:p>
         </w:tc>
@@ -3045,6 +3141,7 @@
       <w:tr>
         <w:trPr>
           <w:jc w:val="center"/>
+          <w:cantSplit/>
         </w:trPr>
         <w:tc>
           <w:tcPr>
@@ -3053,15 +3150,11 @@
             <w:vAlign w:val="center"/>
           </w:tcPr>
           <w:p>
-            <w:pPr>
-              <w:spacing w:after="0" w:line="240" w:lineRule="auto"/>
-              <w:ind w:firstLine="0"/>
-            </w:pPr>
-            <w:r>
-              <w:rPr>
-                <w:sz w:val="18"/>
-              </w:rPr>
-              <w:t>GET /api/bancadas</w:t>
+            <w:r>
+              <w:rPr>
+                <w:sz w:val="18"/>
+              </w:rPr>
+              <w:t>POST /api/login</w:t>
             </w:r>
           </w:p>
         </w:tc>
@@ -3072,15 +3165,11 @@
             <w:vAlign w:val="center"/>
           </w:tcPr>
           <w:p>
-            <w:pPr>
-              <w:spacing w:after="0" w:line="240" w:lineRule="auto"/>
-              <w:ind w:firstLine="0"/>
-            </w:pPr>
-            <w:r>
-              <w:rPr>
-                <w:sz w:val="18"/>
-              </w:rPr>
-              <w:t>Cliente/Admin</w:t>
+            <w:r>
+              <w:rPr>
+                <w:sz w:val="18"/>
+              </w:rPr>
+              <w:t>Todos</w:t>
             </w:r>
           </w:p>
         </w:tc>
@@ -3091,15 +3180,11 @@
             <w:vAlign w:val="center"/>
           </w:tcPr>
           <w:p>
-            <w:pPr>
-              <w:spacing w:after="0" w:line="240" w:lineRule="auto"/>
-              <w:ind w:firstLine="0"/>
-            </w:pPr>
-            <w:r>
-              <w:rPr>
-                <w:sz w:val="18"/>
-              </w:rPr>
-              <w:t>Filtrar capacidade e ausência de conflito no intervalo.</w:t>
+            <w:r>
+              <w:rPr>
+                <w:sz w:val="18"/>
+              </w:rPr>
+              <w:t>Login simulado por perfil.</w:t>
             </w:r>
           </w:p>
         </w:tc>
@@ -3107,6 +3192,7 @@
       <w:tr>
         <w:trPr>
           <w:jc w:val="center"/>
+          <w:cantSplit/>
         </w:trPr>
         <w:tc>
           <w:tcPr>
@@ -3114,15 +3200,11 @@
             <w:vAlign w:val="center"/>
           </w:tcPr>
           <w:p>
-            <w:pPr>
-              <w:spacing w:after="0" w:line="240" w:lineRule="auto"/>
-              <w:ind w:firstLine="0"/>
-            </w:pPr>
-            <w:r>
-              <w:rPr>
-                <w:sz w:val="18"/>
-              </w:rPr>
-              <w:t>POST /api/reservas</w:t>
+            <w:r>
+              <w:rPr>
+                <w:sz w:val="18"/>
+              </w:rPr>
+              <w:t>GET /api/bancadas</w:t>
             </w:r>
           </w:p>
         </w:tc>
@@ -3132,10 +3214,6 @@
             <w:vAlign w:val="center"/>
           </w:tcPr>
           <w:p>
-            <w:pPr>
-              <w:spacing w:after="0" w:line="240" w:lineRule="auto"/>
-              <w:ind w:firstLine="0"/>
-            </w:pPr>
             <w:r>
               <w:rPr>
                 <w:sz w:val="18"/>
@@ -3150,15 +3228,11 @@
             <w:vAlign w:val="center"/>
           </w:tcPr>
           <w:p>
-            <w:pPr>
-              <w:spacing w:after="0" w:line="240" w:lineRule="auto"/>
-              <w:ind w:firstLine="0"/>
-            </w:pPr>
-            <w:r>
-              <w:rPr>
-                <w:sz w:val="18"/>
-              </w:rPr>
-              <w:t>Revalidar disponibilidade em transação, calcular valor e criar Reserva.</w:t>
+            <w:r>
+              <w:rPr>
+                <w:sz w:val="18"/>
+              </w:rPr>
+              <w:t>Lista Bancadas simuladas.</w:t>
             </w:r>
           </w:p>
         </w:tc>
@@ -3166,6 +3240,7 @@
       <w:tr>
         <w:trPr>
           <w:jc w:val="center"/>
+          <w:cantSplit/>
         </w:trPr>
         <w:tc>
           <w:tcPr>
@@ -3174,15 +3249,11 @@
             <w:vAlign w:val="center"/>
           </w:tcPr>
           <w:p>
-            <w:pPr>
-              <w:spacing w:after="0" w:line="240" w:lineRule="auto"/>
-              <w:ind w:firstLine="0"/>
-            </w:pPr>
-            <w:r>
-              <w:rPr>
-                <w:sz w:val="18"/>
-              </w:rPr>
-              <w:t>POST /api/reservas/{id}/sessao</w:t>
+            <w:r>
+              <w:rPr>
+                <w:sz w:val="18"/>
+              </w:rPr>
+              <w:t>POST /api/reservas</w:t>
             </w:r>
           </w:p>
         </w:tc>
@@ -3193,10 +3264,6 @@
             <w:vAlign w:val="center"/>
           </w:tcPr>
           <w:p>
-            <w:pPr>
-              <w:spacing w:after="0" w:line="240" w:lineRule="auto"/>
-              <w:ind w:firstLine="0"/>
-            </w:pPr>
             <w:r>
               <w:rPr>
                 <w:sz w:val="18"/>
@@ -3212,21 +3279,11 @@
             <w:vAlign w:val="center"/>
           </w:tcPr>
           <w:p>
-            <w:pPr>
-              <w:spacing w:after="0" w:line="240" w:lineRule="auto"/>
-              <w:ind w:firstLine="0"/>
-            </w:pPr>
-            <w:r>
-              <w:rPr>
-                <w:sz w:val="18"/>
-              </w:rPr>
-              <w:t xml:space="preserve">Garantir Reserva válida e Sessão única; gerar </w:t>
-            </w:r>
-            <w:r>
-              <w:rPr>
-                <w:sz w:val="18"/>
-              </w:rPr>
-              <w:t>código de acesso.</w:t>
+            <w:r>
+              <w:rPr>
+                <w:sz w:val="18"/>
+              </w:rPr>
+              <w:t>Cria Reserva simulada.</w:t>
             </w:r>
           </w:p>
         </w:tc>
@@ -3234,6 +3291,7 @@
       <w:tr>
         <w:trPr>
           <w:jc w:val="center"/>
+          <w:cantSplit/>
         </w:trPr>
         <w:tc>
           <w:tcPr>
@@ -3241,15 +3299,11 @@
             <w:vAlign w:val="center"/>
           </w:tcPr>
           <w:p>
-            <w:pPr>
-              <w:spacing w:after="0" w:line="240" w:lineRule="auto"/>
-              <w:ind w:firstLine="0"/>
-            </w:pPr>
-            <w:r>
-              <w:rPr>
-                <w:sz w:val="18"/>
-              </w:rPr>
-              <w:t>GET /api/cardapio</w:t>
+            <w:r>
+              <w:rPr>
+                <w:sz w:val="18"/>
+              </w:rPr>
+              <w:t>GET /api/reservas/{id}</w:t>
             </w:r>
           </w:p>
         </w:tc>
@@ -3259,15 +3313,11 @@
             <w:vAlign w:val="center"/>
           </w:tcPr>
           <w:p>
-            <w:pPr>
-              <w:spacing w:after="0" w:line="240" w:lineRule="auto"/>
-              <w:ind w:firstLine="0"/>
-            </w:pPr>
-            <w:r>
-              <w:rPr>
-                <w:sz w:val="18"/>
-              </w:rPr>
-              <w:t>Cliente</w:t>
+            <w:r>
+              <w:rPr>
+                <w:sz w:val="18"/>
+              </w:rPr>
+              <w:t>Cliente/Admin</w:t>
             </w:r>
           </w:p>
         </w:tc>
@@ -3277,15 +3327,11 @@
             <w:vAlign w:val="center"/>
           </w:tcPr>
           <w:p>
-            <w:pPr>
-              <w:spacing w:after="0" w:line="240" w:lineRule="auto"/>
-              <w:ind w:firstLine="0"/>
-            </w:pPr>
-            <w:r>
-              <w:rPr>
-                <w:sz w:val="18"/>
-              </w:rPr>
-              <w:t>Listar Pratos ativos e disponíveis.</w:t>
+            <w:r>
+              <w:rPr>
+                <w:sz w:val="18"/>
+              </w:rPr>
+              <w:t>Consulta Reserva por ID.</w:t>
             </w:r>
           </w:p>
         </w:tc>
@@ -3293,6 +3339,7 @@
       <w:tr>
         <w:trPr>
           <w:jc w:val="center"/>
+          <w:cantSplit/>
         </w:trPr>
         <w:tc>
           <w:tcPr>
@@ -3301,15 +3348,11 @@
             <w:vAlign w:val="center"/>
           </w:tcPr>
           <w:p>
-            <w:pPr>
-              <w:spacing w:after="0" w:line="240" w:lineRule="auto"/>
-              <w:ind w:firstLine="0"/>
-            </w:pPr>
-            <w:r>
-              <w:rPr>
-                <w:sz w:val="18"/>
-              </w:rPr>
-              <w:t>POST /api/sessoes/{id}/pedidos</w:t>
+            <w:r>
+              <w:rPr>
+                <w:sz w:val="18"/>
+              </w:rPr>
+              <w:t>GET /api/cardapio</w:t>
             </w:r>
           </w:p>
         </w:tc>
@@ -3320,10 +3363,6 @@
             <w:vAlign w:val="center"/>
           </w:tcPr>
           <w:p>
-            <w:pPr>
-              <w:spacing w:after="0" w:line="240" w:lineRule="auto"/>
-              <w:ind w:firstLine="0"/>
-            </w:pPr>
             <w:r>
               <w:rPr>
                 <w:sz w:val="18"/>
@@ -3339,15 +3378,11 @@
             <w:vAlign w:val="center"/>
           </w:tcPr>
           <w:p>
-            <w:pPr>
-              <w:spacing w:after="0" w:line="240" w:lineRule="auto"/>
-              <w:ind w:firstLine="0"/>
-            </w:pPr>
-            <w:r>
-              <w:rPr>
-                <w:sz w:val="18"/>
-              </w:rPr>
-              <w:t>Validar Sessão e itens; recalcular preços; gravar Pedido e itens.</w:t>
+            <w:r>
+              <w:rPr>
+                <w:sz w:val="18"/>
+              </w:rPr>
+              <w:t>Retorna Cardápio simulado.</w:t>
             </w:r>
           </w:p>
         </w:tc>
@@ -3355,6 +3390,7 @@
       <w:tr>
         <w:trPr>
           <w:jc w:val="center"/>
+          <w:cantSplit/>
         </w:trPr>
         <w:tc>
           <w:tcPr>
@@ -3362,15 +3398,11 @@
             <w:vAlign w:val="center"/>
           </w:tcPr>
           <w:p>
-            <w:pPr>
-              <w:spacing w:after="0" w:line="240" w:lineRule="auto"/>
-              <w:ind w:firstLine="0"/>
-            </w:pPr>
-            <w:r>
-              <w:rPr>
-                <w:sz w:val="18"/>
-              </w:rPr>
-              <w:t>GET /api/kds/pedidos</w:t>
+            <w:r>
+              <w:rPr>
+                <w:sz w:val="18"/>
+              </w:rPr>
+              <w:t>POST /api/pedido/cadastro</w:t>
             </w:r>
           </w:p>
         </w:tc>
@@ -3380,15 +3412,11 @@
             <w:vAlign w:val="center"/>
           </w:tcPr>
           <w:p>
-            <w:pPr>
-              <w:spacing w:after="0" w:line="240" w:lineRule="auto"/>
-              <w:ind w:firstLine="0"/>
-            </w:pPr>
-            <w:r>
-              <w:rPr>
-                <w:sz w:val="18"/>
-              </w:rPr>
-              <w:t>Cozinheiro/Admin</w:t>
+            <w:r>
+              <w:rPr>
+                <w:sz w:val="18"/>
+              </w:rPr>
+              <w:t>Cliente</w:t>
             </w:r>
           </w:p>
         </w:tc>
@@ -3398,21 +3426,11 @@
             <w:vAlign w:val="center"/>
           </w:tcPr>
           <w:p>
-            <w:pPr>
-              <w:spacing w:after="0" w:line="240" w:lineRule="auto"/>
-              <w:ind w:firstLine="0"/>
-            </w:pPr>
-            <w:r>
-              <w:rPr>
-                <w:sz w:val="18"/>
-              </w:rPr>
-              <w:t xml:space="preserve">Listar fila por estado e </w:t>
-            </w:r>
-            <w:r>
-              <w:rPr>
-                <w:sz w:val="18"/>
-              </w:rPr>
-              <w:t>tempo.</w:t>
+            <w:r>
+              <w:rPr>
+                <w:sz w:val="18"/>
+              </w:rPr>
+              <w:t>Cria Pedido simulado.</w:t>
             </w:r>
           </w:p>
         </w:tc>
@@ -3420,6 +3438,7 @@
       <w:tr>
         <w:trPr>
           <w:jc w:val="center"/>
+          <w:cantSplit/>
         </w:trPr>
         <w:tc>
           <w:tcPr>
@@ -3428,15 +3447,11 @@
             <w:vAlign w:val="center"/>
           </w:tcPr>
           <w:p>
-            <w:pPr>
-              <w:spacing w:after="0" w:line="240" w:lineRule="auto"/>
-              <w:ind w:firstLine="0"/>
-            </w:pPr>
-            <w:r>
-              <w:rPr>
-                <w:sz w:val="18"/>
-              </w:rPr>
-              <w:t>PATCH /api/pedidos/{id}/status</w:t>
+            <w:r>
+              <w:rPr>
+                <w:sz w:val="18"/>
+              </w:rPr>
+              <w:t>GET /api/pedido/{id}</w:t>
             </w:r>
           </w:p>
         </w:tc>
@@ -3447,15 +3462,11 @@
             <w:vAlign w:val="center"/>
           </w:tcPr>
           <w:p>
-            <w:pPr>
-              <w:spacing w:after="0" w:line="240" w:lineRule="auto"/>
-              <w:ind w:firstLine="0"/>
-            </w:pPr>
-            <w:r>
-              <w:rPr>
-                <w:sz w:val="18"/>
-              </w:rPr>
-              <w:t>Cozinheiro/Admin</w:t>
+            <w:r>
+              <w:rPr>
+                <w:sz w:val="18"/>
+              </w:rPr>
+              <w:t>Cliente/Admin</w:t>
             </w:r>
           </w:p>
         </w:tc>
@@ -3466,15 +3477,11 @@
             <w:vAlign w:val="center"/>
           </w:tcPr>
           <w:p>
-            <w:pPr>
-              <w:spacing w:after="0" w:line="240" w:lineRule="auto"/>
-              <w:ind w:firstLine="0"/>
-            </w:pPr>
-            <w:r>
-              <w:rPr>
-                <w:sz w:val="18"/>
-              </w:rPr>
-              <w:t>Validar transição, atualizar estado e horários.</w:t>
+            <w:r>
+              <w:rPr>
+                <w:sz w:val="18"/>
+              </w:rPr>
+              <w:t>Consulta Pedido por ID.</w:t>
             </w:r>
           </w:p>
         </w:tc>
@@ -3482,6 +3489,7 @@
       <w:tr>
         <w:trPr>
           <w:jc w:val="center"/>
+          <w:cantSplit/>
         </w:trPr>
         <w:tc>
           <w:tcPr>
@@ -3489,15 +3497,11 @@
             <w:vAlign w:val="center"/>
           </w:tcPr>
           <w:p>
-            <w:pPr>
-              <w:spacing w:after="0" w:line="240" w:lineRule="auto"/>
-              <w:ind w:firstLine="0"/>
-            </w:pPr>
-            <w:r>
-              <w:rPr>
-                <w:sz w:val="18"/>
-              </w:rPr>
-              <w:t>POST /api/sessoes/{id}/encerrar</w:t>
+            <w:r>
+              <w:rPr>
+                <w:sz w:val="18"/>
+              </w:rPr>
+              <w:t>GET /api/kds/{id}</w:t>
             </w:r>
           </w:p>
         </w:tc>
@@ -3507,15 +3511,11 @@
             <w:vAlign w:val="center"/>
           </w:tcPr>
           <w:p>
-            <w:pPr>
-              <w:spacing w:after="0" w:line="240" w:lineRule="auto"/>
-              <w:ind w:firstLine="0"/>
-            </w:pPr>
-            <w:r>
-              <w:rPr>
-                <w:sz w:val="18"/>
-              </w:rPr>
-              <w:t>Cliente/Admin</w:t>
+            <w:r>
+              <w:rPr>
+                <w:sz w:val="18"/>
+              </w:rPr>
+              <w:t>Cozinheiro/Admin</w:t>
             </w:r>
           </w:p>
         </w:tc>
@@ -3525,15 +3525,11 @@
             <w:vAlign w:val="center"/>
           </w:tcPr>
           <w:p>
-            <w:pPr>
-              <w:spacing w:after="0" w:line="240" w:lineRule="auto"/>
-              <w:ind w:firstLine="0"/>
-            </w:pPr>
-            <w:r>
-              <w:rPr>
-                <w:sz w:val="18"/>
-              </w:rPr>
-              <w:t>Bloquear novos Pedidos e registrar encerramento.</w:t>
+            <w:r>
+              <w:rPr>
+                <w:sz w:val="18"/>
+              </w:rPr>
+              <w:t>Retorna Pedido para o KDS.</w:t>
             </w:r>
           </w:p>
         </w:tc>
@@ -3545,7 +3541,7 @@
         <w:pStyle w:val="Ttulo2"/>
       </w:pPr>
       <w:r>
-        <w:t>14.1 Exemplo teórico de rota</w:t>
+        <w:t>14.1 Exemplo atual de rota simulada</w:t>
       </w:r>
     </w:p>
     <w:p>
@@ -3555,7 +3551,11 @@
         <w:jc w:val="left"/>
       </w:pPr>
       <w:r>
-        <w:t># .../api/reservas - método POST</w:t>
+        <w:rPr>
+          <w:rFonts w:ascii="Courier New" w:hAnsi="Courier New"/>
+          <w:sz w:val="18"/>
+        </w:rPr>
+        <w:t># POST /api/reservas - exemplo simplificado</w:t>
         <w:br/>
         <w:t>def post_reserva(dados):</w:t>
         <w:br/>
@@ -3574,30 +3574,29 @@
         <w:jc w:val="center"/>
       </w:pPr>
       <w:r>
-        <w:t>Trecho 4 - Exemplo atual do back-end simulado para criação de Reserva.</w:t>
+        <w:rPr>
+          <w:i/>
+          <w:sz w:val="18"/>
+        </w:rPr>
+        <w:t>Trecho 4 - Exemplo do back-end simulado para criação de Reserva.</w:t>
       </w:r>
     </w:p>
     <w:p>
       <w:r>
-        <w:t>O exemplo atual demonstra o contrato básico de uma operação: receber dados, encaminhá-los para a camada responsável e devolver resultado e código HTTP. Nesta primeira entrega, os models são simulados. Na implementação definitiva, controllers e services aplicarão autenticação, validação, regras de negócio e transações antes de acessar o banco.</w:t>
+        <w:t>O exemplo demonstra o contrato básico de uma operação: receber dados, encaminhá-los para a camada responsável e devolver um resultado com código HTTP. Nesta primeira entrega, os models são simulados. Na implementação definitiva, controllers e services aplicarão autenticação, validações, regras de negócio e transações antes de acessar o banco de dados.</w:t>
       </w:r>
     </w:p>
     <w:p>
       <w:r>
-        <w:t>Utilizaremos 200 para leituras e alterações bem-sucedidas, 20</w:t>
-      </w:r>
-      <w:r>
-        <w:t>1 para criação, 400 para dados inválidos, 401 para falta de autenticação, 403 para papel inadequado, 404 para recurso inexistente e 409 para conflito de Reserva, Sessão ou estado. O JavaScript interpretará esses códigos e mostrará feedback específico.</w:t>
-      </w:r>
-    </w:p>
-    <w:p>
-      <w:r/>
+        <w:br w:type="page"/>
+      </w:r>
     </w:p>
     <w:p>
       <w:pPr>
         <w:pStyle w:val="Ttulo1"/>
       </w:pPr>
       <w:r>
+        <w:lastRenderedPageBreak/>
         <w:t>15</w:t>
       </w:r>
       <w:r>
@@ -3621,6 +3620,41 @@
         <w:rPr>
           <w:noProof/>
         </w:rPr>
+        <w:drawing>
+          <wp:inline distT="0" distB="0" distL="0" distR="0">
+            <wp:extent cx="5472000" cy="3492940"/>
+            <wp:effectExtent l="0" t="0" r="0" b="0"/>
+            <wp:docPr id="2" name="Picture 2" descr="DER do Sabor e Clic" title="DER do Sabor e Clic"/>
+            <wp:cNvGraphicFramePr>
+              <a:graphicFrameLocks xmlns:a="http://schemas.openxmlformats.org/drawingml/2006/main" noChangeAspect="1"/>
+            </wp:cNvGraphicFramePr>
+            <a:graphic xmlns:a="http://schemas.openxmlformats.org/drawingml/2006/main">
+              <a:graphicData uri="http://schemas.openxmlformats.org/drawingml/2006/picture">
+                <pic:pic xmlns:pic="http://schemas.openxmlformats.org/drawingml/2006/picture">
+                  <pic:nvPicPr>
+                    <pic:cNvPr id="0" name="DER_saborclic.png"/>
+                    <pic:cNvPicPr/>
+                  </pic:nvPicPr>
+                  <pic:blipFill>
+                    <a:blip r:embed="rId9"/>
+                    <a:stretch>
+                      <a:fillRect/>
+                    </a:stretch>
+                  </pic:blipFill>
+                  <pic:spPr>
+                    <a:xfrm>
+                      <a:off x="0" y="0"/>
+                      <a:ext cx="5472000" cy="3492940"/>
+                    </a:xfrm>
+                    <a:prstGeom prst="rect">
+                      <a:avLst/>
+                    </a:prstGeom>
+                  </pic:spPr>
+                </pic:pic>
+              </a:graphicData>
+            </a:graphic>
+          </wp:inline>
+        </w:drawing>
       </w:r>
     </w:p>
     <w:p>
@@ -3653,6 +3687,42 @@
         <w:rPr>
           <w:noProof/>
         </w:rPr>
+        <w:lastRenderedPageBreak/>
+        <w:drawing>
+          <wp:inline distT="0" distB="0" distL="0" distR="0">
+            <wp:extent cx="4140000" cy="4664221"/>
+            <wp:effectExtent l="0" t="0" r="0" b="0"/>
+            <wp:docPr id="3" name="Picture 3" descr="MER do Sabor e Clic" title="MER do Sabor e Clic"/>
+            <wp:cNvGraphicFramePr>
+              <a:graphicFrameLocks xmlns:a="http://schemas.openxmlformats.org/drawingml/2006/main" noChangeAspect="1"/>
+            </wp:cNvGraphicFramePr>
+            <a:graphic xmlns:a="http://schemas.openxmlformats.org/drawingml/2006/main">
+              <a:graphicData uri="http://schemas.openxmlformats.org/drawingml/2006/picture">
+                <pic:pic xmlns:pic="http://schemas.openxmlformats.org/drawingml/2006/picture">
+                  <pic:nvPicPr>
+                    <pic:cNvPr id="0" name="MER_saborclic.png"/>
+                    <pic:cNvPicPr/>
+                  </pic:nvPicPr>
+                  <pic:blipFill>
+                    <a:blip r:embed="rId10"/>
+                    <a:stretch>
+                      <a:fillRect/>
+                    </a:stretch>
+                  </pic:blipFill>
+                  <pic:spPr>
+                    <a:xfrm>
+                      <a:off x="0" y="0"/>
+                      <a:ext cx="4140000" cy="4664221"/>
+                    </a:xfrm>
+                    <a:prstGeom prst="rect">
+                      <a:avLst/>
+                    </a:prstGeom>
+                  </pic:spPr>
+                </pic:pic>
+              </a:graphicData>
+            </a:graphic>
+          </wp:inline>
+        </w:drawing>
       </w:r>
     </w:p>
     <w:p>
@@ -3684,13 +3754,16 @@
       </w:r>
     </w:p>
     <w:p>
-      <w:r/>
+      <w:r>
+        <w:br w:type="page"/>
+      </w:r>
     </w:p>
     <w:p>
       <w:pPr>
         <w:pStyle w:val="Ttulo1"/>
       </w:pPr>
       <w:r>
+        <w:lastRenderedPageBreak/>
         <w:t>16 SEGURANÇA E NÍVEIS DE ACESSO</w:t>
       </w:r>
     </w:p>
@@ -4064,13 +4137,16 @@
       </w:r>
     </w:p>
     <w:p>
-      <w:r/>
+      <w:r>
+        <w:br w:type="page"/>
+      </w:r>
     </w:p>
     <w:p>
       <w:pPr>
         <w:pStyle w:val="Ttulo1"/>
       </w:pPr>
       <w:r>
+        <w:lastRenderedPageBreak/>
         <w:t>17 IDENTIDADE VISUAL E PROTOTIPAÇÃO</w:t>
       </w:r>
     </w:p>
@@ -4104,13 +4180,16 @@
       </w:r>
     </w:p>
     <w:p>
-      <w:r/>
+      <w:r>
+        <w:br w:type="page"/>
+      </w:r>
     </w:p>
     <w:p>
       <w:pPr>
         <w:pStyle w:val="Ttulo1"/>
       </w:pPr>
       <w:r>
+        <w:lastRenderedPageBreak/>
         <w:t>18 REQUISITOS FUNCIONAIS E NÃO FUNCIONAIS</w:t>
       </w:r>
     </w:p>
@@ -4934,13 +5013,16 @@
     </w:tbl>
     <w:p/>
     <w:p>
-      <w:r/>
+      <w:r>
+        <w:br w:type="page"/>
+      </w:r>
     </w:p>
     <w:p>
       <w:pPr>
         <w:pStyle w:val="Ttulo1"/>
       </w:pPr>
       <w:r>
+        <w:lastRenderedPageBreak/>
         <w:t>19 TECNOLOGIAS UTILIZADAS</w:t>
       </w:r>
     </w:p>
@@ -5301,13 +5383,16 @@
     </w:tbl>
     <w:p/>
     <w:p>
-      <w:r/>
+      <w:r>
+        <w:br w:type="page"/>
+      </w:r>
     </w:p>
     <w:p>
       <w:pPr>
         <w:pStyle w:val="Ttulo1"/>
       </w:pPr>
       <w:r>
+        <w:lastRenderedPageBreak/>
         <w:t>20 O QUE CONCLUÍMOS E PRÓXIMAS ETAPAS</w:t>
       </w:r>
     </w:p>
@@ -5334,7 +5419,7 @@
     </w:p>
     <w:p>
       <w:r>
-        <w:t>Implementamos uma primeira estrutura Flask com configuração da aplicação e controllers simulados para cadastro/login, Bancadas/Reservas e Cardápio/Pedidos/KDS. Esses endpoints ainda não formam uma API persistente, mas já estabelecem os contratos que serão ligados ao front-end. A autenticação real, o banco físico e Fetch/JSON continuam como próxima etapa.</w:t>
+        <w:t>Implementamos uma primeira estrutura Flask com configuração da aplicação e controllers simulados para cadastro/login, Bancadas/Reservas e Cardápio/Pedidos/KDS. Esses endpoints ainda não formam uma API persistente, mas já estabelecem contratos compatíveis com a evolução do sistema. A autenticação real, o banco físico e a comunicação Fetch/JSON permanecem para a próxima etapa.</w:t>
       </w:r>
     </w:p>
     <w:p>
@@ -5347,17 +5432,20 @@
     </w:p>
     <w:p>
       <w:r>
-        <w:t>Nas próximas etapas, completaremos a factory Flask e a separação MVC, substituiremos os models simulados por persistência real, implementaremos autenticação e RBAC, criaremos a Sessão persistente, integraremos Cardápio/Pedido/KDS ao banco e conectaremos o front-end à API por Fetch/JSON. Depois serão acrescentados tratamento de loading/erros e testes para conflitos, permissões, totais e transições de estado.</w:t>
+        <w:t>Nas próximas etapas, completaremos a factory Flask e a separação MVC, substituiremos os models simulados por persistência real, implementaremos autenticação e RBAC, criaremos a Sessão persistente, integraremos Cardápio, Pedido e KDS ao banco e conectaremos o front-end à API por Fetch/JSON. Depois serão acrescentados tratamento de loading/erros e testes para conflitos, permissões, totais e transições de estado.</w:t>
       </w:r>
     </w:p>
     <w:p>
-      <w:r/>
+      <w:r>
+        <w:br w:type="page"/>
+      </w:r>
     </w:p>
     <w:p>
       <w:pPr>
         <w:pStyle w:val="Ttulo1"/>
       </w:pPr>
       <w:r>
+        <w:lastRenderedPageBreak/>
         <w:t>21 ATENDIMENTO AOS REQUISITOS DO TERCEIRO BIMESTRE</w:t>
       </w:r>
     </w:p>
@@ -5805,6 +5893,7 @@
       <w:tr>
         <w:trPr>
           <w:jc w:val="center"/>
+          <w:cantSplit/>
         </w:trPr>
         <w:tc>
           <w:tcPr>
@@ -5830,6 +5919,41 @@
             <w:vAlign w:val="center"/>
           </w:tcPr>
           <w:p>
+            <w:r>
+              <w:rPr>
+                <w:sz w:val="18"/>
+              </w:rPr>
+              <w:t>Concluído para a etapa</w:t>
+            </w:r>
+          </w:p>
+        </w:tc>
+        <w:tc>
+          <w:tcPr>
+            <w:tcW w:w="3024" w:type="dxa"/>
+            <w:vAlign w:val="center"/>
+          </w:tcPr>
+          <w:p>
+            <w:r>
+              <w:rPr>
+                <w:sz w:val="18"/>
+              </w:rPr>
+              <w:t>data.js, components.js, catalog.js, cart.js e demais módulos: arrays, objetos, for...of, for...in, forEach, DOM e cálculos.</w:t>
+            </w:r>
+          </w:p>
+        </w:tc>
+      </w:tr>
+      <w:tr>
+        <w:trPr>
+          <w:jc w:val="center"/>
+          <w:cantSplit/>
+        </w:trPr>
+        <w:tc>
+          <w:tcPr>
+            <w:tcW w:w="3024" w:type="dxa"/>
+            <w:shd w:val="clear" w:color="auto" w:fill="F2F2F2"/>
+            <w:vAlign w:val="center"/>
+          </w:tcPr>
+          <w:p>
             <w:pPr>
               <w:spacing w:after="0" w:line="240" w:lineRule="auto"/>
               <w:ind w:firstLine="0"/>
@@ -5838,10 +5962,46 @@
               <w:rPr>
                 <w:sz w:val="18"/>
               </w:rPr>
-              <w:t>Concluído para a etapa</w:t>
-            </w:r>
-          </w:p>
-        </w:tc>
+              <w:t>Validações</w:t>
+            </w:r>
+          </w:p>
+        </w:tc>
+        <w:tc>
+          <w:tcPr>
+            <w:tcW w:w="3024" w:type="dxa"/>
+            <w:shd w:val="clear" w:color="auto" w:fill="F2F2F2"/>
+            <w:vAlign w:val="center"/>
+          </w:tcPr>
+          <w:p>
+            <w:r>
+              <w:rPr>
+                <w:sz w:val="18"/>
+              </w:rPr>
+              <w:t>Concluído em nível inicial</w:t>
+            </w:r>
+          </w:p>
+        </w:tc>
+        <w:tc>
+          <w:tcPr>
+            <w:tcW w:w="3024" w:type="dxa"/>
+            <w:shd w:val="clear" w:color="auto" w:fill="F2F2F2"/>
+            <w:vAlign w:val="center"/>
+          </w:tcPr>
+          <w:p>
+            <w:r>
+              <w:rPr>
+                <w:sz w:val="18"/>
+              </w:rPr>
+              <w:t>validation.js e login.js demonstram validação no navegador; validação de autoridade será repetida no Flask.</w:t>
+            </w:r>
+          </w:p>
+        </w:tc>
+      </w:tr>
+      <w:tr>
+        <w:trPr>
+          <w:jc w:val="center"/>
+          <w:cantSplit/>
+        </w:trPr>
         <w:tc>
           <w:tcPr>
             <w:tcW w:w="3024" w:type="dxa"/>
@@ -5856,13 +6016,35 @@
               <w:rPr>
                 <w:sz w:val="18"/>
               </w:rPr>
-              <w:t xml:space="preserve">Renderização dinâmica, eventos, </w:t>
-            </w:r>
-            <w:r>
-              <w:rPr>
-                <w:sz w:val="18"/>
-              </w:rPr>
-              <w:t>arrays, map/filter/reduce e cálculo.</w:t>
+              <w:t>Flask/MVC/rotas/JSON</w:t>
+            </w:r>
+          </w:p>
+        </w:tc>
+        <w:tc>
+          <w:tcPr>
+            <w:tcW w:w="3024" w:type="dxa"/>
+            <w:vAlign w:val="center"/>
+          </w:tcPr>
+          <w:p>
+            <w:r>
+              <w:rPr>
+                <w:sz w:val="18"/>
+              </w:rPr>
+              <w:t>Concluído como estrutura simulada</w:t>
+            </w:r>
+          </w:p>
+        </w:tc>
+        <w:tc>
+          <w:tcPr>
+            <w:tcW w:w="3024" w:type="dxa"/>
+            <w:vAlign w:val="center"/>
+          </w:tcPr>
+          <w:p>
+            <w:r>
+              <w:rPr>
+                <w:sz w:val="18"/>
+              </w:rPr>
+              <w:t>Aplicação Flask inicial, controllers e endpoints simulados de autenticação, Reservas, Cardápio, Pedidos e KDS.</w:t>
             </w:r>
           </w:p>
         </w:tc>
@@ -5870,6 +6052,7 @@
       <w:tr>
         <w:trPr>
           <w:jc w:val="center"/>
+          <w:cantSplit/>
         </w:trPr>
         <w:tc>
           <w:tcPr>
@@ -5886,7 +6069,7 @@
               <w:rPr>
                 <w:sz w:val="18"/>
               </w:rPr>
-              <w:t>Validações</w:t>
+              <w:t>Segurança e RBAC</w:t>
             </w:r>
           </w:p>
         </w:tc>
@@ -5897,15 +6080,11 @@
             <w:vAlign w:val="center"/>
           </w:tcPr>
           <w:p>
-            <w:pPr>
-              <w:spacing w:after="0" w:line="240" w:lineRule="auto"/>
-              <w:ind w:firstLine="0"/>
-            </w:pPr>
-            <w:r>
-              <w:rPr>
-                <w:sz w:val="18"/>
-              </w:rPr>
-              <w:t>Parcial</w:t>
+            <w:r>
+              <w:rPr>
+                <w:sz w:val="18"/>
+              </w:rPr>
+              <w:t>Definido e demonstrado no protótipo</w:t>
             </w:r>
           </w:p>
         </w:tc>
@@ -5916,150 +6095,11 @@
             <w:vAlign w:val="center"/>
           </w:tcPr>
           <w:p>
-            <w:pPr>
-              <w:spacing w:after="0" w:line="240" w:lineRule="auto"/>
-              <w:ind w:firstLine="0"/>
-            </w:pPr>
-            <w:r>
-              <w:rPr>
-                <w:sz w:val="18"/>
-              </w:rPr>
-              <w:t>required e regras locais; validações completas serão repetidas no Flask.</w:t>
-            </w:r>
-          </w:p>
-        </w:tc>
-      </w:tr>
-      <w:tr>
-        <w:trPr>
-          <w:jc w:val="center"/>
-        </w:trPr>
-        <w:tc>
-          <w:tcPr>
-            <w:tcW w:w="3024" w:type="dxa"/>
-            <w:vAlign w:val="center"/>
-          </w:tcPr>
-          <w:p>
-            <w:pPr>
-              <w:spacing w:after="0" w:line="240" w:lineRule="auto"/>
-              <w:ind w:firstLine="0"/>
-            </w:pPr>
-            <w:r>
-              <w:rPr>
-                <w:sz w:val="18"/>
-              </w:rPr>
-              <w:t>Flask/MVC/rotas/JSON</w:t>
-            </w:r>
-          </w:p>
-        </w:tc>
-        <w:tc>
-          <w:tcPr>
-            <w:tcW w:w="3024" w:type="dxa"/>
-            <w:vAlign w:val="center"/>
-          </w:tcPr>
-          <w:p>
-            <w:pPr>
-              <w:spacing w:after="0" w:line="240" w:lineRule="auto"/>
-              <w:ind w:firstLine="0"/>
-            </w:pPr>
-            <w:r>
-              <w:rPr>
-                <w:sz w:val="18"/>
-              </w:rPr>
-              <w:t>Estrut</w:t>
-            </w:r>
-            <w:bookmarkStart w:id="0" w:name="_GoBack"/>
-            <w:bookmarkEnd w:id="0"/>
-            <w:r>
-              <w:rPr>
-                <w:sz w:val="18"/>
-              </w:rPr>
-              <w:t>ura teórica e início técnico</w:t>
-            </w:r>
-          </w:p>
-        </w:tc>
-        <w:tc>
-          <w:tcPr>
-            <w:tcW w:w="3024" w:type="dxa"/>
-            <w:vAlign w:val="center"/>
-          </w:tcPr>
-          <w:p>
-            <w:pPr>
-              <w:spacing w:after="0" w:line="240" w:lineRule="auto"/>
-              <w:ind w:firstLine="0"/>
-            </w:pPr>
-            <w:r>
-              <w:rPr>
-                <w:sz w:val="18"/>
-              </w:rPr>
-              <w:t xml:space="preserve">Arquivos iniciais, exemplo fetch e arquitetura detalhada neste </w:t>
-            </w:r>
-            <w:r>
-              <w:rPr>
-                <w:sz w:val="18"/>
-              </w:rPr>
-              <w:t>documento.</w:t>
-            </w:r>
-          </w:p>
-        </w:tc>
-      </w:tr>
-      <w:tr>
-        <w:trPr>
-          <w:jc w:val="center"/>
-        </w:trPr>
-        <w:tc>
-          <w:tcPr>
-            <w:tcW w:w="3024" w:type="dxa"/>
-            <w:shd w:val="clear" w:color="auto" w:fill="F2F2F2"/>
-            <w:vAlign w:val="center"/>
-          </w:tcPr>
-          <w:p>
-            <w:pPr>
-              <w:spacing w:after="0" w:line="240" w:lineRule="auto"/>
-              <w:ind w:firstLine="0"/>
-            </w:pPr>
-            <w:r>
-              <w:rPr>
-                <w:sz w:val="18"/>
-              </w:rPr>
-              <w:t>Segurança e RBAC</w:t>
-            </w:r>
-          </w:p>
-        </w:tc>
-        <w:tc>
-          <w:tcPr>
-            <w:tcW w:w="3024" w:type="dxa"/>
-            <w:shd w:val="clear" w:color="auto" w:fill="F2F2F2"/>
-            <w:vAlign w:val="center"/>
-          </w:tcPr>
-          <w:p>
-            <w:pPr>
-              <w:spacing w:after="0" w:line="240" w:lineRule="auto"/>
-              <w:ind w:firstLine="0"/>
-            </w:pPr>
-            <w:r>
-              <w:rPr>
-                <w:sz w:val="18"/>
-              </w:rPr>
-              <w:t>Definido conceitualmente</w:t>
-            </w:r>
-          </w:p>
-        </w:tc>
-        <w:tc>
-          <w:tcPr>
-            <w:tcW w:w="3024" w:type="dxa"/>
-            <w:shd w:val="clear" w:color="auto" w:fill="F2F2F2"/>
-            <w:vAlign w:val="center"/>
-          </w:tcPr>
-          <w:p>
-            <w:pPr>
-              <w:spacing w:after="0" w:line="240" w:lineRule="auto"/>
-              <w:ind w:firstLine="0"/>
-            </w:pPr>
-            <w:r>
-              <w:rPr>
-                <w:sz w:val="18"/>
-              </w:rPr>
-              <w:t>Papéis e menus; middleware e autenticação serão implementados.</w:t>
+            <w:r>
+              <w:rPr>
+                <w:sz w:val="18"/>
+              </w:rPr>
+              <w:t>Perfis e separação visual existem; autenticação e RBAC de autoridade serão aplicados no servidor.</w:t>
             </w:r>
           </w:p>
         </w:tc>
@@ -6067,35 +6107,63 @@
     </w:tbl>
     <w:p/>
     <w:p>
-      <w:r/>
+      <w:r>
+        <w:br w:type="page"/>
+      </w:r>
     </w:p>
     <w:p>
       <w:pPr>
         <w:pStyle w:val="Ttulo1"/>
       </w:pPr>
       <w:r>
-        <w:t>REFERÊNCIAS</w:t>
+        <w:t>22 ESTADO ATUAL DA IMPLEMENTAÇÃO E INTEGRAÇÃO</w:t>
       </w:r>
     </w:p>
     <w:p>
       <w:r>
-        <w:t xml:space="preserve">INSTITUTO FEDERAL DE EDUCAÇÃO, CIÊNCIA E TECNOLOGIA DE SÃO PAULO. Projeto Integrador Sabor &amp; Clic: sistema de gestão para </w:t>
-      </w:r>
-      <w:r>
-        <w:t>dark kitchens e espaços gastronômicos. Versão de 31 de agosto de 2026. São Paulo: IFSP, 2026.</w:t>
+        <w:t>Esta seção consolida a implementação atual sem alterar a arquitetura definida anteriormente. No terceiro bimestre, o front-end e o Flask utilizam dados simulados para demonstrar os fluxos; no quarto bimestre, esses mesmos contratos serão ligados à persistência e à comunicação real por JSON.</w:t>
       </w:r>
     </w:p>
     <w:p>
-      <w:r>
-        <w:t>SABOR E CLIC. Repositório Sabor-Clic. GitHub, 2026. Disponível em: https://github.com/FaellEmiliano/Sabor-Clic.</w:t>
+      <w:pPr>
+        <w:pStyle w:val="Ttulo2"/>
+        <w:keepNext/>
+      </w:pPr>
+      <w:r>
+        <w:t>22.1 Front-end e JavaScript</w:t>
       </w:r>
     </w:p>
     <w:p>
       <w:r>
-        <w:t>SABOR E CLIC. Dicionário de Dados Sabor e Clic. Sã</w:t>
-      </w:r>
-      <w:r>
-        <w:t>o Paulo, 2026.</w:t>
+        <w:t>O front-end possui áreas separadas para Cliente, Cozinheiro e Administrador. O JavaScript está dividido entre data.js, site.js, components.js, catalog.js, cart.js, validation.js, login.js, views.js e a11y.js, cobrindo arrays, objetos, for...of, for...in, forEach, DOM, validação e cálculos em memória.</w:t>
+      </w:r>
+    </w:p>
+    <w:p>
+      <w:pPr>
+        <w:pStyle w:val="Ttulo2"/>
+        <w:keepNext/>
+      </w:pPr>
+      <w:r>
+        <w:t>22.2 Back-end simulado</w:t>
+      </w:r>
+    </w:p>
+    <w:p>
+      <w:r>
+        <w:t>A estrutura Flask já demonstra cadastro/login, Bancadas/Reservas, Cardápio/Pedidos e KDS por meio de controllers e models simulados. A finalidade é validar endpoints e responsabilidades antes de conectar o banco e implementar autenticação e RBAC reais.</w:t>
+      </w:r>
+    </w:p>
+    <w:p>
+      <w:pPr>
+        <w:pStyle w:val="Ttulo2"/>
+        <w:keepNext/>
+      </w:pPr>
+      <w:r>
+        <w:t>22.3 Integração e próxima etapa</w:t>
+      </w:r>
+    </w:p>
+    <w:p>
+      <w:r>
+        <w:t>O fluxo permanece Reserva → Sessão → Cardápio/Carrinho → Pedido → KDS. Na integração definitiva, o JavaScript enviará identificadores e quantidades ao Flask; o servidor validará a Sessão, recalculará valores, persistirá os dados e devolverá JSON. O KDS passará a consumir esses Pedidos e atualizar seus estados pelo back-end.</w:t>
       </w:r>
     </w:p>
     <w:p>
@@ -6108,1367 +6176,31 @@
         <w:pStyle w:val="Ttulo1"/>
       </w:pPr>
       <w:r>
-        <w:t>22 ESTADO ATUAL DA IMPLEMENTAÇÃO E INTEGRAÇÃO</w:t>
+        <w:lastRenderedPageBreak/>
+        <w:t>REFERÊNCIAS</w:t>
       </w:r>
     </w:p>
     <w:p>
       <w:r>
-        <w:t>Esta seção consolida o estado do repositório após a evolução do terceiro bimestre. Ela complementa os capítulos anteriores sem substituir a modelagem, as figuras, os protótipos e as decisões já documentadas.</w:t>
+        <w:t xml:space="preserve">INSTITUTO FEDERAL DE EDUCAÇÃO, CIÊNCIA E TECNOLOGIA DE SÃO PAULO. Projeto Integrador Sabor &amp; Clic: sistema de gestão para </w:t>
+      </w:r>
+      <w:r>
+        <w:t>dark kitchens e espaços gastronômicos. Versão de 31 de agosto de 2026. São Paulo: IFSP, 2026.</w:t>
       </w:r>
     </w:p>
     <w:p>
-      <w:pPr>
-        <w:pStyle w:val="Ttulo2"/>
-      </w:pPr>
-      <w:r>
-        <w:t>22.1 Páginas atuais do front-end</w:t>
+      <w:r>
+        <w:t>SABOR E CLIC. Repositório Sabor-Clic. GitHub, 2026. Disponível em: https://github.com/FaellEmiliano/Sabor-Clic.</w:t>
       </w:r>
     </w:p>
     <w:p>
-      <w:pPr>
-        <w:pStyle w:val="Commarcadores"/>
-      </w:pPr>
-      <w:r>
-        <w:t>Acesso: index.html.</w:t>
+      <w:r>
+        <w:t>SABOR E CLIC. Dicionário de Dados Sabor e Clic. Sã</w:t>
+      </w:r>
+      <w:r>
+        <w:t>o Paulo, 2026.</w:t>
       </w:r>
     </w:p>
-    <w:p>
-      <w:pPr>
-        <w:pStyle w:val="Commarcadores"/>
-      </w:pPr>
-      <w:r>
-        <w:t>Cliente: cliente_inicio.html, cliente_bancadas.html, cliente_reservas.html, cliente_sessao.html, cliente_cardapio.html, cliente_carrinho.html e cliente_pedidos.html.</w:t>
-      </w:r>
-    </w:p>
-    <w:p>
-      <w:pPr>
-        <w:pStyle w:val="Commarcadores"/>
-      </w:pPr>
-      <w:r>
-        <w:t>Cozinha: cozinha_dashboard.html, cozinha_kds.html, cozinha_pedidos.html, cozinha_estoque.html e cozinha_historico.html.</w:t>
-      </w:r>
-    </w:p>
-    <w:p>
-      <w:pPr>
-        <w:pStyle w:val="Commarcadores"/>
-      </w:pPr>
-      <w:r>
-        <w:t>Administrador: admin_dashboard.html, admin_reservas.html, admin_bancadas.html, admin_produtos.html, admin_ingredientes.html, admin_substituicoes.html, admin_usuarios.html e admin_relatorios.html.</w:t>
-      </w:r>
-    </w:p>
-    <w:p>
-      <w:pPr>
-        <w:pStyle w:val="Ttulo2"/>
-      </w:pPr>
-      <w:r>
-        <w:t>22.2 Módulos JavaScript atuais</w:t>
-      </w:r>
-    </w:p>
-    <w:tbl>
-      <w:tblPr>
-        <w:tblStyle w:val="Tabelacomgrade"/>
-        <w:tblW w:type="auto" w:w="0"/>
-        <w:jc w:val="center"/>
-        <w:tblLook w:firstColumn="1" w:firstRow="1" w:lastColumn="0" w:lastRow="0" w:noHBand="0" w:noVBand="1" w:val="04A0"/>
-      </w:tblPr>
-      <w:tblGrid>
-        <w:gridCol w:w="3024"/>
-        <w:gridCol w:w="3024"/>
-        <w:gridCol w:w="3024"/>
-      </w:tblGrid>
-      <w:tr>
-        <w:tc>
-          <w:tcPr>
-            <w:tcW w:type="dxa" w:w="3024"/>
-          </w:tcPr>
-          <w:p>
-            <w:r>
-              <w:t>Arquivo</w:t>
-            </w:r>
-          </w:p>
-        </w:tc>
-        <w:tc>
-          <w:tcPr>
-            <w:tcW w:type="dxa" w:w="3024"/>
-          </w:tcPr>
-          <w:p>
-            <w:r>
-              <w:t>Responsabilidade</w:t>
-            </w:r>
-          </w:p>
-        </w:tc>
-        <w:tc>
-          <w:tcPr>
-            <w:tcW w:type="dxa" w:w="3024"/>
-          </w:tcPr>
-          <w:p>
-            <w:r>
-              <w:t>Requisito demonstrado</w:t>
-            </w:r>
-          </w:p>
-        </w:tc>
-      </w:tr>
-      <w:tr>
-        <w:tc>
-          <w:tcPr>
-            <w:tcW w:type="dxa" w:w="3024"/>
-          </w:tcPr>
-          <w:p>
-            <w:r>
-              <w:t>data.js</w:t>
-            </w:r>
-          </w:p>
-        </w:tc>
-        <w:tc>
-          <w:tcPr>
-            <w:tcW w:type="dxa" w:w="3024"/>
-          </w:tcPr>
-          <w:p>
-            <w:r>
-              <w:t>Dados simulados e estado</w:t>
-            </w:r>
-          </w:p>
-        </w:tc>
-        <w:tc>
-          <w:tcPr>
-            <w:tcW w:type="dxa" w:w="3024"/>
-          </w:tcPr>
-          <w:p>
-            <w:r>
-              <w:t>arrays, objetos, for...in</w:t>
-            </w:r>
-          </w:p>
-        </w:tc>
-      </w:tr>
-      <w:tr>
-        <w:tc>
-          <w:tcPr>
-            <w:tcW w:type="dxa" w:w="3024"/>
-          </w:tcPr>
-          <w:p>
-            <w:r>
-              <w:t>site.js</w:t>
-            </w:r>
-          </w:p>
-        </w:tc>
-        <w:tc>
-          <w:tcPr>
-            <w:tcW w:type="dxa" w:w="3024"/>
-          </w:tcPr>
-          <w:p>
-            <w:r>
-              <w:t>Navegação, helpers e sessão local</w:t>
-            </w:r>
-          </w:p>
-        </w:tc>
-        <w:tc>
-          <w:tcPr>
-            <w:tcW w:type="dxa" w:w="3024"/>
-          </w:tcPr>
-          <w:p>
-            <w:r>
-              <w:t>DOM, eventos e localStorage</w:t>
-            </w:r>
-          </w:p>
-        </w:tc>
-      </w:tr>
-      <w:tr>
-        <w:tc>
-          <w:tcPr>
-            <w:tcW w:type="dxa" w:w="3024"/>
-          </w:tcPr>
-          <w:p>
-            <w:r>
-              <w:t>components.js</w:t>
-            </w:r>
-          </w:p>
-        </w:tc>
-        <w:tc>
-          <w:tcPr>
-            <w:tcW w:type="dxa" w:w="3024"/>
-          </w:tcPr>
-          <w:p>
-            <w:r>
-              <w:t>Componentes reutilizáveis</w:t>
-            </w:r>
-          </w:p>
-        </w:tc>
-        <w:tc>
-          <w:tcPr>
-            <w:tcW w:type="dxa" w:w="3024"/>
-          </w:tcPr>
-          <w:p>
-            <w:r>
-              <w:t>for...of e templates</w:t>
-            </w:r>
-          </w:p>
-        </w:tc>
-      </w:tr>
-      <w:tr>
-        <w:tc>
-          <w:tcPr>
-            <w:tcW w:type="dxa" w:w="3024"/>
-          </w:tcPr>
-          <w:p>
-            <w:r>
-              <w:t>catalog.js</w:t>
-            </w:r>
-          </w:p>
-        </w:tc>
-        <w:tc>
-          <w:tcPr>
-            <w:tcW w:type="dxa" w:w="3024"/>
-          </w:tcPr>
-          <w:p>
-            <w:r>
-              <w:t>Cardápio dinâmico</w:t>
-            </w:r>
-          </w:p>
-        </w:tc>
-        <w:tc>
-          <w:tcPr>
-            <w:tcW w:type="dxa" w:w="3024"/>
-          </w:tcPr>
-          <w:p>
-            <w:r>
-              <w:t>forEach e manipulação do DOM</w:t>
-            </w:r>
-          </w:p>
-        </w:tc>
-      </w:tr>
-      <w:tr>
-        <w:tc>
-          <w:tcPr>
-            <w:tcW w:type="dxa" w:w="3024"/>
-          </w:tcPr>
-          <w:p>
-            <w:r>
-              <w:t>cart.js</w:t>
-            </w:r>
-          </w:p>
-        </w:tc>
-        <w:tc>
-          <w:tcPr>
-            <w:tcW w:type="dxa" w:w="3024"/>
-          </w:tcPr>
-          <w:p>
-            <w:r>
-              <w:t>Carrinho e totais</w:t>
-            </w:r>
-          </w:p>
-        </w:tc>
-        <w:tc>
-          <w:tcPr>
-            <w:tcW w:type="dxa" w:w="3024"/>
-          </w:tcPr>
-          <w:p>
-            <w:r>
-              <w:t>find/filter/reduce/forEach e cálculos</w:t>
-            </w:r>
-          </w:p>
-        </w:tc>
-      </w:tr>
-      <w:tr>
-        <w:tc>
-          <w:tcPr>
-            <w:tcW w:type="dxa" w:w="3024"/>
-          </w:tcPr>
-          <w:p>
-            <w:r>
-              <w:t>validation.js</w:t>
-            </w:r>
-          </w:p>
-        </w:tc>
-        <w:tc>
-          <w:tcPr>
-            <w:tcW w:type="dxa" w:w="3024"/>
-          </w:tcPr>
-          <w:p>
-            <w:r>
-              <w:t>Validação da Reserva</w:t>
-            </w:r>
-          </w:p>
-        </w:tc>
-        <w:tc>
-          <w:tcPr>
-            <w:tcW w:type="dxa" w:w="3024"/>
-          </w:tcPr>
-          <w:p>
-            <w:r>
-              <w:t>for...of e validação</w:t>
-            </w:r>
-          </w:p>
-        </w:tc>
-      </w:tr>
-      <w:tr>
-        <w:tc>
-          <w:tcPr>
-            <w:tcW w:type="dxa" w:w="3024"/>
-          </w:tcPr>
-          <w:p>
-            <w:r>
-              <w:t>login.js</w:t>
-            </w:r>
-          </w:p>
-        </w:tc>
-        <w:tc>
-          <w:tcPr>
-            <w:tcW w:type="dxa" w:w="3024"/>
-          </w:tcPr>
-          <w:p>
-            <w:r>
-              <w:t>Login demonstrativo</w:t>
-            </w:r>
-          </w:p>
-        </w:tc>
-        <w:tc>
-          <w:tcPr>
-            <w:tcW w:type="dxa" w:w="3024"/>
-          </w:tcPr>
-          <w:p>
-            <w:r>
-              <w:t>validação e perfis</w:t>
-            </w:r>
-          </w:p>
-        </w:tc>
-      </w:tr>
-      <w:tr>
-        <w:tc>
-          <w:tcPr>
-            <w:tcW w:type="dxa" w:w="3024"/>
-          </w:tcPr>
-          <w:p>
-            <w:r>
-              <w:t>views.js</w:t>
-            </w:r>
-          </w:p>
-        </w:tc>
-        <w:tc>
-          <w:tcPr>
-            <w:tcW w:type="dxa" w:w="3024"/>
-          </w:tcPr>
-          <w:p>
-            <w:r>
-              <w:t>Templates das páginas</w:t>
-            </w:r>
-          </w:p>
-        </w:tc>
-        <w:tc>
-          <w:tcPr>
-            <w:tcW w:type="dxa" w:w="3024"/>
-          </w:tcPr>
-          <w:p>
-            <w:r>
-              <w:t>renderização do protótipo</w:t>
-            </w:r>
-          </w:p>
-        </w:tc>
-      </w:tr>
-      <w:tr>
-        <w:tc>
-          <w:tcPr>
-            <w:tcW w:type="dxa" w:w="3024"/>
-          </w:tcPr>
-          <w:p>
-            <w:r>
-              <w:t>a11y.js</w:t>
-            </w:r>
-          </w:p>
-        </w:tc>
-        <w:tc>
-          <w:tcPr>
-            <w:tcW w:type="dxa" w:w="3024"/>
-          </w:tcPr>
-          <w:p>
-            <w:r>
-              <w:t>Acessibilidade</w:t>
-            </w:r>
-          </w:p>
-        </w:tc>
-        <w:tc>
-          <w:tcPr>
-            <w:tcW w:type="dxa" w:w="3024"/>
-          </w:tcPr>
-          <w:p>
-            <w:r>
-              <w:t>comportamentos auxiliares</w:t>
-            </w:r>
-          </w:p>
-        </w:tc>
-      </w:tr>
-    </w:tbl>
-    <w:p>
-      <w:pPr>
-        <w:pStyle w:val="Ttulo2"/>
-      </w:pPr>
-      <w:r>
-        <w:t>22.3 Endpoints do back-end simulado</w:t>
-      </w:r>
-    </w:p>
-    <w:tbl>
-      <w:tblPr>
-        <w:tblStyle w:val="Tabelacomgrade"/>
-        <w:tblW w:type="auto" w:w="0"/>
-        <w:jc w:val="center"/>
-        <w:tblLook w:firstColumn="1" w:firstRow="1" w:lastColumn="0" w:lastRow="0" w:noHBand="0" w:noVBand="1" w:val="04A0"/>
-      </w:tblPr>
-      <w:tblGrid>
-        <w:gridCol w:w="2268"/>
-        <w:gridCol w:w="2268"/>
-        <w:gridCol w:w="2268"/>
-        <w:gridCol w:w="2268"/>
-      </w:tblGrid>
-      <w:tr>
-        <w:tc>
-          <w:tcPr>
-            <w:tcW w:type="dxa" w:w="2268"/>
-          </w:tcPr>
-          <w:p>
-            <w:r>
-              <w:t>Método</w:t>
-            </w:r>
-          </w:p>
-        </w:tc>
-        <w:tc>
-          <w:tcPr>
-            <w:tcW w:type="dxa" w:w="2268"/>
-          </w:tcPr>
-          <w:p>
-            <w:r>
-              <w:t>Endpoint</w:t>
-            </w:r>
-          </w:p>
-        </w:tc>
-        <w:tc>
-          <w:tcPr>
-            <w:tcW w:type="dxa" w:w="2268"/>
-          </w:tcPr>
-          <w:p>
-            <w:r>
-              <w:t>Finalidade</w:t>
-            </w:r>
-          </w:p>
-        </w:tc>
-        <w:tc>
-          <w:tcPr>
-            <w:tcW w:type="dxa" w:w="2268"/>
-          </w:tcPr>
-          <w:p>
-            <w:r>
-              <w:t>Estado</w:t>
-            </w:r>
-          </w:p>
-        </w:tc>
-      </w:tr>
-      <w:tr>
-        <w:tc>
-          <w:tcPr>
-            <w:tcW w:type="dxa" w:w="2268"/>
-          </w:tcPr>
-          <w:p>
-            <w:r>
-              <w:t>POST</w:t>
-            </w:r>
-          </w:p>
-        </w:tc>
-        <w:tc>
-          <w:tcPr>
-            <w:tcW w:type="dxa" w:w="2268"/>
-          </w:tcPr>
-          <w:p>
-            <w:r>
-              <w:t>/api/cadastro</w:t>
-            </w:r>
-          </w:p>
-        </w:tc>
-        <w:tc>
-          <w:tcPr>
-            <w:tcW w:type="dxa" w:w="2268"/>
-          </w:tcPr>
-          <w:p>
-            <w:r>
-              <w:t>Cadastrar cliente</w:t>
-            </w:r>
-          </w:p>
-        </w:tc>
-        <w:tc>
-          <w:tcPr>
-            <w:tcW w:type="dxa" w:w="2268"/>
-          </w:tcPr>
-          <w:p>
-            <w:r>
-              <w:t>Simulado</w:t>
-            </w:r>
-          </w:p>
-        </w:tc>
-      </w:tr>
-      <w:tr>
-        <w:tc>
-          <w:tcPr>
-            <w:tcW w:type="dxa" w:w="2268"/>
-          </w:tcPr>
-          <w:p>
-            <w:r>
-              <w:t>GET</w:t>
-            </w:r>
-          </w:p>
-        </w:tc>
-        <w:tc>
-          <w:tcPr>
-            <w:tcW w:type="dxa" w:w="2268"/>
-          </w:tcPr>
-          <w:p>
-            <w:r>
-              <w:t>/api/cadastro/&lt;id&gt;</w:t>
-            </w:r>
-          </w:p>
-        </w:tc>
-        <w:tc>
-          <w:tcPr>
-            <w:tcW w:type="dxa" w:w="2268"/>
-          </w:tcPr>
-          <w:p>
-            <w:r>
-              <w:t>Consultar usuário</w:t>
-            </w:r>
-          </w:p>
-        </w:tc>
-        <w:tc>
-          <w:tcPr>
-            <w:tcW w:type="dxa" w:w="2268"/>
-          </w:tcPr>
-          <w:p>
-            <w:r>
-              <w:t>Simulado</w:t>
-            </w:r>
-          </w:p>
-        </w:tc>
-      </w:tr>
-      <w:tr>
-        <w:tc>
-          <w:tcPr>
-            <w:tcW w:type="dxa" w:w="2268"/>
-          </w:tcPr>
-          <w:p>
-            <w:r>
-              <w:t>POST</w:t>
-            </w:r>
-          </w:p>
-        </w:tc>
-        <w:tc>
-          <w:tcPr>
-            <w:tcW w:type="dxa" w:w="2268"/>
-          </w:tcPr>
-          <w:p>
-            <w:r>
-              <w:t>/api/login</w:t>
-            </w:r>
-          </w:p>
-        </w:tc>
-        <w:tc>
-          <w:tcPr>
-            <w:tcW w:type="dxa" w:w="2268"/>
-          </w:tcPr>
-          <w:p>
-            <w:r>
-              <w:t>Validar login</w:t>
-            </w:r>
-          </w:p>
-        </w:tc>
-        <w:tc>
-          <w:tcPr>
-            <w:tcW w:type="dxa" w:w="2268"/>
-          </w:tcPr>
-          <w:p>
-            <w:r>
-              <w:t>Simulado</w:t>
-            </w:r>
-          </w:p>
-        </w:tc>
-      </w:tr>
-      <w:tr>
-        <w:tc>
-          <w:tcPr>
-            <w:tcW w:type="dxa" w:w="2268"/>
-          </w:tcPr>
-          <w:p>
-            <w:r>
-              <w:t>GET</w:t>
-            </w:r>
-          </w:p>
-        </w:tc>
-        <w:tc>
-          <w:tcPr>
-            <w:tcW w:type="dxa" w:w="2268"/>
-          </w:tcPr>
-          <w:p>
-            <w:r>
-              <w:t>/api/bancadas</w:t>
-            </w:r>
-          </w:p>
-        </w:tc>
-        <w:tc>
-          <w:tcPr>
-            <w:tcW w:type="dxa" w:w="2268"/>
-          </w:tcPr>
-          <w:p>
-            <w:r>
-              <w:t>Listar Bancadas</w:t>
-            </w:r>
-          </w:p>
-        </w:tc>
-        <w:tc>
-          <w:tcPr>
-            <w:tcW w:type="dxa" w:w="2268"/>
-          </w:tcPr>
-          <w:p>
-            <w:r>
-              <w:t>Simulado</w:t>
-            </w:r>
-          </w:p>
-        </w:tc>
-      </w:tr>
-      <w:tr>
-        <w:tc>
-          <w:tcPr>
-            <w:tcW w:type="dxa" w:w="2268"/>
-          </w:tcPr>
-          <w:p>
-            <w:r>
-              <w:t>POST</w:t>
-            </w:r>
-          </w:p>
-        </w:tc>
-        <w:tc>
-          <w:tcPr>
-            <w:tcW w:type="dxa" w:w="2268"/>
-          </w:tcPr>
-          <w:p>
-            <w:r>
-              <w:t>/api/reservas</w:t>
-            </w:r>
-          </w:p>
-        </w:tc>
-        <w:tc>
-          <w:tcPr>
-            <w:tcW w:type="dxa" w:w="2268"/>
-          </w:tcPr>
-          <w:p>
-            <w:r>
-              <w:t>Criar Reserva</w:t>
-            </w:r>
-          </w:p>
-        </w:tc>
-        <w:tc>
-          <w:tcPr>
-            <w:tcW w:type="dxa" w:w="2268"/>
-          </w:tcPr>
-          <w:p>
-            <w:r>
-              <w:t>Simulado</w:t>
-            </w:r>
-          </w:p>
-        </w:tc>
-      </w:tr>
-      <w:tr>
-        <w:tc>
-          <w:tcPr>
-            <w:tcW w:type="dxa" w:w="2268"/>
-          </w:tcPr>
-          <w:p>
-            <w:r>
-              <w:t>GET</w:t>
-            </w:r>
-          </w:p>
-        </w:tc>
-        <w:tc>
-          <w:tcPr>
-            <w:tcW w:type="dxa" w:w="2268"/>
-          </w:tcPr>
-          <w:p>
-            <w:r>
-              <w:t>/api/reservas/&lt;id&gt;</w:t>
-            </w:r>
-          </w:p>
-        </w:tc>
-        <w:tc>
-          <w:tcPr>
-            <w:tcW w:type="dxa" w:w="2268"/>
-          </w:tcPr>
-          <w:p>
-            <w:r>
-              <w:t>Consultar Reserva</w:t>
-            </w:r>
-          </w:p>
-        </w:tc>
-        <w:tc>
-          <w:tcPr>
-            <w:tcW w:type="dxa" w:w="2268"/>
-          </w:tcPr>
-          <w:p>
-            <w:r>
-              <w:t>Simulado</w:t>
-            </w:r>
-          </w:p>
-        </w:tc>
-      </w:tr>
-      <w:tr>
-        <w:tc>
-          <w:tcPr>
-            <w:tcW w:type="dxa" w:w="2268"/>
-          </w:tcPr>
-          <w:p>
-            <w:r>
-              <w:t>GET</w:t>
-            </w:r>
-          </w:p>
-        </w:tc>
-        <w:tc>
-          <w:tcPr>
-            <w:tcW w:type="dxa" w:w="2268"/>
-          </w:tcPr>
-          <w:p>
-            <w:r>
-              <w:t>/api/cardapio</w:t>
-            </w:r>
-          </w:p>
-        </w:tc>
-        <w:tc>
-          <w:tcPr>
-            <w:tcW w:type="dxa" w:w="2268"/>
-          </w:tcPr>
-          <w:p>
-            <w:r>
-              <w:t>Listar Cardápio</w:t>
-            </w:r>
-          </w:p>
-        </w:tc>
-        <w:tc>
-          <w:tcPr>
-            <w:tcW w:type="dxa" w:w="2268"/>
-          </w:tcPr>
-          <w:p>
-            <w:r>
-              <w:t>Simulado</w:t>
-            </w:r>
-          </w:p>
-        </w:tc>
-      </w:tr>
-      <w:tr>
-        <w:tc>
-          <w:tcPr>
-            <w:tcW w:type="dxa" w:w="2268"/>
-          </w:tcPr>
-          <w:p>
-            <w:r>
-              <w:t>POST</w:t>
-            </w:r>
-          </w:p>
-        </w:tc>
-        <w:tc>
-          <w:tcPr>
-            <w:tcW w:type="dxa" w:w="2268"/>
-          </w:tcPr>
-          <w:p>
-            <w:r>
-              <w:t>/api/pedido/cadastro</w:t>
-            </w:r>
-          </w:p>
-        </w:tc>
-        <w:tc>
-          <w:tcPr>
-            <w:tcW w:type="dxa" w:w="2268"/>
-          </w:tcPr>
-          <w:p>
-            <w:r>
-              <w:t>Criar Pedido vinculado à Reserva</w:t>
-            </w:r>
-          </w:p>
-        </w:tc>
-        <w:tc>
-          <w:tcPr>
-            <w:tcW w:type="dxa" w:w="2268"/>
-          </w:tcPr>
-          <w:p>
-            <w:r>
-              <w:t>Simulado</w:t>
-            </w:r>
-          </w:p>
-        </w:tc>
-      </w:tr>
-      <w:tr>
-        <w:tc>
-          <w:tcPr>
-            <w:tcW w:type="dxa" w:w="2268"/>
-          </w:tcPr>
-          <w:p>
-            <w:r>
-              <w:t>GET</w:t>
-            </w:r>
-          </w:p>
-        </w:tc>
-        <w:tc>
-          <w:tcPr>
-            <w:tcW w:type="dxa" w:w="2268"/>
-          </w:tcPr>
-          <w:p>
-            <w:r>
-              <w:t>/api/pedido/&lt;id&gt;</w:t>
-            </w:r>
-          </w:p>
-        </w:tc>
-        <w:tc>
-          <w:tcPr>
-            <w:tcW w:type="dxa" w:w="2268"/>
-          </w:tcPr>
-          <w:p>
-            <w:r>
-              <w:t>Consultar Pedido</w:t>
-            </w:r>
-          </w:p>
-        </w:tc>
-        <w:tc>
-          <w:tcPr>
-            <w:tcW w:type="dxa" w:w="2268"/>
-          </w:tcPr>
-          <w:p>
-            <w:r>
-              <w:t>Simulado</w:t>
-            </w:r>
-          </w:p>
-        </w:tc>
-      </w:tr>
-      <w:tr>
-        <w:tc>
-          <w:tcPr>
-            <w:tcW w:type="dxa" w:w="2268"/>
-          </w:tcPr>
-          <w:p>
-            <w:r>
-              <w:t>GET</w:t>
-            </w:r>
-          </w:p>
-        </w:tc>
-        <w:tc>
-          <w:tcPr>
-            <w:tcW w:type="dxa" w:w="2268"/>
-          </w:tcPr>
-          <w:p>
-            <w:r>
-              <w:t>/api/kds/&lt;id&gt;</w:t>
-            </w:r>
-          </w:p>
-        </w:tc>
-        <w:tc>
-          <w:tcPr>
-            <w:tcW w:type="dxa" w:w="2268"/>
-          </w:tcPr>
-          <w:p>
-            <w:r>
-              <w:t>Gerar consulta para o KDS</w:t>
-            </w:r>
-          </w:p>
-        </w:tc>
-        <w:tc>
-          <w:tcPr>
-            <w:tcW w:type="dxa" w:w="2268"/>
-          </w:tcPr>
-          <w:p>
-            <w:r>
-              <w:t>Simulado</w:t>
-            </w:r>
-          </w:p>
-        </w:tc>
-      </w:tr>
-    </w:tbl>
-    <w:p>
-      <w:pPr>
-        <w:pStyle w:val="Ttulo2"/>
-      </w:pPr>
-      <w:r>
-        <w:t>22.4 Integração conceitual entre os sistemas</w:t>
-      </w:r>
-    </w:p>
-    <w:p>
-      <w:r>
-        <w:t>1. O Cliente seleciona uma Bancada e envia os dados da Reserva.</w:t>
-      </w:r>
-    </w:p>
-    <w:p>
-      <w:r>
-        <w:t>2. A Reserva cria o contexto que dará origem à Sessão.</w:t>
-      </w:r>
-    </w:p>
-    <w:p>
-      <w:r>
-        <w:t>3. A Sessão ativa permitirá acesso ao Cardápio e criação de Pedidos.</w:t>
-      </w:r>
-    </w:p>
-    <w:p>
-      <w:r>
-        <w:t>4. O JavaScript mantém o carrinho e apresenta os cálculos ao usuário.</w:t>
-      </w:r>
-    </w:p>
-    <w:p>
-      <w:r>
-        <w:t>5. No quarto bimestre, o navegador enviará apenas identificadores e quantidades; o Flask recalculará preços e persistirá Pedido e itens.</w:t>
-      </w:r>
-    </w:p>
-    <w:p>
-      <w:r>
-        <w:t>6. O KDS consumirá os Pedidos persistidos e enviará alterações de estado ao servidor.</w:t>
-      </w:r>
-    </w:p>
-    <w:p>
-      <w:pPr>
-        <w:pStyle w:val="Ttulo2"/>
-      </w:pPr>
-      <w:r>
-        <w:t>22.5 Limite da simulação e evolução para o quarto bimestre</w:t>
-      </w:r>
-    </w:p>
-    <w:p>
-      <w:r>
-        <w:t>A filosofia adotada nesta entrega é demonstrar os conceitos estudados com exemplos simples e coerentes com a arquitetura final. O front-end usa mocks e localStorage; o Flask usa controllers e models simulados. O objetivo não é antecipar o sistema completo, mas evitar código descartável: os mesmos conceitos de Reserva, Sessão, Cardápio, Pedido e KDS serão mantidos quando a persistência, Fetch/JSON, autenticação e regras completas forem implementados.</w:t>
-      </w:r>
-    </w:p>
-    <w:p>
-      <w:pPr>
-        <w:pStyle w:val="Ttulo2"/>
-      </w:pPr>
-      <w:r>
-        <w:t>22.6 Situação dos requisitos principais do terceiro bimestre</w:t>
-      </w:r>
-    </w:p>
-    <w:tbl>
-      <w:tblPr>
-        <w:tblStyle w:val="Tabelacomgrade"/>
-        <w:tblW w:type="auto" w:w="0"/>
-        <w:jc w:val="center"/>
-        <w:tblLook w:firstColumn="1" w:firstRow="1" w:lastColumn="0" w:lastRow="0" w:noHBand="0" w:noVBand="1" w:val="04A0"/>
-      </w:tblPr>
-      <w:tblGrid>
-        <w:gridCol w:w="3024"/>
-        <w:gridCol w:w="3024"/>
-        <w:gridCol w:w="3024"/>
-      </w:tblGrid>
-      <w:tr>
-        <w:tc>
-          <w:tcPr>
-            <w:tcW w:type="dxa" w:w="3024"/>
-          </w:tcPr>
-          <w:p>
-            <w:r>
-              <w:t>Requisito</w:t>
-            </w:r>
-          </w:p>
-        </w:tc>
-        <w:tc>
-          <w:tcPr>
-            <w:tcW w:type="dxa" w:w="3024"/>
-          </w:tcPr>
-          <w:p>
-            <w:r>
-              <w:t>Situação</w:t>
-            </w:r>
-          </w:p>
-        </w:tc>
-        <w:tc>
-          <w:tcPr>
-            <w:tcW w:type="dxa" w:w="3024"/>
-          </w:tcPr>
-          <w:p>
-            <w:r>
-              <w:t>Evidência atual</w:t>
-            </w:r>
-          </w:p>
-        </w:tc>
-      </w:tr>
-      <w:tr>
-        <w:tc>
-          <w:tcPr>
-            <w:tcW w:type="dxa" w:w="3024"/>
-          </w:tcPr>
-          <w:p>
-            <w:r>
-              <w:t>DER e dicionário de dados</w:t>
-            </w:r>
-          </w:p>
-        </w:tc>
-        <w:tc>
-          <w:tcPr>
-            <w:tcW w:type="dxa" w:w="3024"/>
-          </w:tcPr>
-          <w:p>
-            <w:r>
-              <w:t>Concluído</w:t>
-            </w:r>
-          </w:p>
-        </w:tc>
-        <w:tc>
-          <w:tcPr>
-            <w:tcW w:type="dxa" w:w="3024"/>
-          </w:tcPr>
-          <w:p>
-            <w:r>
-              <w:t>Arquivos e figuras já incorporados à documentação.</w:t>
-            </w:r>
-          </w:p>
-        </w:tc>
-      </w:tr>
-      <w:tr>
-        <w:tc>
-          <w:tcPr>
-            <w:tcW w:type="dxa" w:w="3024"/>
-          </w:tcPr>
-          <w:p>
-            <w:r>
-              <w:t>Protótipo navegável</w:t>
-            </w:r>
-          </w:p>
-        </w:tc>
-        <w:tc>
-          <w:tcPr>
-            <w:tcW w:type="dxa" w:w="3024"/>
-          </w:tcPr>
-          <w:p>
-            <w:r>
-              <w:t>Concluído</w:t>
-            </w:r>
-          </w:p>
-        </w:tc>
-        <w:tc>
-          <w:tcPr>
-            <w:tcW w:type="dxa" w:w="3024"/>
-          </w:tcPr>
-          <w:p>
-            <w:r>
-              <w:t>Páginas de Cliente, Cozinha e Administrador.</w:t>
-            </w:r>
-          </w:p>
-        </w:tc>
-      </w:tr>
-      <w:tr>
-        <w:tc>
-          <w:tcPr>
-            <w:tcW w:type="dxa" w:w="3024"/>
-          </w:tcPr>
-          <w:p>
-            <w:r>
-              <w:t>Cardápio Digital</w:t>
-            </w:r>
-          </w:p>
-        </w:tc>
-        <w:tc>
-          <w:tcPr>
-            <w:tcW w:type="dxa" w:w="3024"/>
-          </w:tcPr>
-          <w:p>
-            <w:r>
-              <w:t>Concluído como protótipo funcional</w:t>
-            </w:r>
-          </w:p>
-        </w:tc>
-        <w:tc>
-          <w:tcPr>
-            <w:tcW w:type="dxa" w:w="3024"/>
-          </w:tcPr>
-          <w:p>
-            <w:r>
-              <w:t>cliente_cardapio.html + catalog.js.</w:t>
-            </w:r>
-          </w:p>
-        </w:tc>
-      </w:tr>
-      <w:tr>
-        <w:tc>
-          <w:tcPr>
-            <w:tcW w:type="dxa" w:w="3024"/>
-          </w:tcPr>
-          <w:p>
-            <w:r>
-              <w:t>KDS</w:t>
-            </w:r>
-          </w:p>
-        </w:tc>
-        <w:tc>
-          <w:tcPr>
-            <w:tcW w:type="dxa" w:w="3024"/>
-          </w:tcPr>
-          <w:p>
-            <w:r>
-              <w:t>Concluído como protótipo visual</w:t>
-            </w:r>
-          </w:p>
-        </w:tc>
-        <w:tc>
-          <w:tcPr>
-            <w:tcW w:type="dxa" w:w="3024"/>
-          </w:tcPr>
-          <w:p>
-            <w:r>
-              <w:t>cozinha_kds.html + views.js.</w:t>
-            </w:r>
-          </w:p>
-        </w:tc>
-      </w:tr>
-      <w:tr>
-        <w:tc>
-          <w:tcPr>
-            <w:tcW w:type="dxa" w:w="3024"/>
-          </w:tcPr>
-          <w:p>
-            <w:r>
-              <w:t>Arrays e objetos</w:t>
-            </w:r>
-          </w:p>
-        </w:tc>
-        <w:tc>
-          <w:tcPr>
-            <w:tcW w:type="dxa" w:w="3024"/>
-          </w:tcPr>
-          <w:p>
-            <w:r>
-              <w:t>Concluído</w:t>
-            </w:r>
-          </w:p>
-        </w:tc>
-        <w:tc>
-          <w:tcPr>
-            <w:tcW w:type="dxa" w:w="3024"/>
-          </w:tcPr>
-          <w:p>
-            <w:r>
-              <w:t>data.js.</w:t>
-            </w:r>
-          </w:p>
-        </w:tc>
-      </w:tr>
-      <w:tr>
-        <w:tc>
-          <w:tcPr>
-            <w:tcW w:type="dxa" w:w="3024"/>
-          </w:tcPr>
-          <w:p>
-            <w:r>
-              <w:t>for...of / for...in / forEach</w:t>
-            </w:r>
-          </w:p>
-        </w:tc>
-        <w:tc>
-          <w:tcPr>
-            <w:tcW w:type="dxa" w:w="3024"/>
-          </w:tcPr>
-          <w:p>
-            <w:r>
-              <w:t>Concluído</w:t>
-            </w:r>
-          </w:p>
-        </w:tc>
-        <w:tc>
-          <w:tcPr>
-            <w:tcW w:type="dxa" w:w="3024"/>
-          </w:tcPr>
-          <w:p>
-            <w:r>
-              <w:t>components.js, data.js, catalog.js e cart.js.</w:t>
-            </w:r>
-          </w:p>
-        </w:tc>
-      </w:tr>
-      <w:tr>
-        <w:tc>
-          <w:tcPr>
-            <w:tcW w:type="dxa" w:w="3024"/>
-          </w:tcPr>
-          <w:p>
-            <w:r>
-              <w:t>DOM dinâmico</w:t>
-            </w:r>
-          </w:p>
-        </w:tc>
-        <w:tc>
-          <w:tcPr>
-            <w:tcW w:type="dxa" w:w="3024"/>
-          </w:tcPr>
-          <w:p>
-            <w:r>
-              <w:t>Concluído</w:t>
-            </w:r>
-          </w:p>
-        </w:tc>
-        <w:tc>
-          <w:tcPr>
-            <w:tcW w:type="dxa" w:w="3024"/>
-          </w:tcPr>
-          <w:p>
-            <w:r>
-              <w:t>catalog.js e scripts de interface.</w:t>
-            </w:r>
-          </w:p>
-        </w:tc>
-      </w:tr>
-      <w:tr>
-        <w:tc>
-          <w:tcPr>
-            <w:tcW w:type="dxa" w:w="3024"/>
-          </w:tcPr>
-          <w:p>
-            <w:r>
-              <w:t>Validação de formulários</w:t>
-            </w:r>
-          </w:p>
-        </w:tc>
-        <w:tc>
-          <w:tcPr>
-            <w:tcW w:type="dxa" w:w="3024"/>
-          </w:tcPr>
-          <w:p>
-            <w:r>
-              <w:t>Concluído em nível inicial</w:t>
-            </w:r>
-          </w:p>
-        </w:tc>
-        <w:tc>
-          <w:tcPr>
-            <w:tcW w:type="dxa" w:w="3024"/>
-          </w:tcPr>
-          <w:p>
-            <w:r>
-              <w:t>validation.js e login.js.</w:t>
-            </w:r>
-          </w:p>
-        </w:tc>
-      </w:tr>
-      <w:tr>
-        <w:tc>
-          <w:tcPr>
-            <w:tcW w:type="dxa" w:w="3024"/>
-          </w:tcPr>
-          <w:p>
-            <w:r>
-              <w:t>Cálculos em memória</w:t>
-            </w:r>
-          </w:p>
-        </w:tc>
-        <w:tc>
-          <w:tcPr>
-            <w:tcW w:type="dxa" w:w="3024"/>
-          </w:tcPr>
-          <w:p>
-            <w:r>
-              <w:t>Concluído</w:t>
-            </w:r>
-          </w:p>
-        </w:tc>
-        <w:tc>
-          <w:tcPr>
-            <w:tcW w:type="dxa" w:w="3024"/>
-          </w:tcPr>
-          <w:p>
-            <w:r>
-              <w:t>cart.js.</w:t>
-            </w:r>
-          </w:p>
-        </w:tc>
-      </w:tr>
-      <w:tr>
-        <w:tc>
-          <w:tcPr>
-            <w:tcW w:type="dxa" w:w="3024"/>
-          </w:tcPr>
-          <w:p>
-            <w:r>
-              <w:t>Estrutura Flask</w:t>
-            </w:r>
-          </w:p>
-        </w:tc>
-        <w:tc>
-          <w:tcPr>
-            <w:tcW w:type="dxa" w:w="3024"/>
-          </w:tcPr>
-          <w:p>
-            <w:r>
-              <w:t>Concluída em nível inicial</w:t>
-            </w:r>
-          </w:p>
-        </w:tc>
-        <w:tc>
-          <w:tcPr>
-            <w:tcW w:type="dxa" w:w="3024"/>
-          </w:tcPr>
-          <w:p>
-            <w:r>
-              <w:t>run.py, config.py e app.</w:t>
-            </w:r>
-          </w:p>
-        </w:tc>
-      </w:tr>
-      <w:tr>
-        <w:tc>
-          <w:tcPr>
-            <w:tcW w:type="dxa" w:w="3024"/>
-          </w:tcPr>
-          <w:p>
-            <w:r>
-              <w:t>Endpoints fundamentais</w:t>
-            </w:r>
-          </w:p>
-        </w:tc>
-        <w:tc>
-          <w:tcPr>
-            <w:tcW w:type="dxa" w:w="3024"/>
-          </w:tcPr>
-          <w:p>
-            <w:r>
-              <w:t>Concluídos como simulação</w:t>
-            </w:r>
-          </w:p>
-        </w:tc>
-        <w:tc>
-          <w:tcPr>
-            <w:tcW w:type="dxa" w:w="3024"/>
-          </w:tcPr>
-          <w:p>
-            <w:r>
-              <w:t>controllers Flask.</w:t>
-            </w:r>
-          </w:p>
-        </w:tc>
-      </w:tr>
-      <w:tr>
-        <w:tc>
-          <w:tcPr>
-            <w:tcW w:type="dxa" w:w="3024"/>
-          </w:tcPr>
-          <w:p>
-            <w:r>
-              <w:t>Fetch/JSON integrado</w:t>
-            </w:r>
-          </w:p>
-        </w:tc>
-        <w:tc>
-          <w:tcPr>
-            <w:tcW w:type="dxa" w:w="3024"/>
-          </w:tcPr>
-          <w:p>
-            <w:r>
-              <w:t>Próxima etapa</w:t>
-            </w:r>
-          </w:p>
-        </w:tc>
-        <w:tc>
-          <w:tcPr>
-            <w:tcW w:type="dxa" w:w="3024"/>
-          </w:tcPr>
-          <w:p>
-            <w:r>
-              <w:t>Previsto para o quarto bimestre.</w:t>
-            </w:r>
-          </w:p>
-        </w:tc>
-      </w:tr>
-    </w:tbl>
     <w:sectPr>
       <w:footerReference w:type="default" r:id="rId11"/>
       <w:pgSz w:w="11906" w:h="16838"/>

</xml_diff>

<commit_message>
feat: alinhar entrega do terceiro bimestre
</commit_message>
<xml_diff>
--- a/Documentação/Documentacao_Sabor_e_Clic_3_Bimestre_V3_Base_Revisada.docx
+++ b/Documentação/Documentacao_Sabor_e_Clic_3_Bimestre_V3_Base_Revisada.docx
@@ -352,11 +352,9 @@
     </w:p>
     <w:p>
       <w:r>
-        <w:t>Ao longo do terceiro bimestre, reunimos contribuições de Artes Visuais e Design, JavaScript, Python, Banco de Dados e Segurança. Nosso protótipo estático demonstra as principais telas e interações. A m</w:t>
-      </w:r>
-      <w:r>
-        <w:t>odelagem de dados descreve as entidades e os relacionamentos necessários para sustentar a aplicação. Também iniciamos a estrutura de back-end e definimos a arquitetura teórica das rotas que completarão a integração.</w:t>
-      </w:r>
+        <w:t>Ao longo do terceiro bimestre, reunimos contribuições de Artes Visuais e Design, JavaScript, Python, Banco de Dados e Segurança. Nosso protótipo estático demonstra as principais telas e interações. A modelagem de dados descreve as entidades e os relacionamentos necessários para sustentar a aplicação. Também implementamos uma API Flask executável com dados simulados em memória e rotas JSON para o fluxo principal.</w:t>
+      </w:r>
+      <w:r/>
     </w:p>
     <w:p>
       <w:r>
@@ -460,11 +458,9 @@
     </w:p>
     <w:p>
       <w:r>
-        <w:t xml:space="preserve">Nesta etapa concluímos o protótipo estático e a documentação conceitual de dados. Iniciamos o back-end, mas a aplicação Flask integrada ao banco ainda faz </w:t>
-      </w:r>
-      <w:r>
-        <w:t>parte da evolução do projeto. Por esse motivo, quando descrevemos uma rota completa ou uma regra transacional, apresentamos a arquitetura que definimos para a implementação, distinguindo-a das interações que já funcionam localmente no protótipo.</w:t>
-      </w:r>
+        <w:t>Nesta etapa concluímos o protótipo estático, a documentação conceitual de dados e uma API Flask executável com dados mantidos em memória. O front-end ainda não utiliza Fetch e não está integrado à API. Banco físico, autenticação real, cookies de login, RBAC no servidor, POO completa em JavaScript e persistência transacional permanecem para o quarto bimestre.</w:t>
+      </w:r>
+      <w:r/>
     </w:p>
     <w:p>
       <w:r>
@@ -485,11 +481,9 @@
     </w:p>
     <w:p>
       <w:r>
-        <w:t>Nós organizamos o projeto como um sistema interdisciplinar. Design define como o usuário compreende estados e ações; JavaScript transforma a interface em uma experiência dinâmica; Flask centraliza regras e comu</w:t>
-      </w:r>
-      <w:r>
-        <w:t>nicação; Banco de Dados garante persistência e relacionamentos; Segurança controla identidade, permissão e validação. Nenhuma dessas partes resolve isoladamente o problema: a qualidade do fluxo depende da concordância entre todas elas.</w:t>
-      </w:r>
+        <w:t>Nós organizamos o projeto como um sistema interdisciplinar. Design define como o usuário compreende estados e ações; JavaScript transforma a interface em uma experiência dinâmica; Flask expõe contratos JSON e aplica as validações desta etapa; Banco de Dados descreve a persistência futura por meio dos modelos conceituais; e Segurança define identidade, permissão e regras de entrada. A qualidade do fluxo depende da concordância entre essas partes.</w:t>
+      </w:r>
+      <w:r/>
     </w:p>
     <w:tbl>
       <w:tblPr>
@@ -710,7 +704,7 @@
               <w:rPr>
                 <w:sz w:val="18"/>
               </w:rPr>
-              <w:t>Estrutura Flask inicial com controllers e endpoints simulados para autenticação, Reservas, Cardápio, Pedidos e KDS.</w:t>
+              <w:t>Factory Flask, Blueprints, Routes, Controllers, Models em memória e endpoints JSON para Reservas, Sessões, Cardápio, Pedidos e KDS.</w:t>
             </w:r>
           </w:p>
         </w:tc>
@@ -724,7 +718,7 @@
               <w:rPr>
                 <w:sz w:val="18"/>
               </w:rPr>
-              <w:t>MVC completo, services, persistência, autenticação/RBAC e integração com o banco.</w:t>
+              <w:t>Persistência relacional, autenticação/RBAC, integração Fetch e services adicionais quando necessários.</w:t>
             </w:r>
           </w:p>
         </w:tc>
@@ -851,7 +845,7 @@
               <w:rPr>
                 <w:sz w:val="18"/>
               </w:rPr>
-              <w:t>Autenticação, sessão, RBAC no servidor e sanitização.</w:t>
+              <w:t>Autenticação, cookies de login, RBAC no servidor e sanitização.</w:t>
             </w:r>
           </w:p>
         </w:tc>
@@ -1689,14 +1683,10 @@
     </w:p>
     <w:p>
       <w:r>
-        <w:t>A condição abstrata</w:t>
-      </w:r>
-      <w:r>
-        <w:t xml:space="preserve"> de conflito é: há sobreposição quando o início solicitado ocorre antes do fim existente e o fim solicitado ocorre depois do início existente. Essa regra deve ser executada no servidor imediatamente antes da gravação. A tela pode antecipar a disponibilidad</w:t>
-      </w:r>
-      <w:r>
-        <w:t>e, mas somente o back-end pode confirmar, pois outra pessoa pode reservar o mesmo intervalo enquanto o primeiro Cliente ainda preenche o formulário.</w:t>
-      </w:r>
+        <w:t>Há sobreposição quando o início solicitado ocorre antes do fim existente e o fim solicitado ocorre depois do início existente. A API em memória já executa essa verificação antes de criar a Reserva. No quarto bimestre, a mesma regra deverá ocorrer dentro da transação do banco para evitar conflitos entre solicitações simultâneas.</w:t>
+      </w:r>
+      <w:r/>
+      <w:r/>
     </w:p>
     <w:p>
       <w:pPr>
@@ -1708,14 +1698,10 @@
     </w:p>
     <w:p>
       <w:r>
-        <w:t>Em Design, criamos cartões de Bancada, etiquetas de disponibilidade, fi</w:t>
-      </w:r>
-      <w:r>
-        <w:t xml:space="preserve">ltros e formulário de Reserva. Em JavaScript, utilizamos o array benches e templates para renderizar capacidade, recursos, preço e estado. Em Banco de Dados, relacionamos CLIENTE e BANCADA à RESERVA. Em Flask, definimos a necessidade de rotas de consulta, </w:t>
-      </w:r>
-      <w:r>
-        <w:t>criação, alteração e cancelamento. Em Segurança, estabelecemos que o Cliente só pode manipular suas próprias Reservas, enquanto o Administrador possui acesso operacional mais amplo.</w:t>
-      </w:r>
+        <w:t>Em Design, criamos cartões de Bancada, etiquetas de disponibilidade, filtros e formulário de Reserva. Em JavaScript, utilizamos o array benches e templates para renderizar capacidade, recursos, preço e estado. Em Banco de Dados, relacionamos CLIENTE e BANCADA à RESERVA. Em Flask, implementamos consulta de Bancadas, criação e consulta de Reservas com validações em memória. Autorização por proprietário e perfil permanece planejada para o quarto bimestre.</w:t>
+      </w:r>
+      <w:r/>
+      <w:r/>
     </w:p>
     <w:p>
       <w:pPr>
@@ -1777,11 +1763,9 @@
     </w:p>
     <w:p>
       <w:r>
-        <w:t>No protótipo, os dados permanecem em memória e os botões simulam confirmação. Na aplicação final, o JavaScript enviará os</w:t>
-      </w:r>
-      <w:r>
-        <w:t xml:space="preserve"> campos em JSON, exibirá estado de carregamento e tratará respostas 201, 400 ou 409 sem recarregar a página.</w:t>
-      </w:r>
+        <w:t>No navegador, os dados permanecem em memória e os botões simulam confirmação. Separadamente, a API Flask já recebe JSON, valida capacidade, datas e conflitos, e devolve respostas JSON com códigos 201, 400, 404 ou 409. A ligação dessas duas partes por Fetch fica para o quarto bimestre.</w:t>
+      </w:r>
+      <w:r/>
     </w:p>
     <w:p>
       <w:r>
@@ -1799,30 +1783,22 @@
     </w:p>
     <w:p>
       <w:r>
-        <w:t>Nós adotamos Sessão como entidade central do atendimento. Uma Reserva descreve o período contratado; a Sessão registra o uso efetivo e r</w:t>
-      </w:r>
-      <w:r>
-        <w:t>eúne os Pedidos daquele período. Cada Reserva deve gerar exatamente uma Sessão, protegida por uma relação um para um. A Sessão possui código de acesso, estado e datas de criação, início e encerramento.</w:t>
-      </w:r>
+        <w:t>Nós adotamos Sessão como entidade central do atendimento. Uma Reserva descreve o período contratado; a Sessão registra o uso efetivo e reúne os Pedidos daquele período. O model em memória garante uma Sessão por Reserva e registra identificador, código de acesso, estado e datas de criação, início e encerramento.</w:t>
+      </w:r>
+      <w:r/>
     </w:p>
     <w:p>
       <w:r>
-        <w:t>Uma Sessão pode estar criada, ativa ou encerrada. Some</w:t>
-      </w:r>
-      <w:r>
-        <w:t>nte ativa aceita Pedidos. A ativação registra o início real; o encerramento invalida o código de acesso e bloqueia novas solicitações. Essa verificação precisa acontecer no Flask a cada Pedido, pois não podemos confiar apenas no botão da interface.</w:t>
-      </w:r>
+        <w:t>Nesta implementação, a Sessão é criada como ativa e pode ser encerrada por endpoint próprio. Somente uma Sessão ativa aceita Pedidos, e o Flask verifica esse estado em cada criação. Autorização por usuário e validade temporal serão acrescentadas com a autenticação real.</w:t>
+      </w:r>
+      <w:r/>
     </w:p>
     <w:p>
       <w:r>
-        <w:t>Na tela</w:t>
-      </w:r>
-      <w:r>
-        <w:t xml:space="preserve"> que desenvolvemos, mostramos tempo restante, quantidade de Pedidos, consumo, pessoas, Pedidos vinculados e ações de navegação. Em JavaScript, essa tela é uma função do objeto views. No banco, SESSAO recebe uma referência única à RESERVA e origina vários P</w:t>
-      </w:r>
-      <w:r>
-        <w:t>EDIDOS. Em Segurança, o acesso deve ser limitado ao Cliente responsável, à operação autorizada e ao Administrador.</w:t>
-      </w:r>
+        <w:t>Na tela que desenvolvemos, mostramos tempo restante, quantidade de Pedidos, consumo, pessoas, Pedidos vinculados e ações de navegação. Em JavaScript, essa tela é uma função do objeto views. No backend, SESSAO referencia uma RESERVA e origina vários PEDIDOS por id_sessao. No banco futuro, essa relação será protegida por chaves e unicidade.</w:t>
+      </w:r>
+      <w:r/>
+      <w:r/>
     </w:p>
     <w:p>
       <w:r>
@@ -1840,11 +1816,9 @@
     </w:p>
     <w:p>
       <w:r>
-        <w:t>Nosso Cardápio Digital apresenta foto, nome, descrição, categoria, preço e disponibilidade. Criamos oito produtos dem</w:t>
-      </w:r>
-      <w:r>
-        <w:t>onstrativos e organizamos a experiência em Entradas, Pratos, Bebidas e Sobremesas. Quando um item está indisponível, desabilitamos seu botão de adição. Essa regra visual ajuda o usuário, mas o servidor deverá revalidá-la na confirmação.</w:t>
-      </w:r>
+        <w:t>Nosso Cardápio Digital apresenta foto, nome, descrição, categoria, preço e disponibilidade. Criamos oito produtos demonstrativos e organizamos a experiência em Entradas, Pratos, Bebidas e Sobremesas. A interface desabilita itens indisponíveis e a API repete essa validação ao criar um Pedido, usando o catálogo mantido em memória.</w:t>
+      </w:r>
+      <w:r/>
     </w:p>
     <w:p>
       <w:pPr>
@@ -1976,11 +1950,9 @@
     </w:p>
     <w:p>
       <w:r>
-        <w:t>Na integração, o navegador enviará identificadores e quantidades, mas não será responsável pelo valor final. O Flask consultará os preços atuais, validará cada Prato e calculará os subtotais. Isso evita que um preço alterado no console</w:t>
-      </w:r>
-      <w:r>
-        <w:t xml:space="preserve"> do navegador seja aceito como verdadeiro.</w:t>
-      </w:r>
+        <w:t>A API recebe apenas identificadores e quantidades, consulta os preços atuais do catálogo em memória, valida cada Prato e calcula os subtotais e o total. O front-end ainda não envia esses dados por Fetch; essa integração permanece para o quarto bimestre.</w:t>
+      </w:r>
+      <w:r/>
     </w:p>
     <w:p>
       <w:r>
@@ -2006,11 +1978,9 @@
     </w:p>
     <w:p>
       <w:r>
-        <w:t>Ao confirmar, o servidor deverá verificar autenticação, propriedade da Sessão, estado ativo, lista não vazia, quan</w:t>
-      </w:r>
-      <w:r>
-        <w:t>tidades positivas e Pratos disponíveis. Em seguida, buscará os preços, calculará subtotais, gravará Pedido e itens na mesma transação e devolverá JSON. Se qualquer etapa falhar, a transação inteira deve ser desfeita.</w:t>
-      </w:r>
+        <w:t>Ao confirmar um Pedido nesta etapa, o servidor verifica a existência e o estado ativo da Sessão, a lista não vazia, as quantidades positivas e a disponibilidade dos Pratos. Em seguida, busca os preços, calcula subtotais e devolve JSON. Autenticação, propriedade da Sessão e transação em banco serão implementadas no quarto bimestre.</w:t>
+      </w:r>
+      <w:r/>
     </w:p>
     <w:tbl>
       <w:tblPr>
@@ -2419,16 +2389,14 @@
     </w:p>
     <w:p>
       <w:r>
-        <w:t>No protótipo, os tickets continuam sendo exemplos visuais, mas o back-end simulado já define uma consulta específica para o KDS. Nesta primeira entrega, a interface demonstra a fila e os estados sem sincronização real. No quarto bimestre, o KDS passará a consumir Pedidos persistidos pela API e enviará alterações de estado ao Flask, que validará as transições antes de atualizar o banco.</w:t>
+        <w:t>No protótipo, os tickets continuam sendo exemplos visuais. A API Flask já oferece consultas JSON para a fila do KDS e inclui o contexto de Sessão, Reserva e Bancada de cada Pedido. A interface ainda não consome essa fila. No quarto bimestre, o KDS usará Fetch e as mudanças de estado serão persistidas e validadas pelo servidor.</w:t>
       </w:r>
     </w:p>
     <w:p>
       <w:r>
-        <w:t>Design contribui com hierarquia, cores e leitura rápida. JavaScript controla renderização e atualização sem</w:t>
-      </w:r>
-      <w:r>
-        <w:t xml:space="preserve"> F5. Flask organiza fila e transições. Banco registra estado e horários. Segurança limita as ações a Cozinheiro e Administrador. Assim, o KDS reúne todas as disciplinas em uma única função operacional.</w:t>
-      </w:r>
+        <w:t>Design contribui com hierarquia, cores e leitura rápida. JavaScript controla a renderização demonstrativa sem F5. Flask monta a fila em memória a partir dos Pedidos e de seus vínculos. Banco registrará estados e horários no quarto bimestre, e Segurança limitará as ações a Cozinheiro e Administrador quando a autenticação real for implementada.</w:t>
+      </w:r>
+      <w:r/>
     </w:p>
     <w:p>
       <w:r>
@@ -2482,11 +2450,9 @@
     </w:p>
     <w:p>
       <w:r>
-        <w:t xml:space="preserve">Nós definimos uma arquitetura em camadas. O navegador contém HTML, CSS e JavaScript; a comunicação utiliza HTTP e JSON; o Flask recebe requisições, autentica, valida e executa regras; a camada de dados persiste entidades relacionais. O banco nunca deve </w:t>
-      </w:r>
-      <w:r>
-        <w:t>ser acessado diretamente pelo navegador.</w:t>
-      </w:r>
+        <w:t>Nós definimos uma arquitetura em camadas. O navegador contém HTML, CSS e JavaScript; a API utiliza HTTP e JSON; as Routes Flask interpretam as requisições; os Controllers validam e executam os casos de uso; e os Models mantêm os dados demonstrativos em memória. O banco relacional será conectado apenas pelo back-end no quarto bimestre.</w:t>
+      </w:r>
+      <w:r/>
     </w:p>
     <w:tbl>
       <w:tblPr>
@@ -2651,7 +2617,7 @@
               <w:rPr>
                 <w:sz w:val="18"/>
               </w:rPr>
-              <w:t>Gerenciar estado visual e chamar API.</w:t>
+              <w:t>Gerenciar o estado visual; futuramente chamar a API.</w:t>
             </w:r>
           </w:p>
         </w:tc>
@@ -2711,7 +2677,7 @@
               <w:rPr>
                 <w:sz w:val="18"/>
               </w:rPr>
-              <w:t>Interpretar HTTP, parâmetros e códigos de resposta.</w:t>
+              <w:t>Interpretar HTTP, JSON e códigos de resposta.</w:t>
             </w:r>
           </w:p>
         </w:tc>
@@ -2753,7 +2719,7 @@
               <w:rPr>
                 <w:sz w:val="18"/>
               </w:rPr>
-              <w:t>Controllers e services</w:t>
+              <w:t>Controllers</w:t>
             </w:r>
           </w:p>
         </w:tc>
@@ -2772,7 +2738,7 @@
               <w:rPr>
                 <w:sz w:val="18"/>
               </w:rPr>
-              <w:t>Executar caso de uso e regras.</w:t>
+              <w:t>Validar e executar casos de uso.</w:t>
             </w:r>
           </w:p>
         </w:tc>
@@ -2814,7 +2780,7 @@
               <w:rPr>
                 <w:sz w:val="18"/>
               </w:rPr>
-              <w:t>Models e repositórios</w:t>
+              <w:t>Models em memória</w:t>
             </w:r>
           </w:p>
         </w:tc>
@@ -2832,7 +2798,7 @@
               <w:rPr>
                 <w:sz w:val="18"/>
               </w:rPr>
-              <w:t>Representar e consultar dados.</w:t>
+              <w:t>Representar e consultar dados demonstrativos.</w:t>
             </w:r>
           </w:p>
         </w:tc>
@@ -2874,13 +2840,12 @@
               <w:rPr>
                 <w:sz w:val="18"/>
               </w:rPr>
-              <w:t xml:space="preserve">Banco </w:t>
-            </w:r>
-            <w:r>
-              <w:rPr>
-                <w:sz w:val="18"/>
-              </w:rPr>
-              <w:t>relacional</w:t>
+              <w:t>Banco relacional futuro</w:t>
+            </w:r>
+            <w:r>
+              <w:rPr>
+                <w:sz w:val="18"/>
+              </w:rPr>
             </w:r>
           </w:p>
         </w:tc>
@@ -2899,7 +2864,7 @@
               <w:rPr>
                 <w:sz w:val="18"/>
               </w:rPr>
-              <w:t>Garantir persistência e integridade.</w:t>
+              <w:t>Garantir persistência e integridade no quarto bimestre.</w:t>
             </w:r>
           </w:p>
         </w:tc>
@@ -2927,7 +2892,7 @@
     <w:p/>
     <w:p>
       <w:r>
-        <w:t>O repositório já separa parte das responsabilidades do front-end em arquivos JavaScript específicos e possui uma estrutura Flask inicial. No navegador, dados simulados sustentam as telas e os fluxos. No servidor, controllers exemplificam contratos HTTP sem persistência definitiva. A direção arquitetural continua sendo uma aplicação em camadas, na qual o front-end comunica-se apenas com Flask e o banco permanece acessível somente pelo back-end.</w:t>
+        <w:t>O repositório separa o front-end em módulos JavaScript e o back-end em Routes, Controllers e Models. No navegador, dados simulados sustentam as telas e os fluxos. No servidor, Blueprints expõem endpoints reais e os Controllers aplicam regras sobre Models em memória. As duas partes ainda funcionam separadamente; a integração por Fetch e a persistência ficam para a próxima etapa.</w:t>
       </w:r>
     </w:p>
     <w:p>
@@ -2946,7 +2911,7 @@
     </w:p>
     <w:p>
       <w:r>
-        <w:t>O JavaScript atual foi dividido por responsabilidade para evitar um arquivo monolítico e tornar explícitos os conteúdos do terceiro bimestre. data.js concentra arrays, objetos literais e estado compartilhado; site.js reúne navegação, localStorage e helpers; components.js gera componentes visuais; catalog.js manipula dinamicamente o DOM do Cardápio; cart.js mantém o carrinho e calcula valores; validation.js valida Reservas; login.js trata o login demonstrativo; views.js registra as telas; e a11y.js concentra comportamentos de acessibilidade. A navegação ocorre entre páginas HTML separadas, caracterizando uma MPA.</w:t>
+        <w:t>O JavaScript atual foi dividido por responsabilidade para evitar um arquivo monolítico e tornar explícitos os conteúdos do terceiro bimestre. data.js concentra arrays, objetos literais e estado compartilhado; site.js reúne navegação, localStorage e helpers; components.js contém os geradores visuais; catalog.js manipula o DOM do Cardápio; cart.js mantém o carrinho e calcula valores; validation.js valida Reservas; login.js trata o login demonstrativo; views.js registra somente as telas; e a11y.js concentra comportamentos de acessibilidade.</w:t>
       </w:r>
     </w:p>
     <w:p>
@@ -3020,7 +2985,7 @@
     </w:p>
     <w:p>
       <w:r>
-        <w:t>O back-end do terceiro bimestre é propositalmente simulado. Ele já possui ponto de inicialização, configuração da aplicação e controllers para autenticação, Reservas e Pedidos. Esses arquivos demonstram endpoints fundamentais e separação de responsabilidades, enquanto os models permanecem simples e sem persistência definitiva. A finalidade desta etapa é validar os contratos das operações antes da implementação completa do MVC, do banco e da integração com o front-end.</w:t>
+        <w:t>O back-end do terceiro bimestre é uma aplicação Flask executável. A factory usa Flask(__name__), carrega a configuração e registra Blueprints. As Routes usam request.get_json() e jsonify; os Controllers validam os casos de uso; e os Models mantêm usuários, Bancadas, Reservas, Sessões, Pratos e Pedidos em memória. Não há banco físico, autenticação real ou integração Fetch nesta etapa.</w:t>
       </w:r>
     </w:p>
     <w:tbl>
@@ -3105,7 +3070,7 @@
               <w:rPr>
                 <w:sz w:val="18"/>
               </w:rPr>
-              <w:t>POST /api/cadastro</w:t>
+              <w:t>GET /api</w:t>
             </w:r>
           </w:p>
         </w:tc>
@@ -3119,7 +3084,7 @@
               <w:rPr>
                 <w:sz w:val="18"/>
               </w:rPr>
-              <w:t>Cliente</w:t>
+              <w:t>Todos</w:t>
             </w:r>
           </w:p>
         </w:tc>
@@ -3133,7 +3098,7 @@
               <w:rPr>
                 <w:sz w:val="18"/>
               </w:rPr>
-              <w:t>Cadastro simulado.</w:t>
+              <w:t>Confirma que a API está em execução.</w:t>
             </w:r>
           </w:p>
         </w:tc>
@@ -3152,9 +3117,9 @@
           <w:p>
             <w:r>
               <w:rPr>
-                <w:sz w:val="18"/>
-              </w:rPr>
-              <w:t>POST /api/login</w:t>
+                <w:sz w:val="16"/>
+              </w:rPr>
+              <w:t>POST/GET /api/cadastro</w:t>
             </w:r>
           </w:p>
         </w:tc>
@@ -3167,9 +3132,9 @@
           <w:p>
             <w:r>
               <w:rPr>
-                <w:sz w:val="18"/>
-              </w:rPr>
-              <w:t>Todos</w:t>
+                <w:sz w:val="16"/>
+              </w:rPr>
+              <w:t>Cliente</w:t>
             </w:r>
           </w:p>
         </w:tc>
@@ -3182,9 +3147,9 @@
           <w:p>
             <w:r>
               <w:rPr>
-                <w:sz w:val="18"/>
-              </w:rPr>
-              <w:t>Login simulado por perfil.</w:t>
+                <w:sz w:val="16"/>
+              </w:rPr>
+              <w:t>Cria e consulta cadastro demonstrativo.</w:t>
             </w:r>
           </w:p>
         </w:tc>
@@ -3204,7 +3169,7 @@
               <w:rPr>
                 <w:sz w:val="18"/>
               </w:rPr>
-              <w:t>GET /api/bancadas</w:t>
+              <w:t>POST /api/login</w:t>
             </w:r>
           </w:p>
         </w:tc>
@@ -3218,7 +3183,7 @@
               <w:rPr>
                 <w:sz w:val="18"/>
               </w:rPr>
-              <w:t>Cliente/Admin</w:t>
+              <w:t>Todos</w:t>
             </w:r>
           </w:p>
         </w:tc>
@@ -3232,7 +3197,7 @@
               <w:rPr>
                 <w:sz w:val="18"/>
               </w:rPr>
-              <w:t>Lista Bancadas simuladas.</w:t>
+              <w:t>Identifica perfil sem autenticação real.</w:t>
             </w:r>
           </w:p>
         </w:tc>
@@ -3253,7 +3218,7 @@
               <w:rPr>
                 <w:sz w:val="18"/>
               </w:rPr>
-              <w:t>POST /api/reservas</w:t>
+              <w:t>GET /api/bancadas</w:t>
             </w:r>
           </w:p>
         </w:tc>
@@ -3283,7 +3248,7 @@
               <w:rPr>
                 <w:sz w:val="18"/>
               </w:rPr>
-              <w:t>Cria Reserva simulada.</w:t>
+              <w:t>Lista Bancadas em memória.</w:t>
             </w:r>
           </w:p>
         </w:tc>
@@ -3303,7 +3268,7 @@
               <w:rPr>
                 <w:sz w:val="18"/>
               </w:rPr>
-              <w:t>GET /api/reservas/{id}</w:t>
+              <w:t>POST/GET /api/reservas[/&lt;id&gt;]</w:t>
             </w:r>
           </w:p>
         </w:tc>
@@ -3331,7 +3296,7 @@
               <w:rPr>
                 <w:sz w:val="18"/>
               </w:rPr>
-              <w:t>Consulta Reserva por ID.</w:t>
+              <w:t>Cria e consulta Reservas em memória.</w:t>
             </w:r>
           </w:p>
         </w:tc>
@@ -3352,7 +3317,7 @@
               <w:rPr>
                 <w:sz w:val="18"/>
               </w:rPr>
-              <w:t>GET /api/cardapio</w:t>
+              <w:t>POST/GET /api/sessoes[/&lt;id&gt;]</w:t>
             </w:r>
           </w:p>
         </w:tc>
@@ -3367,7 +3332,7 @@
               <w:rPr>
                 <w:sz w:val="18"/>
               </w:rPr>
-              <w:t>Cliente</w:t>
+              <w:t>Cliente/Admin</w:t>
             </w:r>
           </w:p>
         </w:tc>
@@ -3382,7 +3347,7 @@
               <w:rPr>
                 <w:sz w:val="18"/>
               </w:rPr>
-              <w:t>Retorna Cardápio simulado.</w:t>
+              <w:t>Cria e consulta Sessões em memória.</w:t>
             </w:r>
           </w:p>
         </w:tc>
@@ -3402,7 +3367,7 @@
               <w:rPr>
                 <w:sz w:val="18"/>
               </w:rPr>
-              <w:t>POST /api/pedido/cadastro</w:t>
+              <w:t>POST /api/sessoes/&lt;id&gt;/encerrar</w:t>
             </w:r>
           </w:p>
         </w:tc>
@@ -3416,7 +3381,7 @@
               <w:rPr>
                 <w:sz w:val="18"/>
               </w:rPr>
-              <w:t>Cliente</w:t>
+              <w:t>Cliente/Admin</w:t>
             </w:r>
           </w:p>
         </w:tc>
@@ -3430,7 +3395,7 @@
               <w:rPr>
                 <w:sz w:val="18"/>
               </w:rPr>
-              <w:t>Cria Pedido simulado.</w:t>
+              <w:t>Encerra Sessão e bloqueia novos Pedidos.</w:t>
             </w:r>
           </w:p>
         </w:tc>
@@ -3451,7 +3416,7 @@
               <w:rPr>
                 <w:sz w:val="18"/>
               </w:rPr>
-              <w:t>GET /api/pedido/{id}</w:t>
+              <w:t>GET /api/cardapio</w:t>
             </w:r>
           </w:p>
         </w:tc>
@@ -3466,7 +3431,7 @@
               <w:rPr>
                 <w:sz w:val="18"/>
               </w:rPr>
-              <w:t>Cliente/Admin</w:t>
+              <w:t>Cliente</w:t>
             </w:r>
           </w:p>
         </w:tc>
@@ -3481,7 +3446,7 @@
               <w:rPr>
                 <w:sz w:val="18"/>
               </w:rPr>
-              <w:t>Consulta Pedido por ID.</w:t>
+              <w:t>Retorna o Cardápio em memória.</w:t>
             </w:r>
           </w:p>
         </w:tc>
@@ -3501,7 +3466,7 @@
               <w:rPr>
                 <w:sz w:val="18"/>
               </w:rPr>
-              <w:t>GET /api/kds/{id}</w:t>
+              <w:t>POST/GET /api/pedido[/cadastro|/&lt;id&gt;]</w:t>
             </w:r>
           </w:p>
         </w:tc>
@@ -3515,6 +3480,54 @@
               <w:rPr>
                 <w:sz w:val="18"/>
               </w:rPr>
+              <w:t>Cliente</w:t>
+            </w:r>
+          </w:p>
+        </w:tc>
+        <w:tc>
+          <w:tcPr>
+            <w:tcW w:w="3024" w:type="dxa"/>
+            <w:vAlign w:val="center"/>
+          </w:tcPr>
+          <w:p>
+            <w:r>
+              <w:rPr>
+                <w:sz w:val="18"/>
+              </w:rPr>
+              <w:t>Cria por id_sessao e consulta Pedidos.</w:t>
+            </w:r>
+          </w:p>
+        </w:tc>
+      </w:tr>
+      <w:tr>
+        <w:trPr>
+          <w:jc w:val="center"/>
+          <w:cantSplit/>
+        </w:trPr>
+        <w:tc>
+          <w:tcPr>
+            <w:tcW w:w="3024" w:type="dxa"/>
+            <w:vAlign w:val="center"/>
+          </w:tcPr>
+          <w:p>
+            <w:r>
+              <w:rPr>
+                <w:sz w:val="18"/>
+              </w:rPr>
+              <w:t>GET /api/kds[/&lt;id&gt;]</w:t>
+            </w:r>
+          </w:p>
+        </w:tc>
+        <w:tc>
+          <w:tcPr>
+            <w:tcW w:w="3024" w:type="dxa"/>
+            <w:vAlign w:val="center"/>
+          </w:tcPr>
+          <w:p>
+            <w:r>
+              <w:rPr>
+                <w:sz w:val="18"/>
+              </w:rPr>
               <w:t>Cozinheiro/Admin</w:t>
             </w:r>
           </w:p>
@@ -3529,7 +3542,7 @@
               <w:rPr>
                 <w:sz w:val="18"/>
               </w:rPr>
-              <w:t>Retorna Pedido para o KDS.</w:t>
+              <w:t>Lista a fila ou retorna um Pedido com Bancada.</w:t>
             </w:r>
           </w:p>
         </w:tc>
@@ -3541,7 +3554,7 @@
         <w:pStyle w:val="Ttulo2"/>
       </w:pPr>
       <w:r>
-        <w:t>14.1 Exemplo atual de rota simulada</w:t>
+        <w:t>14.1 Exemplo atual de rota Flask</w:t>
       </w:r>
     </w:p>
     <w:p>
@@ -3555,17 +3568,15 @@
           <w:rFonts w:ascii="Courier New" w:hAnsi="Courier New"/>
           <w:sz w:val="18"/>
         </w:rPr>
-        <w:t># POST /api/reservas - exemplo simplificado</w:t>
+        <w:t>@reserva_bp.post("/reservas")</w:t>
         <w:br/>
-        <w:t>def post_reserva(dados):</w:t>
+        <w:t>def reservas():</w:t>
         <w:br/>
-        <w:t xml:space="preserve">    cliente = dados["cliente"]</w:t>
+        <w:t xml:space="preserve">    dados = request.get_json(silent=True) or {}</w:t>
         <w:br/>
-        <w:t xml:space="preserve">    bancada = dados["bancada"]</w:t>
+        <w:t xml:space="preserve">    resposta, status = criar_reserva(dados)</w:t>
         <w:br/>
-        <w:t xml:space="preserve">    Reserva_model.post_reserva(cliente, bancada)</w:t>
-        <w:br/>
-        <w:t xml:space="preserve">    return True, 200</w:t>
+        <w:t xml:space="preserve">    return jsonify(resposta), status</w:t>
       </w:r>
     </w:p>
     <w:p>
@@ -3578,17 +3589,7 @@
           <w:i/>
           <w:sz w:val="18"/>
         </w:rPr>
-        <w:t>Trecho 4 - Exemplo do back-end simulado para criação de Reserva.</w:t>
-      </w:r>
-    </w:p>
-    <w:p>
-      <w:r>
-        <w:t>O exemplo demonstra o contrato básico de uma operação: receber dados, encaminhá-los para a camada responsável e devolver um resultado com código HTTP. Nesta primeira entrega, os models são simulados. Na implementação definitiva, controllers e services aplicarão autenticação, validações, regras de negócio e transações antes de acessar o banco de dados.</w:t>
-      </w:r>
-    </w:p>
-    <w:p>
-      <w:r>
-        <w:br w:type="page"/>
+        <w:t>Trecho 4 - Rota Flask executável para criação de Reserva.</w:t>
       </w:r>
     </w:p>
     <w:p>
@@ -4127,14 +4128,10 @@
     <w:p/>
     <w:p>
       <w:r>
-        <w:t xml:space="preserve">O </w:t>
-      </w:r>
-      <w:r>
-        <w:t>utilitário Fernet existente pode servir para dados que precisem ser recuperados, mas não para senha. Para senha, adotaremos hash unidirecional. Também planejamos logs sem informações sensíveis, mensagens genéricas para falhas de login e validação duplicada</w:t>
-      </w:r>
-      <w:r>
-        <w:t xml:space="preserve"> no cliente e no servidor.</w:t>
-      </w:r>
+        <w:t>Removemos o utilitário que apenas concatenava uma chave ao texto, pois ele não implementava criptografia. Nenhuma senha é armazenada pelo backend demonstrativo. No quarto bimestre, a autenticação real deverá usar hash unidirecional com salt, mensagens genéricas para falhas de login e logs sem informações sensíveis.</w:t>
+      </w:r>
+      <w:r/>
+      <w:r/>
     </w:p>
     <w:p>
       <w:r>
@@ -4168,16 +4165,23 @@
     </w:p>
     <w:p>
       <w:r>
-        <w:t>Ainda precisamos incorporar ao repositório os wireframes e o link/export</w:t>
-      </w:r>
-      <w:r>
-        <w:t>ação do protótipo Figma. O front-end atual funciona como protótipo navegável codificado e demonstra telas de Cliente, Cozinheiro e Administrador.</w:t>
+        <w:t xml:space="preserve">O </w:t>
+      </w:r>
+      <w:hyperlink r:id="rId14">
+        <w:r>
+          <w:rPr>
+            <w:color w:val="0563C1"/>
+            <w:u w:val="single"/>
+          </w:rPr>
+          <w:t>protótipo navegável do Sabor e Clic no Figma</w:t>
+        </w:r>
+      </w:hyperlink>
+      <w:r>
+        <w:t xml:space="preserve"> reúne os wireframes e as telas usadas como referência. O front-end atual demonstra as áreas de Cliente, Cozinheiro e Administrador.</w:t>
       </w:r>
     </w:p>
     <w:p>
-      <w:r>
-        <w:t>[INSERIR FIGURA - WIREFRAMES E PROTÓTIPO FIGMA]</w:t>
-      </w:r>
+      <w:r/>
     </w:p>
     <w:p>
       <w:r>
@@ -4383,7 +4387,7 @@
               <w:rPr>
                 <w:sz w:val="18"/>
               </w:rPr>
-              <w:t>Interface concluída; persistência planejada.</w:t>
+              <w:t>Interface concluída; API cria e consulta Reservas em memória.</w:t>
             </w:r>
           </w:p>
         </w:tc>
@@ -4448,7 +4452,7 @@
               <w:rPr>
                 <w:sz w:val="18"/>
               </w:rPr>
-              <w:t>Modelado e prototipado.</w:t>
+              <w:t>Interface e endpoints de criação, consulta e encerramento concluídos em memória.</w:t>
             </w:r>
           </w:p>
         </w:tc>
@@ -4569,7 +4573,7 @@
               <w:rPr>
                 <w:sz w:val="18"/>
               </w:rPr>
-              <w:t>Interface concluída; API planejada.</w:t>
+              <w:t>Interface e API em memória concluídas; integração Fetch planejada.</w:t>
             </w:r>
           </w:p>
         </w:tc>
@@ -4631,7 +4635,7 @@
               <w:rPr>
                 <w:sz w:val="18"/>
               </w:rPr>
-              <w:t>Layout concluído; atualização persistente planejada.</w:t>
+              <w:t>Layout e consulta JSON concluídos; transições persistentes planejadas.</w:t>
             </w:r>
           </w:p>
         </w:tc>
@@ -4872,7 +4876,7 @@
               <w:rPr>
                 <w:sz w:val="18"/>
               </w:rPr>
-              <w:t>Planejamento modular de pages, models, api, routes e services.</w:t>
+              <w:t>Separação real entre Routes, Controllers e Models, além dos módulos JavaScript por responsabilidade.</w:t>
             </w:r>
           </w:p>
         </w:tc>
@@ -4915,7 +4919,7 @@
               <w:rPr>
                 <w:sz w:val="18"/>
               </w:rPr>
-              <w:t>RBAC, validação no servidor, hash e consultas parametrizadas.</w:t>
+              <w:t>Perfis e validações de entrada demonstrados; autenticação, cookies e RBAC previstos.</w:t>
             </w:r>
           </w:p>
         </w:tc>
@@ -4956,7 +4960,7 @@
               <w:rPr>
                 <w:sz w:val="18"/>
               </w:rPr>
-              <w:t>Transações, PK/FK, unicidade e domínios de estado.</w:t>
+              <w:t>Validações em memória nesta etapa; PK, FK, unicidade e transações previstas no banco.</w:t>
             </w:r>
           </w:p>
         </w:tc>
@@ -4999,13 +5003,12 @@
               <w:rPr>
                 <w:sz w:val="18"/>
               </w:rPr>
-              <w:t>Filtros no</w:t>
-            </w:r>
-            <w:r>
-              <w:rPr>
-                <w:sz w:val="18"/>
-              </w:rPr>
-              <w:t xml:space="preserve"> servidor, índices futuros e atualização parcial do DOM.</w:t>
+              <w:t>Cálculos e consultas em memória; índices e filtros no servidor ficam para a persistência.</w:t>
+            </w:r>
+            <w:r>
+              <w:rPr>
+                <w:sz w:val="18"/>
+              </w:rPr>
             </w:r>
           </w:p>
         </w:tc>
@@ -5244,7 +5247,7 @@
               <w:rPr>
                 <w:sz w:val="18"/>
               </w:rPr>
-              <w:t>Formato e mecanismo definidos para integração; exemplo inicial no back-end.</w:t>
+              <w:t>JSON implementado na API Flask; Fetch permanece planejado para o quarto bimestre.</w:t>
             </w:r>
           </w:p>
         </w:tc>
@@ -5285,7 +5288,7 @@
               <w:rPr>
                 <w:sz w:val="18"/>
               </w:rPr>
-              <w:t>Base escolhida para API, regras e autenticação.</w:t>
+              <w:t>API executável, validações e dados demonstrativos em memória.</w:t>
             </w:r>
           </w:p>
         </w:tc>
@@ -5406,7 +5409,7 @@
     </w:p>
     <w:p>
       <w:r>
-        <w:t>Concluímos o protótipo navegável, a identidade visual, as telas dos três atores, o Cardápio, o carrinho em memória, a visualização de Pedidos, o layout do KDS, o DER, o MER, o arquivo EER e o dicionário de dados. Também modularizamos o JavaScript para evidenciar arrays, objetos, for...of, for...in, forEach, DOM, validações e cálculos em memória, e estruturamos um back-end Flask simulado com endpoints fundamentais.</w:t>
+        <w:t>Concluímos o protótipo navegável, a identidade visual, as telas dos três atores, o Cardápio, o carrinho em memória, a visualização de Pedidos, o layout do KDS, o DER, o MER e o dicionário de dados. Também modularizamos o JavaScript para evidenciar os conteúdos da etapa e implementamos uma API Flask executável com Blueprints, Controllers, Models em memória e respostas JSON.</w:t>
       </w:r>
     </w:p>
     <w:p>
@@ -5419,7 +5422,7 @@
     </w:p>
     <w:p>
       <w:r>
-        <w:t>Implementamos uma primeira estrutura Flask com configuração da aplicação e controllers simulados para cadastro/login, Bancadas/Reservas e Cardápio/Pedidos/KDS. Esses endpoints ainda não formam uma API persistente, mas já estabelecem contratos compatíveis com a evolução do sistema. A autenticação real, o banco físico e a comunicação Fetch/JSON permanecem para a próxima etapa.</w:t>
+        <w:t>Implementamos a factory Flask e endpoints reais para cadastro/login demonstrativos, Bancadas, Reservas, Sessões, Cardápio, Pedidos e KDS. O Pedido usa id_sessao; o servidor valida a Sessão ativa, recalcula valores e mantém o fluxo Reserva → Sessão → Pedido → KDS. Os dados são reiniciados com o servidor. Autenticação, banco físico e Fetch permanecem para a próxima etapa.</w:t>
       </w:r>
     </w:p>
     <w:p>
@@ -5432,7 +5435,7 @@
     </w:p>
     <w:p>
       <w:r>
-        <w:t>Nas próximas etapas, completaremos a factory Flask e a separação MVC, substituiremos os models simulados por persistência real, implementaremos autenticação e RBAC, criaremos a Sessão persistente, integraremos Cardápio, Pedido e KDS ao banco e conectaremos o front-end à API por Fetch/JSON. Depois serão acrescentados tratamento de loading/erros e testes para conflitos, permissões, totais e transições de estado.</w:t>
+        <w:t>Nas próximas etapas, substituiremos os Models em memória por persistência relacional, implementaremos autenticação e RBAC, conectaremos o front-end à API por Fetch/JSON e persistiremos as transições do KDS. Também serão acrescentados POO completa em JavaScript, tratamento de loading/erros, constraints, consultas, triggers e testes de integração.</w:t>
       </w:r>
     </w:p>
     <w:p>
@@ -5658,7 +5661,7 @@
             </w:pPr>
             <w:r>
               <w:rPr>
-                <w:sz w:val="18"/>
+                <w:sz w:val="16"/>
               </w:rPr>
               <w:t>Wireframes/Figma</w:t>
             </w:r>
@@ -5670,15 +5673,11 @@
             <w:vAlign w:val="center"/>
           </w:tcPr>
           <w:p>
-            <w:pPr>
-              <w:spacing w:after="0" w:line="240" w:lineRule="auto"/>
-              <w:ind w:firstLine="0"/>
-            </w:pPr>
-            <w:r>
-              <w:rPr>
-                <w:sz w:val="18"/>
-              </w:rPr>
-              <w:t>Em complementação</w:t>
+            <w:r>
+              <w:rPr>
+                <w:sz w:val="16"/>
+              </w:rPr>
+              <w:t>Concluído</w:t>
             </w:r>
           </w:p>
         </w:tc>
@@ -5688,15 +5687,11 @@
             <w:vAlign w:val="center"/>
           </w:tcPr>
           <w:p>
-            <w:pPr>
-              <w:spacing w:after="0" w:line="240" w:lineRule="auto"/>
-              <w:ind w:firstLine="0"/>
-            </w:pPr>
-            <w:r>
-              <w:rPr>
-                <w:sz w:val="18"/>
-              </w:rPr>
-              <w:t>Protótipo codificado existe; arquivo ou link Figma deverá ser incluído.</w:t>
+            <w:r>
+              <w:rPr>
+                <w:sz w:val="16"/>
+              </w:rPr>
+              <w:t>Link público do Figma e protótipo navegável registrados.</w:t>
             </w:r>
           </w:p>
         </w:tc>
@@ -5937,7 +5932,7 @@
               <w:rPr>
                 <w:sz w:val="18"/>
               </w:rPr>
-              <w:t>data.js, components.js, catalog.js, cart.js e demais módulos: arrays, objetos, for...of, for...in, forEach, DOM e cálculos.</w:t>
+              <w:t>validation.js e login.js validam no navegador; Controllers validam Reservas, Sessões e Pedidos no Flask.</w:t>
             </w:r>
           </w:p>
         </w:tc>
@@ -5977,7 +5972,7 @@
               <w:rPr>
                 <w:sz w:val="18"/>
               </w:rPr>
-              <w:t>Concluído em nível inicial</w:t>
+              <w:t>Concluído para a etapa</w:t>
             </w:r>
           </w:p>
         </w:tc>
@@ -5992,7 +5987,7 @@
               <w:rPr>
                 <w:sz w:val="18"/>
               </w:rPr>
-              <w:t>validation.js e login.js demonstram validação no navegador; validação de autoridade será repetida no Flask.</w:t>
+              <w:t>Factory Flask, Blueprints, Routes, Controllers, Models em memória, JSON e fluxo Reserva → Sessão → Pedido → KDS.</w:t>
             </w:r>
           </w:p>
         </w:tc>
@@ -6030,7 +6025,7 @@
               <w:rPr>
                 <w:sz w:val="18"/>
               </w:rPr>
-              <w:t>Concluído como estrutura simulada</w:t>
+              <w:t>Definido e demonstrado</w:t>
             </w:r>
           </w:p>
         </w:tc>
@@ -6044,7 +6039,7 @@
               <w:rPr>
                 <w:sz w:val="18"/>
               </w:rPr>
-              <w:t>Aplicação Flask inicial, controllers e endpoints simulados de autenticação, Reservas, Cardápio, Pedidos e KDS.</w:t>
+              <w:t>Perfis e separação visual existem; autenticação real, cookies e RBAC serão aplicados no quarto bimestre.</w:t>
             </w:r>
           </w:p>
         </w:tc>
@@ -6121,7 +6116,7 @@
     </w:p>
     <w:p>
       <w:r>
-        <w:t>Esta seção consolida a implementação atual sem alterar a arquitetura definida anteriormente. No terceiro bimestre, o front-end e o Flask utilizam dados simulados para demonstrar os fluxos; no quarto bimestre, esses mesmos contratos serão ligados à persistência e à comunicação real por JSON.</w:t>
+        <w:t>Esta seção consolida a implementação atual. No terceiro bimestre, o front-end utiliza dados simulados para demonstrar as telas, enquanto o Flask expõe uma API JSON executável com dados separados em memória. No quarto bimestre, Fetch conectará essas partes e o banco substituirá a memória como fonte dos dados.</w:t>
       </w:r>
     </w:p>
     <w:p>
@@ -6144,12 +6139,12 @@
         <w:keepNext/>
       </w:pPr>
       <w:r>
-        <w:t>22.2 Back-end simulado</w:t>
+        <w:t>22.2 Back-end Flask em memória</w:t>
       </w:r>
     </w:p>
     <w:p>
       <w:r>
-        <w:t>A estrutura Flask já demonstra cadastro/login, Bancadas/Reservas, Cardápio/Pedidos e KDS por meio de controllers e models simulados. A finalidade é validar endpoints e responsabilidades antes de conectar o banco e implementar autenticação e RBAC reais.</w:t>
+        <w:t>A factory Flask registra Blueprints para cadastro/login demonstrativos, Bancadas/Reservas, Sessões, Cardápio/Pedidos e KDS. As Routes recebem JSON, os Controllers validam os casos de uso e os Models mantêm dados simulados. Pedido referencia id_sessao, preservando a cadeia até a Reserva e a Bancada. Não há persistência ou autenticação real.</w:t>
       </w:r>
     </w:p>
     <w:p>
@@ -6163,7 +6158,7 @@
     </w:p>
     <w:p>
       <w:r>
-        <w:t>O fluxo permanece Reserva → Sessão → Cardápio/Carrinho → Pedido → KDS. Na integração definitiva, o JavaScript enviará identificadores e quantidades ao Flask; o servidor validará a Sessão, recalculará valores, persistirá os dados e devolverá JSON. O KDS passará a consumir esses Pedidos e atualizar seus estados pelo back-end.</w:t>
+        <w:t>O fluxo permanece Reserva → Sessão → Cardápio/Carrinho → Pedido → KDS. A API já recebe identificadores e quantidades, valida a Sessão, recalcula valores e devolve JSON quando chamada diretamente. Na integração do quarto bimestre, o JavaScript fará essas chamadas por Fetch, o banco persistirá os dados e o KDS enviará alterações de estado ao backend.</w:t>
       </w:r>
     </w:p>
     <w:p>

</xml_diff>